<commit_message>
feat: implement routing with react-router-dom, add landing and login pages, and update navigation
</commit_message>
<xml_diff>
--- a/docs/Technical specification/Technical_specifications.docx
+++ b/docs/Technical specification/Technical_specifications.docx
@@ -676,10 +676,7 @@
     </w:p>
     <w:p>
       <w:r>
-        <w:t xml:space="preserve">Le backend expose des opérations de gestion (création, lecture, mise à jour, </w:t>
-      </w:r>
-      <w:r>
-        <w:t>suppression)</w:t>
+        <w:t>Le backend expose des opérations de gestion (création, lecture, mise à jour, suppression)</w:t>
       </w:r>
       <w:r>
         <w:t xml:space="preserve"> sur</w:t>
@@ -1318,51 +1315,2869 @@
         <w:t>tiers(</w:t>
       </w:r>
       <w:proofErr w:type="spellStart"/>
+      <w:r>
+        <w:t>a</w:t>
+      </w:r>
+      <w:proofErr w:type="spellEnd"/>
       <w:proofErr w:type="gramEnd"/>
       <w:r>
-        <w:t>a</w:t>
+        <w:t xml:space="preserve"> décider).</w:t>
+      </w:r>
+    </w:p>
+    <w:p>
+      <w:r>
+        <w:t>Dans le cas de l’envoi directement via le backend, il existe un module dédié nommé « </w:t>
+      </w:r>
+      <w:proofErr w:type="spellStart"/>
+      <w:r>
+        <w:t>MailModules</w:t>
       </w:r>
       <w:proofErr w:type="spellEnd"/>
       <w:r>
-        <w:t xml:space="preserve"> décider).</w:t>
-      </w:r>
-    </w:p>
-    <w:p>
-      <w:r>
-        <w:t>Dans le cas de l’envoi directement via le backend, il existe un module dédié nommé « </w:t>
+        <w:t xml:space="preserve"> » disponible au sein de </w:t>
       </w:r>
       <w:proofErr w:type="spellStart"/>
       <w:r>
-        <w:t>MailModules</w:t>
+        <w:t>NestJs</w:t>
       </w:r>
       <w:proofErr w:type="spellEnd"/>
       <w:r>
-        <w:t xml:space="preserve"> » disponible au sein de </w:t>
+        <w:t>.</w:t>
+      </w:r>
+    </w:p>
+    <w:p>
+      <w:r>
+        <w:t>La seconde solution sera un envoi via un service externe comme « Amazon » SES ou bien « </w:t>
       </w:r>
       <w:proofErr w:type="spellStart"/>
       <w:r>
-        <w:t>NestJs</w:t>
+        <w:t>Sensgrid</w:t>
       </w:r>
       <w:proofErr w:type="spellEnd"/>
       <w:r>
+        <w:t> ».Elle sera appelé par le backend.</w:t>
+      </w:r>
+    </w:p>
+    <w:p/>
+    <w:p>
+      <w:pPr>
+        <w:rPr>
+          <w:color w:val="404040" w:themeColor="text1" w:themeTint="BF"/>
+        </w:rPr>
+      </w:pPr>
+    </w:p>
+    <w:p>
+      <w:pPr>
+        <w:pStyle w:val="Titre1"/>
+        <w:numPr>
+          <w:ilvl w:val="0"/>
+          <w:numId w:val="1"/>
+        </w:numPr>
+      </w:pPr>
+      <w:r>
+        <w:t>Spécification des routes de navigation de l’application</w:t>
+      </w:r>
+    </w:p>
+    <w:p/>
+    <w:p>
+      <w:r>
+        <w:t xml:space="preserve">Cette section décrit les routes </w:t>
+      </w:r>
+      <w:proofErr w:type="spellStart"/>
+      <w:r>
+        <w:t>front-end</w:t>
+      </w:r>
+      <w:proofErr w:type="spellEnd"/>
+      <w:r>
+        <w:t xml:space="preserve"> de l’application, leur rôle fonctionnel ainsi que leurs conditions d’accès.</w:t>
+      </w:r>
+      <w:r>
+        <w:br/>
+        <w:t>Les routes sont réparties en deux catégories :</w:t>
+      </w:r>
+    </w:p>
+    <w:p>
+      <w:pPr>
+        <w:numPr>
+          <w:ilvl w:val="0"/>
+          <w:numId w:val="28"/>
+        </w:numPr>
+      </w:pPr>
+      <w:proofErr w:type="gramStart"/>
+      <w:r>
+        <w:rPr>
+          <w:b/>
+          <w:bCs/>
+        </w:rPr>
+        <w:t>routes</w:t>
+      </w:r>
+      <w:proofErr w:type="gramEnd"/>
+      <w:r>
+        <w:rPr>
+          <w:b/>
+          <w:bCs/>
+        </w:rPr>
+        <w:t xml:space="preserve"> publiques</w:t>
+      </w:r>
+      <w:r>
+        <w:t>, accessibles sans authentification ;</w:t>
+      </w:r>
+    </w:p>
+    <w:p>
+      <w:pPr>
+        <w:numPr>
+          <w:ilvl w:val="0"/>
+          <w:numId w:val="28"/>
+        </w:numPr>
+      </w:pPr>
+      <w:proofErr w:type="gramStart"/>
+      <w:r>
+        <w:rPr>
+          <w:b/>
+          <w:bCs/>
+        </w:rPr>
+        <w:t>routes</w:t>
+      </w:r>
+      <w:proofErr w:type="gramEnd"/>
+      <w:r>
+        <w:rPr>
+          <w:b/>
+          <w:bCs/>
+        </w:rPr>
+        <w:t xml:space="preserve"> authentifiées</w:t>
+      </w:r>
+      <w:r>
+        <w:t>, accessibles uniquement aux utilisateurs connectés.</w:t>
+      </w:r>
+    </w:p>
+    <w:p>
+      <w:r>
+        <w:t>Certaines routes utilisent des paramètres dynamiques, par exemple :id, afin d’identifier une ressource spécifique.</w:t>
+      </w:r>
+      <w:r>
+        <w:br/>
+        <w:t xml:space="preserve">Le système de routage doit également garantir la protection des pages privées via un mécanisme de contrôle d’accès côté </w:t>
+      </w:r>
+      <w:proofErr w:type="spellStart"/>
+      <w:r>
+        <w:t>front-end</w:t>
+      </w:r>
+      <w:proofErr w:type="spellEnd"/>
+      <w:r>
         <w:t>.</w:t>
       </w:r>
     </w:p>
-    <w:p>
-      <w:r>
-        <w:t>La seconde solution sera un envoi via un service externe comme « Amazon » SES ou bien « </w:t>
-      </w:r>
-      <w:proofErr w:type="spellStart"/>
-      <w:r>
-        <w:t>Sensgrid</w:t>
-      </w:r>
-      <w:proofErr w:type="spellEnd"/>
-      <w:r>
-        <w:t> ».Elle sera appelé par le backend.</w:t>
-      </w:r>
-    </w:p>
     <w:p/>
     <w:p>
+      <w:pPr>
+        <w:rPr>
+          <w:color w:val="404040" w:themeColor="text1" w:themeTint="BF"/>
+          <w:lang w:val="en-GB"/>
+        </w:rPr>
+      </w:pPr>
+      <w:r>
+        <w:rPr>
+          <w:color w:val="404040" w:themeColor="text1" w:themeTint="BF"/>
+          <w:lang w:val="en-GB"/>
+        </w:rPr>
+        <w:br/>
+      </w:r>
+    </w:p>
+    <w:tbl>
+      <w:tblPr>
+        <w:tblW w:w="0" w:type="auto"/>
+        <w:tblCellSpacing w:w="15" w:type="dxa"/>
+        <w:tblCellMar>
+          <w:top w:w="15" w:type="dxa"/>
+          <w:left w:w="15" w:type="dxa"/>
+          <w:bottom w:w="15" w:type="dxa"/>
+          <w:right w:w="15" w:type="dxa"/>
+        </w:tblCellMar>
+        <w:tblLook w:val="04A0" w:firstRow="1" w:lastRow="0" w:firstColumn="1" w:lastColumn="0" w:noHBand="0" w:noVBand="1"/>
+      </w:tblPr>
+      <w:tblGrid>
+        <w:gridCol w:w="1321"/>
+        <w:gridCol w:w="2403"/>
+        <w:gridCol w:w="2666"/>
+        <w:gridCol w:w="1435"/>
+        <w:gridCol w:w="1237"/>
+      </w:tblGrid>
+      <w:tr>
+        <w:trPr>
+          <w:tblHeader/>
+          <w:tblCellSpacing w:w="15" w:type="dxa"/>
+        </w:trPr>
+        <w:tc>
+          <w:tcPr>
+            <w:tcW w:w="0" w:type="auto"/>
+            <w:tcBorders>
+              <w:top w:val="single" w:sz="4" w:space="0" w:color="auto"/>
+              <w:left w:val="single" w:sz="4" w:space="0" w:color="auto"/>
+              <w:bottom w:val="single" w:sz="4" w:space="0" w:color="auto"/>
+              <w:right w:val="single" w:sz="4" w:space="0" w:color="auto"/>
+            </w:tcBorders>
+            <w:vAlign w:val="center"/>
+            <w:hideMark/>
+          </w:tcPr>
+          <w:p>
+            <w:pPr>
+              <w:jc w:val="center"/>
+              <w:rPr>
+                <w:b/>
+                <w:bCs/>
+                <w:color w:val="404040" w:themeColor="text1" w:themeTint="BF"/>
+              </w:rPr>
+            </w:pPr>
+            <w:r>
+              <w:rPr>
+                <w:b/>
+                <w:bCs/>
+                <w:color w:val="404040" w:themeColor="text1" w:themeTint="BF"/>
+              </w:rPr>
+              <w:t>Type d’accès</w:t>
+            </w:r>
+          </w:p>
+        </w:tc>
+        <w:tc>
+          <w:tcPr>
+            <w:tcW w:w="0" w:type="auto"/>
+            <w:tcBorders>
+              <w:top w:val="single" w:sz="4" w:space="0" w:color="auto"/>
+              <w:left w:val="single" w:sz="4" w:space="0" w:color="auto"/>
+              <w:bottom w:val="single" w:sz="4" w:space="0" w:color="auto"/>
+              <w:right w:val="single" w:sz="4" w:space="0" w:color="auto"/>
+            </w:tcBorders>
+            <w:vAlign w:val="center"/>
+            <w:hideMark/>
+          </w:tcPr>
+          <w:p>
+            <w:pPr>
+              <w:jc w:val="center"/>
+              <w:rPr>
+                <w:b/>
+                <w:bCs/>
+                <w:color w:val="404040" w:themeColor="text1" w:themeTint="BF"/>
+              </w:rPr>
+            </w:pPr>
+            <w:r>
+              <w:rPr>
+                <w:b/>
+                <w:bCs/>
+                <w:color w:val="404040" w:themeColor="text1" w:themeTint="BF"/>
+              </w:rPr>
+              <w:t>Route</w:t>
+            </w:r>
+          </w:p>
+        </w:tc>
+        <w:tc>
+          <w:tcPr>
+            <w:tcW w:w="0" w:type="auto"/>
+            <w:tcBorders>
+              <w:top w:val="single" w:sz="4" w:space="0" w:color="auto"/>
+              <w:left w:val="single" w:sz="4" w:space="0" w:color="auto"/>
+              <w:bottom w:val="single" w:sz="4" w:space="0" w:color="auto"/>
+              <w:right w:val="single" w:sz="4" w:space="0" w:color="auto"/>
+            </w:tcBorders>
+            <w:vAlign w:val="center"/>
+            <w:hideMark/>
+          </w:tcPr>
+          <w:p>
+            <w:pPr>
+              <w:jc w:val="center"/>
+              <w:rPr>
+                <w:b/>
+                <w:bCs/>
+                <w:color w:val="404040" w:themeColor="text1" w:themeTint="BF"/>
+              </w:rPr>
+            </w:pPr>
+            <w:r>
+              <w:rPr>
+                <w:b/>
+                <w:bCs/>
+                <w:color w:val="404040" w:themeColor="text1" w:themeTint="BF"/>
+              </w:rPr>
+              <w:t>Description</w:t>
+            </w:r>
+          </w:p>
+        </w:tc>
+        <w:tc>
+          <w:tcPr>
+            <w:tcW w:w="0" w:type="auto"/>
+            <w:tcBorders>
+              <w:top w:val="single" w:sz="4" w:space="0" w:color="auto"/>
+              <w:left w:val="single" w:sz="4" w:space="0" w:color="auto"/>
+              <w:bottom w:val="single" w:sz="4" w:space="0" w:color="auto"/>
+              <w:right w:val="single" w:sz="4" w:space="0" w:color="auto"/>
+            </w:tcBorders>
+            <w:vAlign w:val="center"/>
+            <w:hideMark/>
+          </w:tcPr>
+          <w:p>
+            <w:pPr>
+              <w:jc w:val="center"/>
+              <w:rPr>
+                <w:b/>
+                <w:bCs/>
+                <w:color w:val="404040" w:themeColor="text1" w:themeTint="BF"/>
+              </w:rPr>
+            </w:pPr>
+            <w:r>
+              <w:rPr>
+                <w:b/>
+                <w:bCs/>
+                <w:color w:val="404040" w:themeColor="text1" w:themeTint="BF"/>
+              </w:rPr>
+              <w:t>Paramètres</w:t>
+            </w:r>
+          </w:p>
+        </w:tc>
+        <w:tc>
+          <w:tcPr>
+            <w:tcW w:w="0" w:type="auto"/>
+            <w:tcBorders>
+              <w:top w:val="single" w:sz="4" w:space="0" w:color="auto"/>
+              <w:left w:val="single" w:sz="4" w:space="0" w:color="auto"/>
+              <w:bottom w:val="single" w:sz="4" w:space="0" w:color="auto"/>
+              <w:right w:val="single" w:sz="4" w:space="0" w:color="auto"/>
+            </w:tcBorders>
+            <w:vAlign w:val="center"/>
+            <w:hideMark/>
+          </w:tcPr>
+          <w:p>
+            <w:pPr>
+              <w:jc w:val="center"/>
+              <w:rPr>
+                <w:b/>
+                <w:bCs/>
+                <w:color w:val="404040" w:themeColor="text1" w:themeTint="BF"/>
+              </w:rPr>
+            </w:pPr>
+            <w:r>
+              <w:rPr>
+                <w:b/>
+                <w:bCs/>
+                <w:color w:val="404040" w:themeColor="text1" w:themeTint="BF"/>
+              </w:rPr>
+              <w:t>Protection</w:t>
+            </w:r>
+          </w:p>
+        </w:tc>
+      </w:tr>
+      <w:tr>
+        <w:trPr>
+          <w:tblCellSpacing w:w="15" w:type="dxa"/>
+        </w:trPr>
+        <w:tc>
+          <w:tcPr>
+            <w:tcW w:w="0" w:type="auto"/>
+            <w:tcBorders>
+              <w:top w:val="single" w:sz="4" w:space="0" w:color="auto"/>
+              <w:left w:val="single" w:sz="4" w:space="0" w:color="auto"/>
+              <w:bottom w:val="single" w:sz="4" w:space="0" w:color="auto"/>
+              <w:right w:val="single" w:sz="4" w:space="0" w:color="auto"/>
+            </w:tcBorders>
+            <w:vAlign w:val="center"/>
+            <w:hideMark/>
+          </w:tcPr>
+          <w:p>
+            <w:pPr>
+              <w:jc w:val="center"/>
+              <w:rPr>
+                <w:color w:val="404040" w:themeColor="text1" w:themeTint="BF"/>
+              </w:rPr>
+            </w:pPr>
+            <w:r>
+              <w:rPr>
+                <w:color w:val="404040" w:themeColor="text1" w:themeTint="BF"/>
+              </w:rPr>
+              <w:t>Public</w:t>
+            </w:r>
+          </w:p>
+        </w:tc>
+        <w:tc>
+          <w:tcPr>
+            <w:tcW w:w="0" w:type="auto"/>
+            <w:tcBorders>
+              <w:top w:val="single" w:sz="4" w:space="0" w:color="auto"/>
+              <w:left w:val="single" w:sz="4" w:space="0" w:color="auto"/>
+              <w:bottom w:val="single" w:sz="4" w:space="0" w:color="auto"/>
+              <w:right w:val="single" w:sz="4" w:space="0" w:color="auto"/>
+            </w:tcBorders>
+            <w:vAlign w:val="center"/>
+            <w:hideMark/>
+          </w:tcPr>
+          <w:p>
+            <w:pPr>
+              <w:jc w:val="center"/>
+              <w:rPr>
+                <w:color w:val="404040" w:themeColor="text1" w:themeTint="BF"/>
+              </w:rPr>
+            </w:pPr>
+            <w:r>
+              <w:rPr>
+                <w:color w:val="404040" w:themeColor="text1" w:themeTint="BF"/>
+              </w:rPr>
+              <w:t>/</w:t>
+            </w:r>
+          </w:p>
+        </w:tc>
+        <w:tc>
+          <w:tcPr>
+            <w:tcW w:w="0" w:type="auto"/>
+            <w:tcBorders>
+              <w:top w:val="single" w:sz="4" w:space="0" w:color="auto"/>
+              <w:left w:val="single" w:sz="4" w:space="0" w:color="auto"/>
+              <w:bottom w:val="single" w:sz="4" w:space="0" w:color="auto"/>
+              <w:right w:val="single" w:sz="4" w:space="0" w:color="auto"/>
+            </w:tcBorders>
+            <w:vAlign w:val="center"/>
+            <w:hideMark/>
+          </w:tcPr>
+          <w:p>
+            <w:pPr>
+              <w:jc w:val="center"/>
+              <w:rPr>
+                <w:color w:val="404040" w:themeColor="text1" w:themeTint="BF"/>
+              </w:rPr>
+            </w:pPr>
+            <w:r>
+              <w:rPr>
+                <w:color w:val="404040" w:themeColor="text1" w:themeTint="BF"/>
+              </w:rPr>
+              <w:t>Landing page / page d’accueil</w:t>
+            </w:r>
+          </w:p>
+        </w:tc>
+        <w:tc>
+          <w:tcPr>
+            <w:tcW w:w="0" w:type="auto"/>
+            <w:tcBorders>
+              <w:top w:val="single" w:sz="4" w:space="0" w:color="auto"/>
+              <w:left w:val="single" w:sz="4" w:space="0" w:color="auto"/>
+              <w:bottom w:val="single" w:sz="4" w:space="0" w:color="auto"/>
+              <w:right w:val="single" w:sz="4" w:space="0" w:color="auto"/>
+            </w:tcBorders>
+            <w:vAlign w:val="center"/>
+            <w:hideMark/>
+          </w:tcPr>
+          <w:p>
+            <w:pPr>
+              <w:jc w:val="center"/>
+              <w:rPr>
+                <w:color w:val="404040" w:themeColor="text1" w:themeTint="BF"/>
+              </w:rPr>
+            </w:pPr>
+            <w:r>
+              <w:rPr>
+                <w:color w:val="404040" w:themeColor="text1" w:themeTint="BF"/>
+              </w:rPr>
+              <w:t>Aucun</w:t>
+            </w:r>
+          </w:p>
+        </w:tc>
+        <w:tc>
+          <w:tcPr>
+            <w:tcW w:w="0" w:type="auto"/>
+            <w:tcBorders>
+              <w:top w:val="single" w:sz="4" w:space="0" w:color="auto"/>
+              <w:left w:val="single" w:sz="4" w:space="0" w:color="auto"/>
+              <w:bottom w:val="single" w:sz="4" w:space="0" w:color="auto"/>
+              <w:right w:val="single" w:sz="4" w:space="0" w:color="auto"/>
+            </w:tcBorders>
+            <w:vAlign w:val="center"/>
+            <w:hideMark/>
+          </w:tcPr>
+          <w:p>
+            <w:pPr>
+              <w:jc w:val="center"/>
+              <w:rPr>
+                <w:color w:val="404040" w:themeColor="text1" w:themeTint="BF"/>
+              </w:rPr>
+            </w:pPr>
+            <w:r>
+              <w:rPr>
+                <w:color w:val="404040" w:themeColor="text1" w:themeTint="BF"/>
+              </w:rPr>
+              <w:t>Non</w:t>
+            </w:r>
+          </w:p>
+        </w:tc>
+      </w:tr>
+      <w:tr>
+        <w:trPr>
+          <w:tblCellSpacing w:w="15" w:type="dxa"/>
+        </w:trPr>
+        <w:tc>
+          <w:tcPr>
+            <w:tcW w:w="0" w:type="auto"/>
+            <w:tcBorders>
+              <w:top w:val="single" w:sz="4" w:space="0" w:color="auto"/>
+              <w:left w:val="single" w:sz="4" w:space="0" w:color="auto"/>
+              <w:bottom w:val="single" w:sz="4" w:space="0" w:color="auto"/>
+              <w:right w:val="single" w:sz="4" w:space="0" w:color="auto"/>
+            </w:tcBorders>
+            <w:vAlign w:val="center"/>
+            <w:hideMark/>
+          </w:tcPr>
+          <w:p>
+            <w:pPr>
+              <w:jc w:val="center"/>
+              <w:rPr>
+                <w:color w:val="404040" w:themeColor="text1" w:themeTint="BF"/>
+              </w:rPr>
+            </w:pPr>
+            <w:r>
+              <w:rPr>
+                <w:color w:val="404040" w:themeColor="text1" w:themeTint="BF"/>
+              </w:rPr>
+              <w:t>Public</w:t>
+            </w:r>
+          </w:p>
+        </w:tc>
+        <w:tc>
+          <w:tcPr>
+            <w:tcW w:w="0" w:type="auto"/>
+            <w:tcBorders>
+              <w:top w:val="single" w:sz="4" w:space="0" w:color="auto"/>
+              <w:left w:val="single" w:sz="4" w:space="0" w:color="auto"/>
+              <w:bottom w:val="single" w:sz="4" w:space="0" w:color="auto"/>
+              <w:right w:val="single" w:sz="4" w:space="0" w:color="auto"/>
+            </w:tcBorders>
+            <w:vAlign w:val="center"/>
+            <w:hideMark/>
+          </w:tcPr>
+          <w:p>
+            <w:pPr>
+              <w:jc w:val="center"/>
+              <w:rPr>
+                <w:color w:val="404040" w:themeColor="text1" w:themeTint="BF"/>
+              </w:rPr>
+            </w:pPr>
+            <w:r>
+              <w:rPr>
+                <w:color w:val="404040" w:themeColor="text1" w:themeTint="BF"/>
+              </w:rPr>
+              <w:t>/login</w:t>
+            </w:r>
+          </w:p>
+        </w:tc>
+        <w:tc>
+          <w:tcPr>
+            <w:tcW w:w="0" w:type="auto"/>
+            <w:tcBorders>
+              <w:top w:val="single" w:sz="4" w:space="0" w:color="auto"/>
+              <w:left w:val="single" w:sz="4" w:space="0" w:color="auto"/>
+              <w:bottom w:val="single" w:sz="4" w:space="0" w:color="auto"/>
+              <w:right w:val="single" w:sz="4" w:space="0" w:color="auto"/>
+            </w:tcBorders>
+            <w:vAlign w:val="center"/>
+            <w:hideMark/>
+          </w:tcPr>
+          <w:p>
+            <w:pPr>
+              <w:jc w:val="center"/>
+              <w:rPr>
+                <w:color w:val="404040" w:themeColor="text1" w:themeTint="BF"/>
+              </w:rPr>
+            </w:pPr>
+            <w:r>
+              <w:rPr>
+                <w:color w:val="404040" w:themeColor="text1" w:themeTint="BF"/>
+              </w:rPr>
+              <w:t>Connexion utilisateur</w:t>
+            </w:r>
+          </w:p>
+        </w:tc>
+        <w:tc>
+          <w:tcPr>
+            <w:tcW w:w="0" w:type="auto"/>
+            <w:tcBorders>
+              <w:top w:val="single" w:sz="4" w:space="0" w:color="auto"/>
+              <w:left w:val="single" w:sz="4" w:space="0" w:color="auto"/>
+              <w:bottom w:val="single" w:sz="4" w:space="0" w:color="auto"/>
+              <w:right w:val="single" w:sz="4" w:space="0" w:color="auto"/>
+            </w:tcBorders>
+            <w:vAlign w:val="center"/>
+            <w:hideMark/>
+          </w:tcPr>
+          <w:p>
+            <w:pPr>
+              <w:jc w:val="center"/>
+              <w:rPr>
+                <w:color w:val="404040" w:themeColor="text1" w:themeTint="BF"/>
+              </w:rPr>
+            </w:pPr>
+            <w:r>
+              <w:rPr>
+                <w:color w:val="404040" w:themeColor="text1" w:themeTint="BF"/>
+              </w:rPr>
+              <w:t>Aucun</w:t>
+            </w:r>
+          </w:p>
+        </w:tc>
+        <w:tc>
+          <w:tcPr>
+            <w:tcW w:w="0" w:type="auto"/>
+            <w:tcBorders>
+              <w:top w:val="single" w:sz="4" w:space="0" w:color="auto"/>
+              <w:left w:val="single" w:sz="4" w:space="0" w:color="auto"/>
+              <w:bottom w:val="single" w:sz="4" w:space="0" w:color="auto"/>
+              <w:right w:val="single" w:sz="4" w:space="0" w:color="auto"/>
+            </w:tcBorders>
+            <w:vAlign w:val="center"/>
+            <w:hideMark/>
+          </w:tcPr>
+          <w:p>
+            <w:pPr>
+              <w:jc w:val="center"/>
+              <w:rPr>
+                <w:color w:val="404040" w:themeColor="text1" w:themeTint="BF"/>
+              </w:rPr>
+            </w:pPr>
+            <w:r>
+              <w:rPr>
+                <w:color w:val="404040" w:themeColor="text1" w:themeTint="BF"/>
+              </w:rPr>
+              <w:t>Non</w:t>
+            </w:r>
+          </w:p>
+        </w:tc>
+      </w:tr>
+      <w:tr>
+        <w:trPr>
+          <w:tblCellSpacing w:w="15" w:type="dxa"/>
+        </w:trPr>
+        <w:tc>
+          <w:tcPr>
+            <w:tcW w:w="0" w:type="auto"/>
+            <w:tcBorders>
+              <w:top w:val="single" w:sz="4" w:space="0" w:color="auto"/>
+              <w:left w:val="single" w:sz="4" w:space="0" w:color="auto"/>
+              <w:bottom w:val="single" w:sz="4" w:space="0" w:color="auto"/>
+              <w:right w:val="single" w:sz="4" w:space="0" w:color="auto"/>
+            </w:tcBorders>
+            <w:vAlign w:val="center"/>
+            <w:hideMark/>
+          </w:tcPr>
+          <w:p>
+            <w:pPr>
+              <w:jc w:val="center"/>
+              <w:rPr>
+                <w:color w:val="404040" w:themeColor="text1" w:themeTint="BF"/>
+              </w:rPr>
+            </w:pPr>
+            <w:r>
+              <w:rPr>
+                <w:color w:val="404040" w:themeColor="text1" w:themeTint="BF"/>
+              </w:rPr>
+              <w:t>Public</w:t>
+            </w:r>
+          </w:p>
+        </w:tc>
+        <w:tc>
+          <w:tcPr>
+            <w:tcW w:w="0" w:type="auto"/>
+            <w:tcBorders>
+              <w:top w:val="single" w:sz="4" w:space="0" w:color="auto"/>
+              <w:left w:val="single" w:sz="4" w:space="0" w:color="auto"/>
+              <w:bottom w:val="single" w:sz="4" w:space="0" w:color="auto"/>
+              <w:right w:val="single" w:sz="4" w:space="0" w:color="auto"/>
+            </w:tcBorders>
+            <w:vAlign w:val="center"/>
+            <w:hideMark/>
+          </w:tcPr>
+          <w:p>
+            <w:pPr>
+              <w:jc w:val="center"/>
+              <w:rPr>
+                <w:color w:val="404040" w:themeColor="text1" w:themeTint="BF"/>
+              </w:rPr>
+            </w:pPr>
+            <w:r>
+              <w:rPr>
+                <w:color w:val="404040" w:themeColor="text1" w:themeTint="BF"/>
+              </w:rPr>
+              <w:t>/</w:t>
+            </w:r>
+            <w:proofErr w:type="spellStart"/>
+            <w:r>
+              <w:rPr>
+                <w:color w:val="404040" w:themeColor="text1" w:themeTint="BF"/>
+              </w:rPr>
+              <w:t>register</w:t>
+            </w:r>
+            <w:proofErr w:type="spellEnd"/>
+          </w:p>
+        </w:tc>
+        <w:tc>
+          <w:tcPr>
+            <w:tcW w:w="0" w:type="auto"/>
+            <w:tcBorders>
+              <w:top w:val="single" w:sz="4" w:space="0" w:color="auto"/>
+              <w:left w:val="single" w:sz="4" w:space="0" w:color="auto"/>
+              <w:bottom w:val="single" w:sz="4" w:space="0" w:color="auto"/>
+              <w:right w:val="single" w:sz="4" w:space="0" w:color="auto"/>
+            </w:tcBorders>
+            <w:vAlign w:val="center"/>
+            <w:hideMark/>
+          </w:tcPr>
+          <w:p>
+            <w:pPr>
+              <w:jc w:val="center"/>
+              <w:rPr>
+                <w:color w:val="404040" w:themeColor="text1" w:themeTint="BF"/>
+              </w:rPr>
+            </w:pPr>
+            <w:r>
+              <w:rPr>
+                <w:color w:val="404040" w:themeColor="text1" w:themeTint="BF"/>
+              </w:rPr>
+              <w:t>Inscription utilisateur</w:t>
+            </w:r>
+          </w:p>
+        </w:tc>
+        <w:tc>
+          <w:tcPr>
+            <w:tcW w:w="0" w:type="auto"/>
+            <w:tcBorders>
+              <w:top w:val="single" w:sz="4" w:space="0" w:color="auto"/>
+              <w:left w:val="single" w:sz="4" w:space="0" w:color="auto"/>
+              <w:bottom w:val="single" w:sz="4" w:space="0" w:color="auto"/>
+              <w:right w:val="single" w:sz="4" w:space="0" w:color="auto"/>
+            </w:tcBorders>
+            <w:vAlign w:val="center"/>
+            <w:hideMark/>
+          </w:tcPr>
+          <w:p>
+            <w:pPr>
+              <w:jc w:val="center"/>
+              <w:rPr>
+                <w:color w:val="404040" w:themeColor="text1" w:themeTint="BF"/>
+              </w:rPr>
+            </w:pPr>
+            <w:r>
+              <w:rPr>
+                <w:color w:val="404040" w:themeColor="text1" w:themeTint="BF"/>
+              </w:rPr>
+              <w:t>Aucun</w:t>
+            </w:r>
+          </w:p>
+        </w:tc>
+        <w:tc>
+          <w:tcPr>
+            <w:tcW w:w="0" w:type="auto"/>
+            <w:tcBorders>
+              <w:top w:val="single" w:sz="4" w:space="0" w:color="auto"/>
+              <w:left w:val="single" w:sz="4" w:space="0" w:color="auto"/>
+              <w:bottom w:val="single" w:sz="4" w:space="0" w:color="auto"/>
+              <w:right w:val="single" w:sz="4" w:space="0" w:color="auto"/>
+            </w:tcBorders>
+            <w:vAlign w:val="center"/>
+            <w:hideMark/>
+          </w:tcPr>
+          <w:p>
+            <w:pPr>
+              <w:jc w:val="center"/>
+              <w:rPr>
+                <w:color w:val="404040" w:themeColor="text1" w:themeTint="BF"/>
+              </w:rPr>
+            </w:pPr>
+            <w:r>
+              <w:rPr>
+                <w:color w:val="404040" w:themeColor="text1" w:themeTint="BF"/>
+              </w:rPr>
+              <w:t>Non</w:t>
+            </w:r>
+          </w:p>
+        </w:tc>
+      </w:tr>
+      <w:tr>
+        <w:trPr>
+          <w:tblCellSpacing w:w="15" w:type="dxa"/>
+        </w:trPr>
+        <w:tc>
+          <w:tcPr>
+            <w:tcW w:w="0" w:type="auto"/>
+            <w:tcBorders>
+              <w:top w:val="single" w:sz="4" w:space="0" w:color="auto"/>
+              <w:left w:val="single" w:sz="4" w:space="0" w:color="auto"/>
+              <w:bottom w:val="single" w:sz="4" w:space="0" w:color="auto"/>
+              <w:right w:val="single" w:sz="4" w:space="0" w:color="auto"/>
+            </w:tcBorders>
+            <w:vAlign w:val="center"/>
+            <w:hideMark/>
+          </w:tcPr>
+          <w:p>
+            <w:pPr>
+              <w:jc w:val="center"/>
+              <w:rPr>
+                <w:color w:val="404040" w:themeColor="text1" w:themeTint="BF"/>
+              </w:rPr>
+            </w:pPr>
+            <w:r>
+              <w:rPr>
+                <w:color w:val="404040" w:themeColor="text1" w:themeTint="BF"/>
+              </w:rPr>
+              <w:t>Public</w:t>
+            </w:r>
+          </w:p>
+        </w:tc>
+        <w:tc>
+          <w:tcPr>
+            <w:tcW w:w="0" w:type="auto"/>
+            <w:tcBorders>
+              <w:top w:val="single" w:sz="4" w:space="0" w:color="auto"/>
+              <w:left w:val="single" w:sz="4" w:space="0" w:color="auto"/>
+              <w:bottom w:val="single" w:sz="4" w:space="0" w:color="auto"/>
+              <w:right w:val="single" w:sz="4" w:space="0" w:color="auto"/>
+            </w:tcBorders>
+            <w:vAlign w:val="center"/>
+            <w:hideMark/>
+          </w:tcPr>
+          <w:p>
+            <w:pPr>
+              <w:jc w:val="center"/>
+              <w:rPr>
+                <w:color w:val="404040" w:themeColor="text1" w:themeTint="BF"/>
+              </w:rPr>
+            </w:pPr>
+            <w:r>
+              <w:rPr>
+                <w:color w:val="404040" w:themeColor="text1" w:themeTint="BF"/>
+              </w:rPr>
+              <w:t>/</w:t>
+            </w:r>
+            <w:proofErr w:type="spellStart"/>
+            <w:r>
+              <w:rPr>
+                <w:color w:val="404040" w:themeColor="text1" w:themeTint="BF"/>
+              </w:rPr>
+              <w:t>forgot-password</w:t>
+            </w:r>
+            <w:proofErr w:type="spellEnd"/>
+          </w:p>
+        </w:tc>
+        <w:tc>
+          <w:tcPr>
+            <w:tcW w:w="0" w:type="auto"/>
+            <w:tcBorders>
+              <w:top w:val="single" w:sz="4" w:space="0" w:color="auto"/>
+              <w:left w:val="single" w:sz="4" w:space="0" w:color="auto"/>
+              <w:bottom w:val="single" w:sz="4" w:space="0" w:color="auto"/>
+              <w:right w:val="single" w:sz="4" w:space="0" w:color="auto"/>
+            </w:tcBorders>
+            <w:vAlign w:val="center"/>
+            <w:hideMark/>
+          </w:tcPr>
+          <w:p>
+            <w:pPr>
+              <w:jc w:val="center"/>
+              <w:rPr>
+                <w:color w:val="404040" w:themeColor="text1" w:themeTint="BF"/>
+              </w:rPr>
+            </w:pPr>
+            <w:r>
+              <w:rPr>
+                <w:color w:val="404040" w:themeColor="text1" w:themeTint="BF"/>
+              </w:rPr>
+              <w:t>Demande de réinitialisation du mot de passe</w:t>
+            </w:r>
+          </w:p>
+        </w:tc>
+        <w:tc>
+          <w:tcPr>
+            <w:tcW w:w="0" w:type="auto"/>
+            <w:tcBorders>
+              <w:top w:val="single" w:sz="4" w:space="0" w:color="auto"/>
+              <w:left w:val="single" w:sz="4" w:space="0" w:color="auto"/>
+              <w:bottom w:val="single" w:sz="4" w:space="0" w:color="auto"/>
+              <w:right w:val="single" w:sz="4" w:space="0" w:color="auto"/>
+            </w:tcBorders>
+            <w:vAlign w:val="center"/>
+            <w:hideMark/>
+          </w:tcPr>
+          <w:p>
+            <w:pPr>
+              <w:jc w:val="center"/>
+              <w:rPr>
+                <w:color w:val="404040" w:themeColor="text1" w:themeTint="BF"/>
+              </w:rPr>
+            </w:pPr>
+            <w:r>
+              <w:rPr>
+                <w:color w:val="404040" w:themeColor="text1" w:themeTint="BF"/>
+              </w:rPr>
+              <w:t>Aucun</w:t>
+            </w:r>
+          </w:p>
+        </w:tc>
+        <w:tc>
+          <w:tcPr>
+            <w:tcW w:w="0" w:type="auto"/>
+            <w:tcBorders>
+              <w:top w:val="single" w:sz="4" w:space="0" w:color="auto"/>
+              <w:left w:val="single" w:sz="4" w:space="0" w:color="auto"/>
+              <w:bottom w:val="single" w:sz="4" w:space="0" w:color="auto"/>
+              <w:right w:val="single" w:sz="4" w:space="0" w:color="auto"/>
+            </w:tcBorders>
+            <w:vAlign w:val="center"/>
+            <w:hideMark/>
+          </w:tcPr>
+          <w:p>
+            <w:pPr>
+              <w:jc w:val="center"/>
+              <w:rPr>
+                <w:color w:val="404040" w:themeColor="text1" w:themeTint="BF"/>
+              </w:rPr>
+            </w:pPr>
+            <w:r>
+              <w:rPr>
+                <w:color w:val="404040" w:themeColor="text1" w:themeTint="BF"/>
+              </w:rPr>
+              <w:t>Non</w:t>
+            </w:r>
+          </w:p>
+        </w:tc>
+      </w:tr>
+      <w:tr>
+        <w:trPr>
+          <w:tblCellSpacing w:w="15" w:type="dxa"/>
+        </w:trPr>
+        <w:tc>
+          <w:tcPr>
+            <w:tcW w:w="0" w:type="auto"/>
+            <w:tcBorders>
+              <w:top w:val="single" w:sz="4" w:space="0" w:color="auto"/>
+              <w:left w:val="single" w:sz="4" w:space="0" w:color="auto"/>
+              <w:bottom w:val="single" w:sz="4" w:space="0" w:color="auto"/>
+              <w:right w:val="single" w:sz="4" w:space="0" w:color="auto"/>
+            </w:tcBorders>
+            <w:vAlign w:val="center"/>
+            <w:hideMark/>
+          </w:tcPr>
+          <w:p>
+            <w:pPr>
+              <w:jc w:val="center"/>
+              <w:rPr>
+                <w:color w:val="404040" w:themeColor="text1" w:themeTint="BF"/>
+              </w:rPr>
+            </w:pPr>
+            <w:r>
+              <w:rPr>
+                <w:color w:val="404040" w:themeColor="text1" w:themeTint="BF"/>
+              </w:rPr>
+              <w:t>Public</w:t>
+            </w:r>
+          </w:p>
+        </w:tc>
+        <w:tc>
+          <w:tcPr>
+            <w:tcW w:w="0" w:type="auto"/>
+            <w:tcBorders>
+              <w:top w:val="single" w:sz="4" w:space="0" w:color="auto"/>
+              <w:left w:val="single" w:sz="4" w:space="0" w:color="auto"/>
+              <w:bottom w:val="single" w:sz="4" w:space="0" w:color="auto"/>
+              <w:right w:val="single" w:sz="4" w:space="0" w:color="auto"/>
+            </w:tcBorders>
+            <w:vAlign w:val="center"/>
+            <w:hideMark/>
+          </w:tcPr>
+          <w:p>
+            <w:pPr>
+              <w:jc w:val="center"/>
+              <w:rPr>
+                <w:color w:val="404040" w:themeColor="text1" w:themeTint="BF"/>
+              </w:rPr>
+            </w:pPr>
+            <w:r>
+              <w:rPr>
+                <w:color w:val="404040" w:themeColor="text1" w:themeTint="BF"/>
+              </w:rPr>
+              <w:t>/reset-</w:t>
+            </w:r>
+            <w:proofErr w:type="spellStart"/>
+            <w:r>
+              <w:rPr>
+                <w:color w:val="404040" w:themeColor="text1" w:themeTint="BF"/>
+              </w:rPr>
+              <w:t>password</w:t>
+            </w:r>
+            <w:proofErr w:type="spellEnd"/>
+          </w:p>
+        </w:tc>
+        <w:tc>
+          <w:tcPr>
+            <w:tcW w:w="0" w:type="auto"/>
+            <w:tcBorders>
+              <w:top w:val="single" w:sz="4" w:space="0" w:color="auto"/>
+              <w:left w:val="single" w:sz="4" w:space="0" w:color="auto"/>
+              <w:bottom w:val="single" w:sz="4" w:space="0" w:color="auto"/>
+              <w:right w:val="single" w:sz="4" w:space="0" w:color="auto"/>
+            </w:tcBorders>
+            <w:vAlign w:val="center"/>
+            <w:hideMark/>
+          </w:tcPr>
+          <w:p>
+            <w:pPr>
+              <w:jc w:val="center"/>
+              <w:rPr>
+                <w:color w:val="404040" w:themeColor="text1" w:themeTint="BF"/>
+              </w:rPr>
+            </w:pPr>
+            <w:r>
+              <w:rPr>
+                <w:color w:val="404040" w:themeColor="text1" w:themeTint="BF"/>
+              </w:rPr>
+              <w:t>Réinitialisation du mot de passe</w:t>
+            </w:r>
+          </w:p>
+        </w:tc>
+        <w:tc>
+          <w:tcPr>
+            <w:tcW w:w="0" w:type="auto"/>
+            <w:tcBorders>
+              <w:top w:val="single" w:sz="4" w:space="0" w:color="auto"/>
+              <w:left w:val="single" w:sz="4" w:space="0" w:color="auto"/>
+              <w:bottom w:val="single" w:sz="4" w:space="0" w:color="auto"/>
+              <w:right w:val="single" w:sz="4" w:space="0" w:color="auto"/>
+            </w:tcBorders>
+            <w:vAlign w:val="center"/>
+            <w:hideMark/>
+          </w:tcPr>
+          <w:p>
+            <w:pPr>
+              <w:jc w:val="center"/>
+              <w:rPr>
+                <w:color w:val="404040" w:themeColor="text1" w:themeTint="BF"/>
+              </w:rPr>
+            </w:pPr>
+            <w:proofErr w:type="spellStart"/>
+            <w:r>
+              <w:rPr>
+                <w:color w:val="404040" w:themeColor="text1" w:themeTint="BF"/>
+              </w:rPr>
+              <w:t>Token</w:t>
+            </w:r>
+            <w:proofErr w:type="spellEnd"/>
+            <w:r>
+              <w:rPr>
+                <w:color w:val="404040" w:themeColor="text1" w:themeTint="BF"/>
+              </w:rPr>
+              <w:t xml:space="preserve"> éventuel</w:t>
+            </w:r>
+          </w:p>
+        </w:tc>
+        <w:tc>
+          <w:tcPr>
+            <w:tcW w:w="0" w:type="auto"/>
+            <w:tcBorders>
+              <w:top w:val="single" w:sz="4" w:space="0" w:color="auto"/>
+              <w:left w:val="single" w:sz="4" w:space="0" w:color="auto"/>
+              <w:bottom w:val="single" w:sz="4" w:space="0" w:color="auto"/>
+              <w:right w:val="single" w:sz="4" w:space="0" w:color="auto"/>
+            </w:tcBorders>
+            <w:vAlign w:val="center"/>
+            <w:hideMark/>
+          </w:tcPr>
+          <w:p>
+            <w:pPr>
+              <w:jc w:val="center"/>
+              <w:rPr>
+                <w:color w:val="404040" w:themeColor="text1" w:themeTint="BF"/>
+              </w:rPr>
+            </w:pPr>
+            <w:r>
+              <w:rPr>
+                <w:color w:val="404040" w:themeColor="text1" w:themeTint="BF"/>
+              </w:rPr>
+              <w:t>Non</w:t>
+            </w:r>
+          </w:p>
+        </w:tc>
+      </w:tr>
+      <w:tr>
+        <w:trPr>
+          <w:tblCellSpacing w:w="15" w:type="dxa"/>
+        </w:trPr>
+        <w:tc>
+          <w:tcPr>
+            <w:tcW w:w="0" w:type="auto"/>
+            <w:tcBorders>
+              <w:top w:val="single" w:sz="4" w:space="0" w:color="auto"/>
+              <w:left w:val="single" w:sz="4" w:space="0" w:color="auto"/>
+              <w:bottom w:val="single" w:sz="4" w:space="0" w:color="auto"/>
+              <w:right w:val="single" w:sz="4" w:space="0" w:color="auto"/>
+            </w:tcBorders>
+            <w:vAlign w:val="center"/>
+            <w:hideMark/>
+          </w:tcPr>
+          <w:p>
+            <w:pPr>
+              <w:jc w:val="center"/>
+              <w:rPr>
+                <w:color w:val="404040" w:themeColor="text1" w:themeTint="BF"/>
+              </w:rPr>
+            </w:pPr>
+            <w:r>
+              <w:rPr>
+                <w:color w:val="404040" w:themeColor="text1" w:themeTint="BF"/>
+              </w:rPr>
+              <w:lastRenderedPageBreak/>
+              <w:t>Authentifié</w:t>
+            </w:r>
+          </w:p>
+        </w:tc>
+        <w:tc>
+          <w:tcPr>
+            <w:tcW w:w="0" w:type="auto"/>
+            <w:tcBorders>
+              <w:top w:val="single" w:sz="4" w:space="0" w:color="auto"/>
+              <w:left w:val="single" w:sz="4" w:space="0" w:color="auto"/>
+              <w:bottom w:val="single" w:sz="4" w:space="0" w:color="auto"/>
+              <w:right w:val="single" w:sz="4" w:space="0" w:color="auto"/>
+            </w:tcBorders>
+            <w:vAlign w:val="center"/>
+            <w:hideMark/>
+          </w:tcPr>
+          <w:p>
+            <w:pPr>
+              <w:jc w:val="center"/>
+              <w:rPr>
+                <w:color w:val="404040" w:themeColor="text1" w:themeTint="BF"/>
+              </w:rPr>
+            </w:pPr>
+            <w:r>
+              <w:rPr>
+                <w:color w:val="404040" w:themeColor="text1" w:themeTint="BF"/>
+              </w:rPr>
+              <w:t>/</w:t>
+            </w:r>
+            <w:proofErr w:type="spellStart"/>
+            <w:r>
+              <w:rPr>
+                <w:color w:val="404040" w:themeColor="text1" w:themeTint="BF"/>
+              </w:rPr>
+              <w:t>dashboard</w:t>
+            </w:r>
+            <w:proofErr w:type="spellEnd"/>
+          </w:p>
+        </w:tc>
+        <w:tc>
+          <w:tcPr>
+            <w:tcW w:w="0" w:type="auto"/>
+            <w:tcBorders>
+              <w:top w:val="single" w:sz="4" w:space="0" w:color="auto"/>
+              <w:left w:val="single" w:sz="4" w:space="0" w:color="auto"/>
+              <w:bottom w:val="single" w:sz="4" w:space="0" w:color="auto"/>
+              <w:right w:val="single" w:sz="4" w:space="0" w:color="auto"/>
+            </w:tcBorders>
+            <w:vAlign w:val="center"/>
+            <w:hideMark/>
+          </w:tcPr>
+          <w:p>
+            <w:pPr>
+              <w:jc w:val="center"/>
+              <w:rPr>
+                <w:color w:val="404040" w:themeColor="text1" w:themeTint="BF"/>
+              </w:rPr>
+            </w:pPr>
+            <w:r>
+              <w:rPr>
+                <w:color w:val="404040" w:themeColor="text1" w:themeTint="BF"/>
+              </w:rPr>
+              <w:t>Tableau de bord utilisateur</w:t>
+            </w:r>
+          </w:p>
+        </w:tc>
+        <w:tc>
+          <w:tcPr>
+            <w:tcW w:w="0" w:type="auto"/>
+            <w:tcBorders>
+              <w:top w:val="single" w:sz="4" w:space="0" w:color="auto"/>
+              <w:left w:val="single" w:sz="4" w:space="0" w:color="auto"/>
+              <w:bottom w:val="single" w:sz="4" w:space="0" w:color="auto"/>
+              <w:right w:val="single" w:sz="4" w:space="0" w:color="auto"/>
+            </w:tcBorders>
+            <w:vAlign w:val="center"/>
+            <w:hideMark/>
+          </w:tcPr>
+          <w:p>
+            <w:pPr>
+              <w:jc w:val="center"/>
+              <w:rPr>
+                <w:color w:val="404040" w:themeColor="text1" w:themeTint="BF"/>
+              </w:rPr>
+            </w:pPr>
+            <w:r>
+              <w:rPr>
+                <w:color w:val="404040" w:themeColor="text1" w:themeTint="BF"/>
+              </w:rPr>
+              <w:t>Aucun</w:t>
+            </w:r>
+          </w:p>
+        </w:tc>
+        <w:tc>
+          <w:tcPr>
+            <w:tcW w:w="0" w:type="auto"/>
+            <w:tcBorders>
+              <w:top w:val="single" w:sz="4" w:space="0" w:color="auto"/>
+              <w:left w:val="single" w:sz="4" w:space="0" w:color="auto"/>
+              <w:bottom w:val="single" w:sz="4" w:space="0" w:color="auto"/>
+              <w:right w:val="single" w:sz="4" w:space="0" w:color="auto"/>
+            </w:tcBorders>
+            <w:vAlign w:val="center"/>
+            <w:hideMark/>
+          </w:tcPr>
+          <w:p>
+            <w:pPr>
+              <w:jc w:val="center"/>
+              <w:rPr>
+                <w:color w:val="404040" w:themeColor="text1" w:themeTint="BF"/>
+              </w:rPr>
+            </w:pPr>
+            <w:r>
+              <w:rPr>
+                <w:color w:val="404040" w:themeColor="text1" w:themeTint="BF"/>
+              </w:rPr>
+              <w:t>Oui</w:t>
+            </w:r>
+          </w:p>
+        </w:tc>
+      </w:tr>
+      <w:tr>
+        <w:trPr>
+          <w:tblCellSpacing w:w="15" w:type="dxa"/>
+        </w:trPr>
+        <w:tc>
+          <w:tcPr>
+            <w:tcW w:w="0" w:type="auto"/>
+            <w:tcBorders>
+              <w:top w:val="single" w:sz="4" w:space="0" w:color="auto"/>
+              <w:left w:val="single" w:sz="4" w:space="0" w:color="auto"/>
+              <w:bottom w:val="single" w:sz="4" w:space="0" w:color="auto"/>
+              <w:right w:val="single" w:sz="4" w:space="0" w:color="auto"/>
+            </w:tcBorders>
+            <w:vAlign w:val="center"/>
+            <w:hideMark/>
+          </w:tcPr>
+          <w:p>
+            <w:pPr>
+              <w:jc w:val="center"/>
+              <w:rPr>
+                <w:color w:val="404040" w:themeColor="text1" w:themeTint="BF"/>
+              </w:rPr>
+            </w:pPr>
+            <w:r>
+              <w:rPr>
+                <w:color w:val="404040" w:themeColor="text1" w:themeTint="BF"/>
+              </w:rPr>
+              <w:t>Authentifié</w:t>
+            </w:r>
+          </w:p>
+        </w:tc>
+        <w:tc>
+          <w:tcPr>
+            <w:tcW w:w="0" w:type="auto"/>
+            <w:tcBorders>
+              <w:top w:val="single" w:sz="4" w:space="0" w:color="auto"/>
+              <w:left w:val="single" w:sz="4" w:space="0" w:color="auto"/>
+              <w:bottom w:val="single" w:sz="4" w:space="0" w:color="auto"/>
+              <w:right w:val="single" w:sz="4" w:space="0" w:color="auto"/>
+            </w:tcBorders>
+            <w:vAlign w:val="center"/>
+            <w:hideMark/>
+          </w:tcPr>
+          <w:p>
+            <w:pPr>
+              <w:jc w:val="center"/>
+              <w:rPr>
+                <w:color w:val="404040" w:themeColor="text1" w:themeTint="BF"/>
+              </w:rPr>
+            </w:pPr>
+            <w:r>
+              <w:rPr>
+                <w:color w:val="404040" w:themeColor="text1" w:themeTint="BF"/>
+              </w:rPr>
+              <w:t>/</w:t>
+            </w:r>
+            <w:proofErr w:type="spellStart"/>
+            <w:r>
+              <w:rPr>
+                <w:color w:val="404040" w:themeColor="text1" w:themeTint="BF"/>
+              </w:rPr>
+              <w:t>appointments</w:t>
+            </w:r>
+            <w:proofErr w:type="spellEnd"/>
+            <w:proofErr w:type="gramStart"/>
+            <w:r>
+              <w:rPr>
+                <w:color w:val="404040" w:themeColor="text1" w:themeTint="BF"/>
+              </w:rPr>
+              <w:t>/:</w:t>
+            </w:r>
+            <w:proofErr w:type="gramEnd"/>
+            <w:r>
+              <w:rPr>
+                <w:color w:val="404040" w:themeColor="text1" w:themeTint="BF"/>
+              </w:rPr>
+              <w:t>id</w:t>
+            </w:r>
+          </w:p>
+        </w:tc>
+        <w:tc>
+          <w:tcPr>
+            <w:tcW w:w="0" w:type="auto"/>
+            <w:tcBorders>
+              <w:top w:val="single" w:sz="4" w:space="0" w:color="auto"/>
+              <w:left w:val="single" w:sz="4" w:space="0" w:color="auto"/>
+              <w:bottom w:val="single" w:sz="4" w:space="0" w:color="auto"/>
+              <w:right w:val="single" w:sz="4" w:space="0" w:color="auto"/>
+            </w:tcBorders>
+            <w:vAlign w:val="center"/>
+            <w:hideMark/>
+          </w:tcPr>
+          <w:p>
+            <w:pPr>
+              <w:jc w:val="center"/>
+              <w:rPr>
+                <w:color w:val="404040" w:themeColor="text1" w:themeTint="BF"/>
+              </w:rPr>
+            </w:pPr>
+            <w:r>
+              <w:rPr>
+                <w:color w:val="404040" w:themeColor="text1" w:themeTint="BF"/>
+              </w:rPr>
+              <w:t>Consultation d’un rendez-vous</w:t>
+            </w:r>
+          </w:p>
+        </w:tc>
+        <w:tc>
+          <w:tcPr>
+            <w:tcW w:w="0" w:type="auto"/>
+            <w:tcBorders>
+              <w:top w:val="single" w:sz="4" w:space="0" w:color="auto"/>
+              <w:left w:val="single" w:sz="4" w:space="0" w:color="auto"/>
+              <w:bottom w:val="single" w:sz="4" w:space="0" w:color="auto"/>
+              <w:right w:val="single" w:sz="4" w:space="0" w:color="auto"/>
+            </w:tcBorders>
+            <w:vAlign w:val="center"/>
+            <w:hideMark/>
+          </w:tcPr>
+          <w:p>
+            <w:pPr>
+              <w:jc w:val="center"/>
+              <w:rPr>
+                <w:color w:val="404040" w:themeColor="text1" w:themeTint="BF"/>
+              </w:rPr>
+            </w:pPr>
+            <w:proofErr w:type="gramStart"/>
+            <w:r>
+              <w:rPr>
+                <w:color w:val="404040" w:themeColor="text1" w:themeTint="BF"/>
+              </w:rPr>
+              <w:t>id</w:t>
+            </w:r>
+            <w:proofErr w:type="gramEnd"/>
+          </w:p>
+        </w:tc>
+        <w:tc>
+          <w:tcPr>
+            <w:tcW w:w="0" w:type="auto"/>
+            <w:tcBorders>
+              <w:top w:val="single" w:sz="4" w:space="0" w:color="auto"/>
+              <w:left w:val="single" w:sz="4" w:space="0" w:color="auto"/>
+              <w:bottom w:val="single" w:sz="4" w:space="0" w:color="auto"/>
+              <w:right w:val="single" w:sz="4" w:space="0" w:color="auto"/>
+            </w:tcBorders>
+            <w:vAlign w:val="center"/>
+            <w:hideMark/>
+          </w:tcPr>
+          <w:p>
+            <w:pPr>
+              <w:jc w:val="center"/>
+              <w:rPr>
+                <w:color w:val="404040" w:themeColor="text1" w:themeTint="BF"/>
+              </w:rPr>
+            </w:pPr>
+            <w:r>
+              <w:rPr>
+                <w:color w:val="404040" w:themeColor="text1" w:themeTint="BF"/>
+              </w:rPr>
+              <w:t>Oui</w:t>
+            </w:r>
+          </w:p>
+        </w:tc>
+      </w:tr>
+      <w:tr>
+        <w:trPr>
+          <w:tblCellSpacing w:w="15" w:type="dxa"/>
+        </w:trPr>
+        <w:tc>
+          <w:tcPr>
+            <w:tcW w:w="0" w:type="auto"/>
+            <w:tcBorders>
+              <w:top w:val="single" w:sz="4" w:space="0" w:color="auto"/>
+              <w:left w:val="single" w:sz="4" w:space="0" w:color="auto"/>
+              <w:bottom w:val="single" w:sz="4" w:space="0" w:color="auto"/>
+              <w:right w:val="single" w:sz="4" w:space="0" w:color="auto"/>
+            </w:tcBorders>
+            <w:vAlign w:val="center"/>
+            <w:hideMark/>
+          </w:tcPr>
+          <w:p>
+            <w:pPr>
+              <w:jc w:val="center"/>
+              <w:rPr>
+                <w:color w:val="404040" w:themeColor="text1" w:themeTint="BF"/>
+              </w:rPr>
+            </w:pPr>
+            <w:r>
+              <w:rPr>
+                <w:color w:val="404040" w:themeColor="text1" w:themeTint="BF"/>
+              </w:rPr>
+              <w:t>Authentifié</w:t>
+            </w:r>
+          </w:p>
+        </w:tc>
+        <w:tc>
+          <w:tcPr>
+            <w:tcW w:w="0" w:type="auto"/>
+            <w:tcBorders>
+              <w:top w:val="single" w:sz="4" w:space="0" w:color="auto"/>
+              <w:left w:val="single" w:sz="4" w:space="0" w:color="auto"/>
+              <w:bottom w:val="single" w:sz="4" w:space="0" w:color="auto"/>
+              <w:right w:val="single" w:sz="4" w:space="0" w:color="auto"/>
+            </w:tcBorders>
+            <w:vAlign w:val="center"/>
+            <w:hideMark/>
+          </w:tcPr>
+          <w:p>
+            <w:pPr>
+              <w:jc w:val="center"/>
+              <w:rPr>
+                <w:color w:val="404040" w:themeColor="text1" w:themeTint="BF"/>
+              </w:rPr>
+            </w:pPr>
+            <w:r>
+              <w:rPr>
+                <w:color w:val="404040" w:themeColor="text1" w:themeTint="BF"/>
+              </w:rPr>
+              <w:t>/</w:t>
+            </w:r>
+            <w:proofErr w:type="spellStart"/>
+            <w:r>
+              <w:rPr>
+                <w:color w:val="404040" w:themeColor="text1" w:themeTint="BF"/>
+              </w:rPr>
+              <w:t>appointments</w:t>
+            </w:r>
+            <w:proofErr w:type="spellEnd"/>
+            <w:proofErr w:type="gramStart"/>
+            <w:r>
+              <w:rPr>
+                <w:color w:val="404040" w:themeColor="text1" w:themeTint="BF"/>
+              </w:rPr>
+              <w:t>/:</w:t>
+            </w:r>
+            <w:proofErr w:type="gramEnd"/>
+            <w:r>
+              <w:rPr>
+                <w:color w:val="404040" w:themeColor="text1" w:themeTint="BF"/>
+              </w:rPr>
+              <w:t>id/</w:t>
+            </w:r>
+            <w:proofErr w:type="spellStart"/>
+            <w:r>
+              <w:rPr>
+                <w:color w:val="404040" w:themeColor="text1" w:themeTint="BF"/>
+              </w:rPr>
+              <w:t>edit</w:t>
+            </w:r>
+            <w:proofErr w:type="spellEnd"/>
+          </w:p>
+        </w:tc>
+        <w:tc>
+          <w:tcPr>
+            <w:tcW w:w="0" w:type="auto"/>
+            <w:tcBorders>
+              <w:top w:val="single" w:sz="4" w:space="0" w:color="auto"/>
+              <w:left w:val="single" w:sz="4" w:space="0" w:color="auto"/>
+              <w:bottom w:val="single" w:sz="4" w:space="0" w:color="auto"/>
+              <w:right w:val="single" w:sz="4" w:space="0" w:color="auto"/>
+            </w:tcBorders>
+            <w:vAlign w:val="center"/>
+            <w:hideMark/>
+          </w:tcPr>
+          <w:p>
+            <w:pPr>
+              <w:jc w:val="center"/>
+              <w:rPr>
+                <w:color w:val="404040" w:themeColor="text1" w:themeTint="BF"/>
+              </w:rPr>
+            </w:pPr>
+            <w:r>
+              <w:rPr>
+                <w:color w:val="404040" w:themeColor="text1" w:themeTint="BF"/>
+              </w:rPr>
+              <w:t>Modification d’un rendez-vous</w:t>
+            </w:r>
+          </w:p>
+        </w:tc>
+        <w:tc>
+          <w:tcPr>
+            <w:tcW w:w="0" w:type="auto"/>
+            <w:tcBorders>
+              <w:top w:val="single" w:sz="4" w:space="0" w:color="auto"/>
+              <w:left w:val="single" w:sz="4" w:space="0" w:color="auto"/>
+              <w:bottom w:val="single" w:sz="4" w:space="0" w:color="auto"/>
+              <w:right w:val="single" w:sz="4" w:space="0" w:color="auto"/>
+            </w:tcBorders>
+            <w:vAlign w:val="center"/>
+            <w:hideMark/>
+          </w:tcPr>
+          <w:p>
+            <w:pPr>
+              <w:jc w:val="center"/>
+              <w:rPr>
+                <w:color w:val="404040" w:themeColor="text1" w:themeTint="BF"/>
+              </w:rPr>
+            </w:pPr>
+            <w:proofErr w:type="gramStart"/>
+            <w:r>
+              <w:rPr>
+                <w:color w:val="404040" w:themeColor="text1" w:themeTint="BF"/>
+              </w:rPr>
+              <w:t>id</w:t>
+            </w:r>
+            <w:proofErr w:type="gramEnd"/>
+          </w:p>
+        </w:tc>
+        <w:tc>
+          <w:tcPr>
+            <w:tcW w:w="0" w:type="auto"/>
+            <w:tcBorders>
+              <w:top w:val="single" w:sz="4" w:space="0" w:color="auto"/>
+              <w:left w:val="single" w:sz="4" w:space="0" w:color="auto"/>
+              <w:bottom w:val="single" w:sz="4" w:space="0" w:color="auto"/>
+              <w:right w:val="single" w:sz="4" w:space="0" w:color="auto"/>
+            </w:tcBorders>
+            <w:vAlign w:val="center"/>
+            <w:hideMark/>
+          </w:tcPr>
+          <w:p>
+            <w:pPr>
+              <w:jc w:val="center"/>
+              <w:rPr>
+                <w:color w:val="404040" w:themeColor="text1" w:themeTint="BF"/>
+              </w:rPr>
+            </w:pPr>
+            <w:r>
+              <w:rPr>
+                <w:color w:val="404040" w:themeColor="text1" w:themeTint="BF"/>
+              </w:rPr>
+              <w:t>Oui</w:t>
+            </w:r>
+          </w:p>
+        </w:tc>
+      </w:tr>
+      <w:tr>
+        <w:trPr>
+          <w:tblCellSpacing w:w="15" w:type="dxa"/>
+        </w:trPr>
+        <w:tc>
+          <w:tcPr>
+            <w:tcW w:w="0" w:type="auto"/>
+            <w:tcBorders>
+              <w:top w:val="single" w:sz="4" w:space="0" w:color="auto"/>
+              <w:left w:val="single" w:sz="4" w:space="0" w:color="auto"/>
+              <w:bottom w:val="single" w:sz="4" w:space="0" w:color="auto"/>
+              <w:right w:val="single" w:sz="4" w:space="0" w:color="auto"/>
+            </w:tcBorders>
+            <w:vAlign w:val="center"/>
+            <w:hideMark/>
+          </w:tcPr>
+          <w:p>
+            <w:pPr>
+              <w:jc w:val="center"/>
+              <w:rPr>
+                <w:color w:val="404040" w:themeColor="text1" w:themeTint="BF"/>
+              </w:rPr>
+            </w:pPr>
+            <w:r>
+              <w:rPr>
+                <w:color w:val="404040" w:themeColor="text1" w:themeTint="BF"/>
+              </w:rPr>
+              <w:t>Authentifié</w:t>
+            </w:r>
+          </w:p>
+        </w:tc>
+        <w:tc>
+          <w:tcPr>
+            <w:tcW w:w="0" w:type="auto"/>
+            <w:tcBorders>
+              <w:top w:val="single" w:sz="4" w:space="0" w:color="auto"/>
+              <w:left w:val="single" w:sz="4" w:space="0" w:color="auto"/>
+              <w:bottom w:val="single" w:sz="4" w:space="0" w:color="auto"/>
+              <w:right w:val="single" w:sz="4" w:space="0" w:color="auto"/>
+            </w:tcBorders>
+            <w:vAlign w:val="center"/>
+            <w:hideMark/>
+          </w:tcPr>
+          <w:p>
+            <w:pPr>
+              <w:jc w:val="center"/>
+              <w:rPr>
+                <w:color w:val="404040" w:themeColor="text1" w:themeTint="BF"/>
+              </w:rPr>
+            </w:pPr>
+            <w:r>
+              <w:rPr>
+                <w:color w:val="404040" w:themeColor="text1" w:themeTint="BF"/>
+              </w:rPr>
+              <w:t>/</w:t>
+            </w:r>
+            <w:proofErr w:type="spellStart"/>
+            <w:r>
+              <w:rPr>
+                <w:color w:val="404040" w:themeColor="text1" w:themeTint="BF"/>
+              </w:rPr>
+              <w:t>booking</w:t>
+            </w:r>
+            <w:proofErr w:type="spellEnd"/>
+            <w:r>
+              <w:rPr>
+                <w:color w:val="404040" w:themeColor="text1" w:themeTint="BF"/>
+              </w:rPr>
+              <w:t>/formula</w:t>
+            </w:r>
+          </w:p>
+        </w:tc>
+        <w:tc>
+          <w:tcPr>
+            <w:tcW w:w="0" w:type="auto"/>
+            <w:tcBorders>
+              <w:top w:val="single" w:sz="4" w:space="0" w:color="auto"/>
+              <w:left w:val="single" w:sz="4" w:space="0" w:color="auto"/>
+              <w:bottom w:val="single" w:sz="4" w:space="0" w:color="auto"/>
+              <w:right w:val="single" w:sz="4" w:space="0" w:color="auto"/>
+            </w:tcBorders>
+            <w:vAlign w:val="center"/>
+            <w:hideMark/>
+          </w:tcPr>
+          <w:p>
+            <w:pPr>
+              <w:jc w:val="center"/>
+              <w:rPr>
+                <w:color w:val="404040" w:themeColor="text1" w:themeTint="BF"/>
+              </w:rPr>
+            </w:pPr>
+            <w:r>
+              <w:rPr>
+                <w:color w:val="404040" w:themeColor="text1" w:themeTint="BF"/>
+              </w:rPr>
+              <w:t>Choix de la formule</w:t>
+            </w:r>
+          </w:p>
+        </w:tc>
+        <w:tc>
+          <w:tcPr>
+            <w:tcW w:w="0" w:type="auto"/>
+            <w:tcBorders>
+              <w:top w:val="single" w:sz="4" w:space="0" w:color="auto"/>
+              <w:left w:val="single" w:sz="4" w:space="0" w:color="auto"/>
+              <w:bottom w:val="single" w:sz="4" w:space="0" w:color="auto"/>
+              <w:right w:val="single" w:sz="4" w:space="0" w:color="auto"/>
+            </w:tcBorders>
+            <w:vAlign w:val="center"/>
+            <w:hideMark/>
+          </w:tcPr>
+          <w:p>
+            <w:pPr>
+              <w:jc w:val="center"/>
+              <w:rPr>
+                <w:color w:val="404040" w:themeColor="text1" w:themeTint="BF"/>
+              </w:rPr>
+            </w:pPr>
+            <w:r>
+              <w:rPr>
+                <w:color w:val="404040" w:themeColor="text1" w:themeTint="BF"/>
+              </w:rPr>
+              <w:t>Aucun</w:t>
+            </w:r>
+          </w:p>
+        </w:tc>
+        <w:tc>
+          <w:tcPr>
+            <w:tcW w:w="0" w:type="auto"/>
+            <w:tcBorders>
+              <w:top w:val="single" w:sz="4" w:space="0" w:color="auto"/>
+              <w:left w:val="single" w:sz="4" w:space="0" w:color="auto"/>
+              <w:bottom w:val="single" w:sz="4" w:space="0" w:color="auto"/>
+              <w:right w:val="single" w:sz="4" w:space="0" w:color="auto"/>
+            </w:tcBorders>
+            <w:vAlign w:val="center"/>
+            <w:hideMark/>
+          </w:tcPr>
+          <w:p>
+            <w:pPr>
+              <w:jc w:val="center"/>
+              <w:rPr>
+                <w:color w:val="404040" w:themeColor="text1" w:themeTint="BF"/>
+              </w:rPr>
+            </w:pPr>
+            <w:r>
+              <w:rPr>
+                <w:color w:val="404040" w:themeColor="text1" w:themeTint="BF"/>
+              </w:rPr>
+              <w:t>Oui</w:t>
+            </w:r>
+          </w:p>
+        </w:tc>
+      </w:tr>
+      <w:tr>
+        <w:trPr>
+          <w:tblCellSpacing w:w="15" w:type="dxa"/>
+        </w:trPr>
+        <w:tc>
+          <w:tcPr>
+            <w:tcW w:w="0" w:type="auto"/>
+            <w:tcBorders>
+              <w:top w:val="single" w:sz="4" w:space="0" w:color="auto"/>
+              <w:left w:val="single" w:sz="4" w:space="0" w:color="auto"/>
+              <w:bottom w:val="single" w:sz="4" w:space="0" w:color="auto"/>
+              <w:right w:val="single" w:sz="4" w:space="0" w:color="auto"/>
+            </w:tcBorders>
+            <w:vAlign w:val="center"/>
+            <w:hideMark/>
+          </w:tcPr>
+          <w:p>
+            <w:pPr>
+              <w:jc w:val="center"/>
+              <w:rPr>
+                <w:color w:val="404040" w:themeColor="text1" w:themeTint="BF"/>
+              </w:rPr>
+            </w:pPr>
+            <w:r>
+              <w:rPr>
+                <w:color w:val="404040" w:themeColor="text1" w:themeTint="BF"/>
+              </w:rPr>
+              <w:t>Authentifié</w:t>
+            </w:r>
+          </w:p>
+        </w:tc>
+        <w:tc>
+          <w:tcPr>
+            <w:tcW w:w="0" w:type="auto"/>
+            <w:tcBorders>
+              <w:top w:val="single" w:sz="4" w:space="0" w:color="auto"/>
+              <w:left w:val="single" w:sz="4" w:space="0" w:color="auto"/>
+              <w:bottom w:val="single" w:sz="4" w:space="0" w:color="auto"/>
+              <w:right w:val="single" w:sz="4" w:space="0" w:color="auto"/>
+            </w:tcBorders>
+            <w:vAlign w:val="center"/>
+            <w:hideMark/>
+          </w:tcPr>
+          <w:p>
+            <w:pPr>
+              <w:jc w:val="center"/>
+              <w:rPr>
+                <w:color w:val="404040" w:themeColor="text1" w:themeTint="BF"/>
+              </w:rPr>
+            </w:pPr>
+            <w:r>
+              <w:rPr>
+                <w:color w:val="404040" w:themeColor="text1" w:themeTint="BF"/>
+              </w:rPr>
+              <w:t>/</w:t>
+            </w:r>
+            <w:proofErr w:type="spellStart"/>
+            <w:r>
+              <w:rPr>
+                <w:color w:val="404040" w:themeColor="text1" w:themeTint="BF"/>
+              </w:rPr>
+              <w:t>booking</w:t>
+            </w:r>
+            <w:proofErr w:type="spellEnd"/>
+            <w:r>
+              <w:rPr>
+                <w:color w:val="404040" w:themeColor="text1" w:themeTint="BF"/>
+              </w:rPr>
+              <w:t>/</w:t>
+            </w:r>
+            <w:proofErr w:type="spellStart"/>
+            <w:r>
+              <w:rPr>
+                <w:color w:val="404040" w:themeColor="text1" w:themeTint="BF"/>
+              </w:rPr>
+              <w:t>vehicle</w:t>
+            </w:r>
+            <w:proofErr w:type="spellEnd"/>
+          </w:p>
+        </w:tc>
+        <w:tc>
+          <w:tcPr>
+            <w:tcW w:w="0" w:type="auto"/>
+            <w:tcBorders>
+              <w:top w:val="single" w:sz="4" w:space="0" w:color="auto"/>
+              <w:left w:val="single" w:sz="4" w:space="0" w:color="auto"/>
+              <w:bottom w:val="single" w:sz="4" w:space="0" w:color="auto"/>
+              <w:right w:val="single" w:sz="4" w:space="0" w:color="auto"/>
+            </w:tcBorders>
+            <w:vAlign w:val="center"/>
+            <w:hideMark/>
+          </w:tcPr>
+          <w:p>
+            <w:pPr>
+              <w:jc w:val="center"/>
+              <w:rPr>
+                <w:color w:val="404040" w:themeColor="text1" w:themeTint="BF"/>
+              </w:rPr>
+            </w:pPr>
+            <w:r>
+              <w:rPr>
+                <w:color w:val="404040" w:themeColor="text1" w:themeTint="BF"/>
+              </w:rPr>
+              <w:t>Saisie ou choix du véhicule</w:t>
+            </w:r>
+          </w:p>
+        </w:tc>
+        <w:tc>
+          <w:tcPr>
+            <w:tcW w:w="0" w:type="auto"/>
+            <w:tcBorders>
+              <w:top w:val="single" w:sz="4" w:space="0" w:color="auto"/>
+              <w:left w:val="single" w:sz="4" w:space="0" w:color="auto"/>
+              <w:bottom w:val="single" w:sz="4" w:space="0" w:color="auto"/>
+              <w:right w:val="single" w:sz="4" w:space="0" w:color="auto"/>
+            </w:tcBorders>
+            <w:vAlign w:val="center"/>
+            <w:hideMark/>
+          </w:tcPr>
+          <w:p>
+            <w:pPr>
+              <w:jc w:val="center"/>
+              <w:rPr>
+                <w:color w:val="404040" w:themeColor="text1" w:themeTint="BF"/>
+              </w:rPr>
+            </w:pPr>
+            <w:r>
+              <w:rPr>
+                <w:color w:val="404040" w:themeColor="text1" w:themeTint="BF"/>
+              </w:rPr>
+              <w:t>Aucun</w:t>
+            </w:r>
+          </w:p>
+        </w:tc>
+        <w:tc>
+          <w:tcPr>
+            <w:tcW w:w="0" w:type="auto"/>
+            <w:tcBorders>
+              <w:top w:val="single" w:sz="4" w:space="0" w:color="auto"/>
+              <w:left w:val="single" w:sz="4" w:space="0" w:color="auto"/>
+              <w:bottom w:val="single" w:sz="4" w:space="0" w:color="auto"/>
+              <w:right w:val="single" w:sz="4" w:space="0" w:color="auto"/>
+            </w:tcBorders>
+            <w:vAlign w:val="center"/>
+            <w:hideMark/>
+          </w:tcPr>
+          <w:p>
+            <w:pPr>
+              <w:jc w:val="center"/>
+              <w:rPr>
+                <w:color w:val="404040" w:themeColor="text1" w:themeTint="BF"/>
+              </w:rPr>
+            </w:pPr>
+            <w:r>
+              <w:rPr>
+                <w:color w:val="404040" w:themeColor="text1" w:themeTint="BF"/>
+              </w:rPr>
+              <w:t>Oui</w:t>
+            </w:r>
+          </w:p>
+        </w:tc>
+      </w:tr>
+      <w:tr>
+        <w:trPr>
+          <w:tblCellSpacing w:w="15" w:type="dxa"/>
+        </w:trPr>
+        <w:tc>
+          <w:tcPr>
+            <w:tcW w:w="0" w:type="auto"/>
+            <w:tcBorders>
+              <w:top w:val="single" w:sz="4" w:space="0" w:color="auto"/>
+              <w:left w:val="single" w:sz="4" w:space="0" w:color="auto"/>
+              <w:bottom w:val="single" w:sz="4" w:space="0" w:color="auto"/>
+              <w:right w:val="single" w:sz="4" w:space="0" w:color="auto"/>
+            </w:tcBorders>
+            <w:vAlign w:val="center"/>
+            <w:hideMark/>
+          </w:tcPr>
+          <w:p>
+            <w:pPr>
+              <w:jc w:val="center"/>
+              <w:rPr>
+                <w:color w:val="404040" w:themeColor="text1" w:themeTint="BF"/>
+              </w:rPr>
+            </w:pPr>
+            <w:r>
+              <w:rPr>
+                <w:color w:val="404040" w:themeColor="text1" w:themeTint="BF"/>
+              </w:rPr>
+              <w:t>Authentifié</w:t>
+            </w:r>
+          </w:p>
+        </w:tc>
+        <w:tc>
+          <w:tcPr>
+            <w:tcW w:w="0" w:type="auto"/>
+            <w:tcBorders>
+              <w:top w:val="single" w:sz="4" w:space="0" w:color="auto"/>
+              <w:left w:val="single" w:sz="4" w:space="0" w:color="auto"/>
+              <w:bottom w:val="single" w:sz="4" w:space="0" w:color="auto"/>
+              <w:right w:val="single" w:sz="4" w:space="0" w:color="auto"/>
+            </w:tcBorders>
+            <w:vAlign w:val="center"/>
+            <w:hideMark/>
+          </w:tcPr>
+          <w:p>
+            <w:pPr>
+              <w:jc w:val="center"/>
+              <w:rPr>
+                <w:color w:val="404040" w:themeColor="text1" w:themeTint="BF"/>
+              </w:rPr>
+            </w:pPr>
+            <w:r>
+              <w:rPr>
+                <w:color w:val="404040" w:themeColor="text1" w:themeTint="BF"/>
+              </w:rPr>
+              <w:t>/</w:t>
+            </w:r>
+            <w:proofErr w:type="spellStart"/>
+            <w:r>
+              <w:rPr>
+                <w:color w:val="404040" w:themeColor="text1" w:themeTint="BF"/>
+              </w:rPr>
+              <w:t>booking</w:t>
+            </w:r>
+            <w:proofErr w:type="spellEnd"/>
+            <w:r>
+              <w:rPr>
+                <w:color w:val="404040" w:themeColor="text1" w:themeTint="BF"/>
+              </w:rPr>
+              <w:t>/slot</w:t>
+            </w:r>
+          </w:p>
+        </w:tc>
+        <w:tc>
+          <w:tcPr>
+            <w:tcW w:w="0" w:type="auto"/>
+            <w:tcBorders>
+              <w:top w:val="single" w:sz="4" w:space="0" w:color="auto"/>
+              <w:left w:val="single" w:sz="4" w:space="0" w:color="auto"/>
+              <w:bottom w:val="single" w:sz="4" w:space="0" w:color="auto"/>
+              <w:right w:val="single" w:sz="4" w:space="0" w:color="auto"/>
+            </w:tcBorders>
+            <w:vAlign w:val="center"/>
+            <w:hideMark/>
+          </w:tcPr>
+          <w:p>
+            <w:pPr>
+              <w:jc w:val="center"/>
+              <w:rPr>
+                <w:color w:val="404040" w:themeColor="text1" w:themeTint="BF"/>
+              </w:rPr>
+            </w:pPr>
+            <w:r>
+              <w:rPr>
+                <w:color w:val="404040" w:themeColor="text1" w:themeTint="BF"/>
+              </w:rPr>
+              <w:t>Sélection du créneau</w:t>
+            </w:r>
+          </w:p>
+        </w:tc>
+        <w:tc>
+          <w:tcPr>
+            <w:tcW w:w="0" w:type="auto"/>
+            <w:tcBorders>
+              <w:top w:val="single" w:sz="4" w:space="0" w:color="auto"/>
+              <w:left w:val="single" w:sz="4" w:space="0" w:color="auto"/>
+              <w:bottom w:val="single" w:sz="4" w:space="0" w:color="auto"/>
+              <w:right w:val="single" w:sz="4" w:space="0" w:color="auto"/>
+            </w:tcBorders>
+            <w:vAlign w:val="center"/>
+            <w:hideMark/>
+          </w:tcPr>
+          <w:p>
+            <w:pPr>
+              <w:jc w:val="center"/>
+              <w:rPr>
+                <w:color w:val="404040" w:themeColor="text1" w:themeTint="BF"/>
+              </w:rPr>
+            </w:pPr>
+            <w:r>
+              <w:rPr>
+                <w:color w:val="404040" w:themeColor="text1" w:themeTint="BF"/>
+              </w:rPr>
+              <w:t>Aucun</w:t>
+            </w:r>
+          </w:p>
+        </w:tc>
+        <w:tc>
+          <w:tcPr>
+            <w:tcW w:w="0" w:type="auto"/>
+            <w:tcBorders>
+              <w:top w:val="single" w:sz="4" w:space="0" w:color="auto"/>
+              <w:left w:val="single" w:sz="4" w:space="0" w:color="auto"/>
+              <w:bottom w:val="single" w:sz="4" w:space="0" w:color="auto"/>
+              <w:right w:val="single" w:sz="4" w:space="0" w:color="auto"/>
+            </w:tcBorders>
+            <w:vAlign w:val="center"/>
+            <w:hideMark/>
+          </w:tcPr>
+          <w:p>
+            <w:pPr>
+              <w:jc w:val="center"/>
+              <w:rPr>
+                <w:color w:val="404040" w:themeColor="text1" w:themeTint="BF"/>
+              </w:rPr>
+            </w:pPr>
+            <w:r>
+              <w:rPr>
+                <w:color w:val="404040" w:themeColor="text1" w:themeTint="BF"/>
+              </w:rPr>
+              <w:t>Oui</w:t>
+            </w:r>
+          </w:p>
+        </w:tc>
+      </w:tr>
+      <w:tr>
+        <w:trPr>
+          <w:tblCellSpacing w:w="15" w:type="dxa"/>
+        </w:trPr>
+        <w:tc>
+          <w:tcPr>
+            <w:tcW w:w="0" w:type="auto"/>
+            <w:tcBorders>
+              <w:top w:val="single" w:sz="4" w:space="0" w:color="auto"/>
+              <w:left w:val="single" w:sz="4" w:space="0" w:color="auto"/>
+              <w:bottom w:val="single" w:sz="4" w:space="0" w:color="auto"/>
+              <w:right w:val="single" w:sz="4" w:space="0" w:color="auto"/>
+            </w:tcBorders>
+            <w:vAlign w:val="center"/>
+            <w:hideMark/>
+          </w:tcPr>
+          <w:p>
+            <w:pPr>
+              <w:jc w:val="center"/>
+              <w:rPr>
+                <w:color w:val="404040" w:themeColor="text1" w:themeTint="BF"/>
+              </w:rPr>
+            </w:pPr>
+            <w:r>
+              <w:rPr>
+                <w:color w:val="404040" w:themeColor="text1" w:themeTint="BF"/>
+              </w:rPr>
+              <w:t>Authentifié</w:t>
+            </w:r>
+          </w:p>
+        </w:tc>
+        <w:tc>
+          <w:tcPr>
+            <w:tcW w:w="0" w:type="auto"/>
+            <w:tcBorders>
+              <w:top w:val="single" w:sz="4" w:space="0" w:color="auto"/>
+              <w:left w:val="single" w:sz="4" w:space="0" w:color="auto"/>
+              <w:bottom w:val="single" w:sz="4" w:space="0" w:color="auto"/>
+              <w:right w:val="single" w:sz="4" w:space="0" w:color="auto"/>
+            </w:tcBorders>
+            <w:vAlign w:val="center"/>
+            <w:hideMark/>
+          </w:tcPr>
+          <w:p>
+            <w:pPr>
+              <w:jc w:val="center"/>
+              <w:rPr>
+                <w:color w:val="404040" w:themeColor="text1" w:themeTint="BF"/>
+              </w:rPr>
+            </w:pPr>
+            <w:r>
+              <w:rPr>
+                <w:color w:val="404040" w:themeColor="text1" w:themeTint="BF"/>
+              </w:rPr>
+              <w:t>/</w:t>
+            </w:r>
+            <w:proofErr w:type="spellStart"/>
+            <w:r>
+              <w:rPr>
+                <w:color w:val="404040" w:themeColor="text1" w:themeTint="BF"/>
+              </w:rPr>
+              <w:t>booking</w:t>
+            </w:r>
+            <w:proofErr w:type="spellEnd"/>
+            <w:r>
+              <w:rPr>
+                <w:color w:val="404040" w:themeColor="text1" w:themeTint="BF"/>
+              </w:rPr>
+              <w:t>/</w:t>
+            </w:r>
+            <w:proofErr w:type="spellStart"/>
+            <w:r>
+              <w:rPr>
+                <w:color w:val="404040" w:themeColor="text1" w:themeTint="BF"/>
+              </w:rPr>
+              <w:t>recap</w:t>
+            </w:r>
+            <w:proofErr w:type="spellEnd"/>
+          </w:p>
+        </w:tc>
+        <w:tc>
+          <w:tcPr>
+            <w:tcW w:w="0" w:type="auto"/>
+            <w:tcBorders>
+              <w:top w:val="single" w:sz="4" w:space="0" w:color="auto"/>
+              <w:left w:val="single" w:sz="4" w:space="0" w:color="auto"/>
+              <w:bottom w:val="single" w:sz="4" w:space="0" w:color="auto"/>
+              <w:right w:val="single" w:sz="4" w:space="0" w:color="auto"/>
+            </w:tcBorders>
+            <w:vAlign w:val="center"/>
+            <w:hideMark/>
+          </w:tcPr>
+          <w:p>
+            <w:pPr>
+              <w:jc w:val="center"/>
+              <w:rPr>
+                <w:color w:val="404040" w:themeColor="text1" w:themeTint="BF"/>
+              </w:rPr>
+            </w:pPr>
+            <w:r>
+              <w:rPr>
+                <w:color w:val="404040" w:themeColor="text1" w:themeTint="BF"/>
+              </w:rPr>
+              <w:t>Récapitulatif de réservation</w:t>
+            </w:r>
+          </w:p>
+        </w:tc>
+        <w:tc>
+          <w:tcPr>
+            <w:tcW w:w="0" w:type="auto"/>
+            <w:tcBorders>
+              <w:top w:val="single" w:sz="4" w:space="0" w:color="auto"/>
+              <w:left w:val="single" w:sz="4" w:space="0" w:color="auto"/>
+              <w:bottom w:val="single" w:sz="4" w:space="0" w:color="auto"/>
+              <w:right w:val="single" w:sz="4" w:space="0" w:color="auto"/>
+            </w:tcBorders>
+            <w:vAlign w:val="center"/>
+            <w:hideMark/>
+          </w:tcPr>
+          <w:p>
+            <w:pPr>
+              <w:jc w:val="center"/>
+              <w:rPr>
+                <w:color w:val="404040" w:themeColor="text1" w:themeTint="BF"/>
+              </w:rPr>
+            </w:pPr>
+            <w:r>
+              <w:rPr>
+                <w:color w:val="404040" w:themeColor="text1" w:themeTint="BF"/>
+              </w:rPr>
+              <w:t>Aucun</w:t>
+            </w:r>
+          </w:p>
+        </w:tc>
+        <w:tc>
+          <w:tcPr>
+            <w:tcW w:w="0" w:type="auto"/>
+            <w:tcBorders>
+              <w:top w:val="single" w:sz="4" w:space="0" w:color="auto"/>
+              <w:left w:val="single" w:sz="4" w:space="0" w:color="auto"/>
+              <w:bottom w:val="single" w:sz="4" w:space="0" w:color="auto"/>
+              <w:right w:val="single" w:sz="4" w:space="0" w:color="auto"/>
+            </w:tcBorders>
+            <w:vAlign w:val="center"/>
+            <w:hideMark/>
+          </w:tcPr>
+          <w:p>
+            <w:pPr>
+              <w:jc w:val="center"/>
+              <w:rPr>
+                <w:color w:val="404040" w:themeColor="text1" w:themeTint="BF"/>
+              </w:rPr>
+            </w:pPr>
+            <w:r>
+              <w:rPr>
+                <w:color w:val="404040" w:themeColor="text1" w:themeTint="BF"/>
+              </w:rPr>
+              <w:t>Oui</w:t>
+            </w:r>
+          </w:p>
+        </w:tc>
+      </w:tr>
+      <w:tr>
+        <w:trPr>
+          <w:tblCellSpacing w:w="15" w:type="dxa"/>
+        </w:trPr>
+        <w:tc>
+          <w:tcPr>
+            <w:tcW w:w="0" w:type="auto"/>
+            <w:tcBorders>
+              <w:top w:val="single" w:sz="4" w:space="0" w:color="auto"/>
+              <w:left w:val="single" w:sz="4" w:space="0" w:color="auto"/>
+              <w:bottom w:val="single" w:sz="4" w:space="0" w:color="auto"/>
+              <w:right w:val="single" w:sz="4" w:space="0" w:color="auto"/>
+            </w:tcBorders>
+            <w:vAlign w:val="center"/>
+            <w:hideMark/>
+          </w:tcPr>
+          <w:p>
+            <w:pPr>
+              <w:jc w:val="center"/>
+              <w:rPr>
+                <w:color w:val="404040" w:themeColor="text1" w:themeTint="BF"/>
+              </w:rPr>
+            </w:pPr>
+            <w:r>
+              <w:rPr>
+                <w:color w:val="404040" w:themeColor="text1" w:themeTint="BF"/>
+              </w:rPr>
+              <w:t>Authentifié</w:t>
+            </w:r>
+          </w:p>
+        </w:tc>
+        <w:tc>
+          <w:tcPr>
+            <w:tcW w:w="0" w:type="auto"/>
+            <w:tcBorders>
+              <w:top w:val="single" w:sz="4" w:space="0" w:color="auto"/>
+              <w:left w:val="single" w:sz="4" w:space="0" w:color="auto"/>
+              <w:bottom w:val="single" w:sz="4" w:space="0" w:color="auto"/>
+              <w:right w:val="single" w:sz="4" w:space="0" w:color="auto"/>
+            </w:tcBorders>
+            <w:vAlign w:val="center"/>
+            <w:hideMark/>
+          </w:tcPr>
+          <w:p>
+            <w:pPr>
+              <w:jc w:val="center"/>
+              <w:rPr>
+                <w:color w:val="404040" w:themeColor="text1" w:themeTint="BF"/>
+              </w:rPr>
+            </w:pPr>
+            <w:r>
+              <w:rPr>
+                <w:color w:val="404040" w:themeColor="text1" w:themeTint="BF"/>
+              </w:rPr>
+              <w:t>/</w:t>
+            </w:r>
+            <w:proofErr w:type="spellStart"/>
+            <w:r>
+              <w:rPr>
+                <w:color w:val="404040" w:themeColor="text1" w:themeTint="BF"/>
+              </w:rPr>
+              <w:t>payment</w:t>
+            </w:r>
+            <w:proofErr w:type="spellEnd"/>
+          </w:p>
+        </w:tc>
+        <w:tc>
+          <w:tcPr>
+            <w:tcW w:w="0" w:type="auto"/>
+            <w:tcBorders>
+              <w:top w:val="single" w:sz="4" w:space="0" w:color="auto"/>
+              <w:left w:val="single" w:sz="4" w:space="0" w:color="auto"/>
+              <w:bottom w:val="single" w:sz="4" w:space="0" w:color="auto"/>
+              <w:right w:val="single" w:sz="4" w:space="0" w:color="auto"/>
+            </w:tcBorders>
+            <w:vAlign w:val="center"/>
+            <w:hideMark/>
+          </w:tcPr>
+          <w:p>
+            <w:pPr>
+              <w:jc w:val="center"/>
+              <w:rPr>
+                <w:color w:val="404040" w:themeColor="text1" w:themeTint="BF"/>
+              </w:rPr>
+            </w:pPr>
+            <w:r>
+              <w:rPr>
+                <w:color w:val="404040" w:themeColor="text1" w:themeTint="BF"/>
+              </w:rPr>
+              <w:t>Paiement de la réservation</w:t>
+            </w:r>
+          </w:p>
+        </w:tc>
+        <w:tc>
+          <w:tcPr>
+            <w:tcW w:w="0" w:type="auto"/>
+            <w:tcBorders>
+              <w:top w:val="single" w:sz="4" w:space="0" w:color="auto"/>
+              <w:left w:val="single" w:sz="4" w:space="0" w:color="auto"/>
+              <w:bottom w:val="single" w:sz="4" w:space="0" w:color="auto"/>
+              <w:right w:val="single" w:sz="4" w:space="0" w:color="auto"/>
+            </w:tcBorders>
+            <w:vAlign w:val="center"/>
+            <w:hideMark/>
+          </w:tcPr>
+          <w:p>
+            <w:pPr>
+              <w:jc w:val="center"/>
+              <w:rPr>
+                <w:color w:val="404040" w:themeColor="text1" w:themeTint="BF"/>
+              </w:rPr>
+            </w:pPr>
+            <w:r>
+              <w:rPr>
+                <w:color w:val="404040" w:themeColor="text1" w:themeTint="BF"/>
+              </w:rPr>
+              <w:t>Aucun</w:t>
+            </w:r>
+          </w:p>
+        </w:tc>
+        <w:tc>
+          <w:tcPr>
+            <w:tcW w:w="0" w:type="auto"/>
+            <w:tcBorders>
+              <w:top w:val="single" w:sz="4" w:space="0" w:color="auto"/>
+              <w:left w:val="single" w:sz="4" w:space="0" w:color="auto"/>
+              <w:bottom w:val="single" w:sz="4" w:space="0" w:color="auto"/>
+              <w:right w:val="single" w:sz="4" w:space="0" w:color="auto"/>
+            </w:tcBorders>
+            <w:vAlign w:val="center"/>
+            <w:hideMark/>
+          </w:tcPr>
+          <w:p>
+            <w:pPr>
+              <w:jc w:val="center"/>
+              <w:rPr>
+                <w:color w:val="404040" w:themeColor="text1" w:themeTint="BF"/>
+              </w:rPr>
+            </w:pPr>
+            <w:r>
+              <w:rPr>
+                <w:color w:val="404040" w:themeColor="text1" w:themeTint="BF"/>
+              </w:rPr>
+              <w:t>Oui</w:t>
+            </w:r>
+          </w:p>
+        </w:tc>
+      </w:tr>
+      <w:tr>
+        <w:trPr>
+          <w:tblCellSpacing w:w="15" w:type="dxa"/>
+        </w:trPr>
+        <w:tc>
+          <w:tcPr>
+            <w:tcW w:w="0" w:type="auto"/>
+            <w:tcBorders>
+              <w:top w:val="single" w:sz="4" w:space="0" w:color="auto"/>
+              <w:left w:val="single" w:sz="4" w:space="0" w:color="auto"/>
+              <w:bottom w:val="single" w:sz="4" w:space="0" w:color="auto"/>
+              <w:right w:val="single" w:sz="4" w:space="0" w:color="auto"/>
+            </w:tcBorders>
+            <w:vAlign w:val="center"/>
+            <w:hideMark/>
+          </w:tcPr>
+          <w:p>
+            <w:pPr>
+              <w:jc w:val="center"/>
+              <w:rPr>
+                <w:color w:val="404040" w:themeColor="text1" w:themeTint="BF"/>
+              </w:rPr>
+            </w:pPr>
+            <w:r>
+              <w:rPr>
+                <w:color w:val="404040" w:themeColor="text1" w:themeTint="BF"/>
+              </w:rPr>
+              <w:t>Authentifié</w:t>
+            </w:r>
+          </w:p>
+        </w:tc>
+        <w:tc>
+          <w:tcPr>
+            <w:tcW w:w="0" w:type="auto"/>
+            <w:tcBorders>
+              <w:top w:val="single" w:sz="4" w:space="0" w:color="auto"/>
+              <w:left w:val="single" w:sz="4" w:space="0" w:color="auto"/>
+              <w:bottom w:val="single" w:sz="4" w:space="0" w:color="auto"/>
+              <w:right w:val="single" w:sz="4" w:space="0" w:color="auto"/>
+            </w:tcBorders>
+            <w:vAlign w:val="center"/>
+            <w:hideMark/>
+          </w:tcPr>
+          <w:p>
+            <w:pPr>
+              <w:jc w:val="center"/>
+              <w:rPr>
+                <w:color w:val="404040" w:themeColor="text1" w:themeTint="BF"/>
+              </w:rPr>
+            </w:pPr>
+            <w:r>
+              <w:rPr>
+                <w:color w:val="404040" w:themeColor="text1" w:themeTint="BF"/>
+              </w:rPr>
+              <w:t>/</w:t>
+            </w:r>
+            <w:proofErr w:type="spellStart"/>
+            <w:r>
+              <w:rPr>
+                <w:color w:val="404040" w:themeColor="text1" w:themeTint="BF"/>
+              </w:rPr>
+              <w:t>payment</w:t>
+            </w:r>
+            <w:proofErr w:type="spellEnd"/>
+            <w:r>
+              <w:rPr>
+                <w:color w:val="404040" w:themeColor="text1" w:themeTint="BF"/>
+              </w:rPr>
+              <w:t>/</w:t>
+            </w:r>
+            <w:proofErr w:type="spellStart"/>
+            <w:r>
+              <w:rPr>
+                <w:color w:val="404040" w:themeColor="text1" w:themeTint="BF"/>
+              </w:rPr>
+              <w:t>success</w:t>
+            </w:r>
+            <w:proofErr w:type="spellEnd"/>
+          </w:p>
+        </w:tc>
+        <w:tc>
+          <w:tcPr>
+            <w:tcW w:w="0" w:type="auto"/>
+            <w:tcBorders>
+              <w:top w:val="single" w:sz="4" w:space="0" w:color="auto"/>
+              <w:left w:val="single" w:sz="4" w:space="0" w:color="auto"/>
+              <w:bottom w:val="single" w:sz="4" w:space="0" w:color="auto"/>
+              <w:right w:val="single" w:sz="4" w:space="0" w:color="auto"/>
+            </w:tcBorders>
+            <w:vAlign w:val="center"/>
+            <w:hideMark/>
+          </w:tcPr>
+          <w:p>
+            <w:pPr>
+              <w:jc w:val="center"/>
+              <w:rPr>
+                <w:color w:val="404040" w:themeColor="text1" w:themeTint="BF"/>
+              </w:rPr>
+            </w:pPr>
+            <w:r>
+              <w:rPr>
+                <w:color w:val="404040" w:themeColor="text1" w:themeTint="BF"/>
+              </w:rPr>
+              <w:t>Confirmation du paiement</w:t>
+            </w:r>
+          </w:p>
+        </w:tc>
+        <w:tc>
+          <w:tcPr>
+            <w:tcW w:w="0" w:type="auto"/>
+            <w:tcBorders>
+              <w:top w:val="single" w:sz="4" w:space="0" w:color="auto"/>
+              <w:left w:val="single" w:sz="4" w:space="0" w:color="auto"/>
+              <w:bottom w:val="single" w:sz="4" w:space="0" w:color="auto"/>
+              <w:right w:val="single" w:sz="4" w:space="0" w:color="auto"/>
+            </w:tcBorders>
+            <w:vAlign w:val="center"/>
+            <w:hideMark/>
+          </w:tcPr>
+          <w:p>
+            <w:pPr>
+              <w:jc w:val="center"/>
+              <w:rPr>
+                <w:color w:val="404040" w:themeColor="text1" w:themeTint="BF"/>
+              </w:rPr>
+            </w:pPr>
+            <w:r>
+              <w:rPr>
+                <w:color w:val="404040" w:themeColor="text1" w:themeTint="BF"/>
+              </w:rPr>
+              <w:t>Aucun</w:t>
+            </w:r>
+          </w:p>
+        </w:tc>
+        <w:tc>
+          <w:tcPr>
+            <w:tcW w:w="0" w:type="auto"/>
+            <w:tcBorders>
+              <w:top w:val="single" w:sz="4" w:space="0" w:color="auto"/>
+              <w:left w:val="single" w:sz="4" w:space="0" w:color="auto"/>
+              <w:bottom w:val="single" w:sz="4" w:space="0" w:color="auto"/>
+              <w:right w:val="single" w:sz="4" w:space="0" w:color="auto"/>
+            </w:tcBorders>
+            <w:vAlign w:val="center"/>
+            <w:hideMark/>
+          </w:tcPr>
+          <w:p>
+            <w:pPr>
+              <w:jc w:val="center"/>
+              <w:rPr>
+                <w:color w:val="404040" w:themeColor="text1" w:themeTint="BF"/>
+              </w:rPr>
+            </w:pPr>
+            <w:r>
+              <w:rPr>
+                <w:color w:val="404040" w:themeColor="text1" w:themeTint="BF"/>
+              </w:rPr>
+              <w:t>Oui</w:t>
+            </w:r>
+          </w:p>
+        </w:tc>
+      </w:tr>
+      <w:tr>
+        <w:trPr>
+          <w:tblCellSpacing w:w="15" w:type="dxa"/>
+        </w:trPr>
+        <w:tc>
+          <w:tcPr>
+            <w:tcW w:w="0" w:type="auto"/>
+            <w:tcBorders>
+              <w:top w:val="single" w:sz="4" w:space="0" w:color="auto"/>
+              <w:left w:val="single" w:sz="4" w:space="0" w:color="auto"/>
+              <w:bottom w:val="single" w:sz="4" w:space="0" w:color="auto"/>
+              <w:right w:val="single" w:sz="4" w:space="0" w:color="auto"/>
+            </w:tcBorders>
+            <w:vAlign w:val="center"/>
+            <w:hideMark/>
+          </w:tcPr>
+          <w:p>
+            <w:pPr>
+              <w:jc w:val="center"/>
+              <w:rPr>
+                <w:color w:val="404040" w:themeColor="text1" w:themeTint="BF"/>
+              </w:rPr>
+            </w:pPr>
+            <w:r>
+              <w:rPr>
+                <w:color w:val="404040" w:themeColor="text1" w:themeTint="BF"/>
+              </w:rPr>
+              <w:t>Authentifié</w:t>
+            </w:r>
+          </w:p>
+        </w:tc>
+        <w:tc>
+          <w:tcPr>
+            <w:tcW w:w="0" w:type="auto"/>
+            <w:tcBorders>
+              <w:top w:val="single" w:sz="4" w:space="0" w:color="auto"/>
+              <w:left w:val="single" w:sz="4" w:space="0" w:color="auto"/>
+              <w:bottom w:val="single" w:sz="4" w:space="0" w:color="auto"/>
+              <w:right w:val="single" w:sz="4" w:space="0" w:color="auto"/>
+            </w:tcBorders>
+            <w:vAlign w:val="center"/>
+            <w:hideMark/>
+          </w:tcPr>
+          <w:p>
+            <w:pPr>
+              <w:jc w:val="center"/>
+              <w:rPr>
+                <w:color w:val="404040" w:themeColor="text1" w:themeTint="BF"/>
+              </w:rPr>
+            </w:pPr>
+            <w:r>
+              <w:rPr>
+                <w:color w:val="404040" w:themeColor="text1" w:themeTint="BF"/>
+              </w:rPr>
+              <w:t>/</w:t>
+            </w:r>
+            <w:proofErr w:type="spellStart"/>
+            <w:r>
+              <w:rPr>
+                <w:color w:val="404040" w:themeColor="text1" w:themeTint="BF"/>
+              </w:rPr>
+              <w:t>payment</w:t>
+            </w:r>
+            <w:proofErr w:type="spellEnd"/>
+            <w:r>
+              <w:rPr>
+                <w:color w:val="404040" w:themeColor="text1" w:themeTint="BF"/>
+              </w:rPr>
+              <w:t>/</w:t>
+            </w:r>
+            <w:proofErr w:type="spellStart"/>
+            <w:r>
+              <w:rPr>
+                <w:color w:val="404040" w:themeColor="text1" w:themeTint="BF"/>
+              </w:rPr>
+              <w:t>failed</w:t>
+            </w:r>
+            <w:proofErr w:type="spellEnd"/>
+          </w:p>
+        </w:tc>
+        <w:tc>
+          <w:tcPr>
+            <w:tcW w:w="0" w:type="auto"/>
+            <w:tcBorders>
+              <w:top w:val="single" w:sz="4" w:space="0" w:color="auto"/>
+              <w:left w:val="single" w:sz="4" w:space="0" w:color="auto"/>
+              <w:bottom w:val="single" w:sz="4" w:space="0" w:color="auto"/>
+              <w:right w:val="single" w:sz="4" w:space="0" w:color="auto"/>
+            </w:tcBorders>
+            <w:vAlign w:val="center"/>
+            <w:hideMark/>
+          </w:tcPr>
+          <w:p>
+            <w:pPr>
+              <w:jc w:val="center"/>
+              <w:rPr>
+                <w:color w:val="404040" w:themeColor="text1" w:themeTint="BF"/>
+              </w:rPr>
+            </w:pPr>
+            <w:r>
+              <w:rPr>
+                <w:color w:val="404040" w:themeColor="text1" w:themeTint="BF"/>
+              </w:rPr>
+              <w:t>Échec du paiement</w:t>
+            </w:r>
+          </w:p>
+        </w:tc>
+        <w:tc>
+          <w:tcPr>
+            <w:tcW w:w="0" w:type="auto"/>
+            <w:tcBorders>
+              <w:top w:val="single" w:sz="4" w:space="0" w:color="auto"/>
+              <w:left w:val="single" w:sz="4" w:space="0" w:color="auto"/>
+              <w:bottom w:val="single" w:sz="4" w:space="0" w:color="auto"/>
+              <w:right w:val="single" w:sz="4" w:space="0" w:color="auto"/>
+            </w:tcBorders>
+            <w:vAlign w:val="center"/>
+            <w:hideMark/>
+          </w:tcPr>
+          <w:p>
+            <w:pPr>
+              <w:jc w:val="center"/>
+              <w:rPr>
+                <w:color w:val="404040" w:themeColor="text1" w:themeTint="BF"/>
+              </w:rPr>
+            </w:pPr>
+            <w:r>
+              <w:rPr>
+                <w:color w:val="404040" w:themeColor="text1" w:themeTint="BF"/>
+              </w:rPr>
+              <w:t>Aucun</w:t>
+            </w:r>
+          </w:p>
+        </w:tc>
+        <w:tc>
+          <w:tcPr>
+            <w:tcW w:w="0" w:type="auto"/>
+            <w:tcBorders>
+              <w:top w:val="single" w:sz="4" w:space="0" w:color="auto"/>
+              <w:left w:val="single" w:sz="4" w:space="0" w:color="auto"/>
+              <w:bottom w:val="single" w:sz="4" w:space="0" w:color="auto"/>
+              <w:right w:val="single" w:sz="4" w:space="0" w:color="auto"/>
+            </w:tcBorders>
+            <w:vAlign w:val="center"/>
+            <w:hideMark/>
+          </w:tcPr>
+          <w:p>
+            <w:pPr>
+              <w:jc w:val="center"/>
+              <w:rPr>
+                <w:color w:val="404040" w:themeColor="text1" w:themeTint="BF"/>
+              </w:rPr>
+            </w:pPr>
+            <w:r>
+              <w:rPr>
+                <w:color w:val="404040" w:themeColor="text1" w:themeTint="BF"/>
+              </w:rPr>
+              <w:t>Oui</w:t>
+            </w:r>
+          </w:p>
+        </w:tc>
+      </w:tr>
+    </w:tbl>
+    <w:p>
+      <w:pPr>
+        <w:rPr>
+          <w:color w:val="404040" w:themeColor="text1" w:themeTint="BF"/>
+          <w:lang w:val="en-GB"/>
+        </w:rPr>
+      </w:pPr>
+    </w:p>
+    <w:p>
+      <w:pPr>
+        <w:rPr>
+          <w:color w:val="404040" w:themeColor="text1" w:themeTint="BF"/>
+          <w:lang w:val="en-GB"/>
+        </w:rPr>
+      </w:pPr>
+    </w:p>
+    <w:p>
+      <w:pPr>
+        <w:rPr>
+          <w:color w:val="404040" w:themeColor="text1" w:themeTint="BF"/>
+          <w:lang w:val="en-GB"/>
+        </w:rPr>
+      </w:pPr>
+    </w:p>
+    <w:p>
+      <w:pPr>
+        <w:rPr>
+          <w:color w:val="404040" w:themeColor="text1" w:themeTint="BF"/>
+          <w:lang w:val="en-GB"/>
+        </w:rPr>
+      </w:pPr>
+    </w:p>
+    <w:p>
+      <w:pPr>
+        <w:rPr>
+          <w:color w:val="404040" w:themeColor="text1" w:themeTint="BF"/>
+          <w:lang w:val="en-GB"/>
+        </w:rPr>
+      </w:pPr>
+    </w:p>
+    <w:p>
+      <w:pPr>
+        <w:rPr>
+          <w:color w:val="404040" w:themeColor="text1" w:themeTint="BF"/>
+          <w:lang w:val="en-GB"/>
+        </w:rPr>
+      </w:pPr>
+    </w:p>
+    <w:p>
+      <w:pPr>
+        <w:rPr>
+          <w:color w:val="404040" w:themeColor="text1" w:themeTint="BF"/>
+          <w:lang w:val="en-GB"/>
+        </w:rPr>
+      </w:pPr>
+    </w:p>
+    <w:p>
+      <w:pPr>
+        <w:rPr>
+          <w:color w:val="404040" w:themeColor="text1" w:themeTint="BF"/>
+          <w:lang w:val="en-GB"/>
+        </w:rPr>
+      </w:pPr>
+    </w:p>
+    <w:p>
+      <w:pPr>
+        <w:rPr>
+          <w:color w:val="404040" w:themeColor="text1" w:themeTint="BF"/>
+          <w:lang w:val="en-GB"/>
+        </w:rPr>
+      </w:pPr>
+    </w:p>
+    <w:p>
+      <w:pPr>
+        <w:rPr>
+          <w:color w:val="404040" w:themeColor="text1" w:themeTint="BF"/>
+          <w:lang w:val="en-GB"/>
+        </w:rPr>
+      </w:pPr>
+    </w:p>
+    <w:p>
+      <w:pPr>
+        <w:rPr>
+          <w:color w:val="404040" w:themeColor="text1" w:themeTint="BF"/>
+          <w:lang w:val="en-GB"/>
+        </w:rPr>
+      </w:pPr>
+    </w:p>
+    <w:p>
+      <w:pPr>
+        <w:rPr>
+          <w:color w:val="404040" w:themeColor="text1" w:themeTint="BF"/>
+          <w:lang w:val="en-GB"/>
+        </w:rPr>
+      </w:pPr>
+    </w:p>
+    <w:p>
+      <w:pPr>
+        <w:rPr>
+          <w:color w:val="404040" w:themeColor="text1" w:themeTint="BF"/>
+          <w:lang w:val="en-GB"/>
+        </w:rPr>
+      </w:pPr>
+    </w:p>
+    <w:p>
+      <w:pPr>
+        <w:rPr>
+          <w:color w:val="404040" w:themeColor="text1" w:themeTint="BF"/>
+          <w:lang w:val="en-GB"/>
+        </w:rPr>
+      </w:pPr>
+    </w:p>
+    <w:p>
+      <w:pPr>
+        <w:rPr>
+          <w:color w:val="404040" w:themeColor="text1" w:themeTint="BF"/>
+          <w:lang w:val="en-GB"/>
+        </w:rPr>
+      </w:pPr>
+    </w:p>
+    <w:p>
+      <w:pPr>
+        <w:rPr>
+          <w:color w:val="404040" w:themeColor="text1" w:themeTint="BF"/>
+          <w:lang w:val="en-GB"/>
+        </w:rPr>
+      </w:pPr>
+    </w:p>
+    <w:p>
+      <w:pPr>
+        <w:rPr>
+          <w:color w:val="404040" w:themeColor="text1" w:themeTint="BF"/>
+          <w:lang w:val="en-GB"/>
+        </w:rPr>
+      </w:pPr>
+    </w:p>
+    <w:p>
+      <w:pPr>
+        <w:rPr>
+          <w:color w:val="404040" w:themeColor="text1" w:themeTint="BF"/>
+          <w:lang w:val="en-GB"/>
+        </w:rPr>
+      </w:pPr>
+    </w:p>
+    <w:p>
+      <w:pPr>
+        <w:rPr>
+          <w:color w:val="404040" w:themeColor="text1" w:themeTint="BF"/>
+          <w:lang w:val="en-GB"/>
+        </w:rPr>
+      </w:pPr>
+    </w:p>
+    <w:p>
+      <w:pPr>
+        <w:rPr>
+          <w:color w:val="404040" w:themeColor="text1" w:themeTint="BF"/>
+          <w:lang w:val="en-GB"/>
+        </w:rPr>
+      </w:pPr>
+    </w:p>
+    <w:p>
+      <w:pPr>
+        <w:rPr>
+          <w:color w:val="404040" w:themeColor="text1" w:themeTint="BF"/>
+          <w:lang w:val="en-GB"/>
+        </w:rPr>
+      </w:pPr>
+    </w:p>
+    <w:p>
+      <w:pPr>
+        <w:rPr>
+          <w:color w:val="404040" w:themeColor="text1" w:themeTint="BF"/>
+          <w:lang w:val="en-GB"/>
+        </w:rPr>
+      </w:pPr>
+    </w:p>
+    <w:p>
+      <w:pPr>
+        <w:rPr>
+          <w:color w:val="404040" w:themeColor="text1" w:themeTint="BF"/>
+          <w:lang w:val="en-GB"/>
+        </w:rPr>
+      </w:pPr>
+    </w:p>
+    <w:p>
+      <w:pPr>
+        <w:rPr>
+          <w:color w:val="404040" w:themeColor="text1" w:themeTint="BF"/>
+          <w:lang w:val="en-GB"/>
+        </w:rPr>
+      </w:pPr>
+    </w:p>
+    <w:p>
       <w:r>
         <w:t>//Todo</w:t>
       </w:r>
@@ -1378,8 +4193,8 @@
         <w:rPr>
           <w:color w:val="404040" w:themeColor="text1" w:themeTint="BF"/>
         </w:rPr>
-        <w:pict w14:anchorId="2953881D">
-          <v:rect id="_x0000_i1110" style="width:0;height:1.5pt" o:hralign="center" o:hrstd="t" o:hr="t" fillcolor="#a0a0a0" stroked="f"/>
+        <w:pict w14:anchorId="1402D3CD">
+          <v:rect id="_x0000_i1037" style="width:0;height:1.5pt" o:hralign="center" o:hrstd="t" o:hr="t" fillcolor="#a0a0a0" stroked="f"/>
         </w:pict>
       </w:r>
     </w:p>
@@ -1572,6 +4387,7 @@
           <w:bCs/>
           <w:color w:val="404040" w:themeColor="text1" w:themeTint="BF"/>
         </w:rPr>
+        <w:lastRenderedPageBreak/>
         <w:t>7.3 Principes</w:t>
       </w:r>
     </w:p>
@@ -1636,8 +4452,8 @@
         <w:rPr>
           <w:color w:val="404040" w:themeColor="text1" w:themeTint="BF"/>
         </w:rPr>
-        <w:pict w14:anchorId="049985FF">
-          <v:rect id="_x0000_i1111" style="width:0;height:1.5pt" o:hralign="center" o:hrstd="t" o:hr="t" fillcolor="#a0a0a0" stroked="f"/>
+        <w:pict w14:anchorId="4B842C59">
+          <v:rect id="_x0000_i1038" style="width:0;height:1.5pt" o:hralign="center" o:hrstd="t" o:hr="t" fillcolor="#a0a0a0" stroked="f"/>
         </w:pict>
       </w:r>
     </w:p>
@@ -1808,7 +4624,6 @@
         <w:rPr>
           <w:color w:val="404040" w:themeColor="text1" w:themeTint="BF"/>
         </w:rPr>
-        <w:lastRenderedPageBreak/>
         <w:t>Points utilisés</w:t>
       </w:r>
     </w:p>
@@ -1839,8 +4654,8 @@
         <w:rPr>
           <w:color w:val="404040" w:themeColor="text1" w:themeTint="BF"/>
         </w:rPr>
-        <w:pict w14:anchorId="10B649BA">
-          <v:rect id="_x0000_i1112" style="width:0;height:1.5pt" o:hralign="center" o:hrstd="t" o:hr="t" fillcolor="#a0a0a0" stroked="f"/>
+        <w:pict w14:anchorId="28A63A1C">
+          <v:rect id="_x0000_i1039" style="width:0;height:1.5pt" o:hralign="center" o:hrstd="t" o:hr="t" fillcolor="#a0a0a0" stroked="f"/>
         </w:pict>
       </w:r>
     </w:p>
@@ -2015,8 +4830,8 @@
         <w:rPr>
           <w:color w:val="404040" w:themeColor="text1" w:themeTint="BF"/>
         </w:rPr>
-        <w:pict w14:anchorId="3C371FFD">
-          <v:rect id="_x0000_i1113" style="width:0;height:1.5pt" o:hralign="center" o:hrstd="t" o:hr="t" fillcolor="#a0a0a0" stroked="f"/>
+        <w:pict w14:anchorId="0C100D9B">
+          <v:rect id="_x0000_i1040" style="width:0;height:1.5pt" o:hralign="center" o:hrstd="t" o:hr="t" fillcolor="#a0a0a0" stroked="f"/>
         </w:pict>
       </w:r>
     </w:p>
@@ -2034,6 +4849,7 @@
           <w:bCs/>
           <w:color w:val="404040" w:themeColor="text1" w:themeTint="BF"/>
         </w:rPr>
+        <w:lastRenderedPageBreak/>
         <w:t>10. Hors périmètre de cette documentation</w:t>
       </w:r>
     </w:p>
@@ -2173,8 +4989,8 @@
         <w:rPr>
           <w:color w:val="404040" w:themeColor="text1" w:themeTint="BF"/>
         </w:rPr>
-        <w:pict w14:anchorId="29D30853">
-          <v:rect id="_x0000_i1114" style="width:0;height:1.5pt" o:hralign="center" o:hrstd="t" o:hr="t" fillcolor="#a0a0a0" stroked="f"/>
+        <w:pict w14:anchorId="5EE6A715">
+          <v:rect id="_x0000_i1041" style="width:0;height:1.5pt" o:hralign="center" o:hrstd="t" o:hr="t" fillcolor="#a0a0a0" stroked="f"/>
         </w:pict>
       </w:r>
     </w:p>
@@ -2256,8 +5072,8 @@
         <w:rPr>
           <w:color w:val="404040" w:themeColor="text1" w:themeTint="BF"/>
         </w:rPr>
-        <w:pict w14:anchorId="1FF322B5">
-          <v:rect id="_x0000_i1115" style="width:0;height:1.5pt" o:hralign="center" o:hrstd="t" o:hr="t" fillcolor="#a0a0a0" stroked="f"/>
+        <w:pict w14:anchorId="51A4BE2C">
+          <v:rect id="_x0000_i1042" style="width:0;height:1.5pt" o:hralign="center" o:hrstd="t" o:hr="t" fillcolor="#a0a0a0" stroked="f"/>
         </w:pict>
       </w:r>
     </w:p>
@@ -2292,7 +5108,6 @@
         <w:rPr>
           <w:color w:val="404040" w:themeColor="text1" w:themeTint="BF"/>
         </w:rPr>
-        <w:lastRenderedPageBreak/>
         <w:t>Version : V0.1</w:t>
       </w:r>
     </w:p>
@@ -2337,20 +5152,6 @@
         </w:rPr>
         <w:t>Évolutif</w:t>
       </w:r>
-    </w:p>
-    <w:p>
-      <w:pPr>
-        <w:rPr>
-          <w:color w:val="404040" w:themeColor="text1" w:themeTint="BF"/>
-        </w:rPr>
-      </w:pPr>
-    </w:p>
-    <w:p>
-      <w:pPr>
-        <w:rPr>
-          <w:color w:val="404040" w:themeColor="text1" w:themeTint="BF"/>
-        </w:rPr>
-      </w:pPr>
     </w:p>
     <w:p>
       <w:pPr>
@@ -4460,7 +7261,7 @@
   <w:abstractNum w:abstractNumId="13" w15:restartNumberingAfterBreak="0">
     <w:nsid w:val="370F6E8D"/>
     <w:multiLevelType w:val="hybridMultilevel"/>
-    <w:tmpl w:val="67106F8E"/>
+    <w:tmpl w:val="B62A03B4"/>
     <w:lvl w:ilvl="0" w:tplc="040C000F">
       <w:start w:val="1"/>
       <w:numFmt w:val="decimal"/>
@@ -5962,6 +8763,155 @@
     </w:lvl>
   </w:abstractNum>
   <w:abstractNum w:abstractNumId="24" w15:restartNumberingAfterBreak="0">
+    <w:nsid w:val="6E840E8E"/>
+    <w:multiLevelType w:val="multilevel"/>
+    <w:tmpl w:val="25AC9EA0"/>
+    <w:lvl w:ilvl="0">
+      <w:start w:val="1"/>
+      <w:numFmt w:val="bullet"/>
+      <w:lvlText w:val=""/>
+      <w:lvlJc w:val="left"/>
+      <w:pPr>
+        <w:tabs>
+          <w:tab w:val="num" w:pos="720"/>
+        </w:tabs>
+        <w:ind w:left="720" w:hanging="360"/>
+      </w:pPr>
+      <w:rPr>
+        <w:rFonts w:ascii="Symbol" w:hAnsi="Symbol" w:hint="default"/>
+        <w:sz w:val="20"/>
+      </w:rPr>
+    </w:lvl>
+    <w:lvl w:ilvl="1" w:tentative="1">
+      <w:start w:val="1"/>
+      <w:numFmt w:val="bullet"/>
+      <w:lvlText w:val="o"/>
+      <w:lvlJc w:val="left"/>
+      <w:pPr>
+        <w:tabs>
+          <w:tab w:val="num" w:pos="1440"/>
+        </w:tabs>
+        <w:ind w:left="1440" w:hanging="360"/>
+      </w:pPr>
+      <w:rPr>
+        <w:rFonts w:ascii="Courier New" w:hAnsi="Courier New" w:hint="default"/>
+        <w:sz w:val="20"/>
+      </w:rPr>
+    </w:lvl>
+    <w:lvl w:ilvl="2" w:tentative="1">
+      <w:start w:val="1"/>
+      <w:numFmt w:val="bullet"/>
+      <w:lvlText w:val=""/>
+      <w:lvlJc w:val="left"/>
+      <w:pPr>
+        <w:tabs>
+          <w:tab w:val="num" w:pos="2160"/>
+        </w:tabs>
+        <w:ind w:left="2160" w:hanging="360"/>
+      </w:pPr>
+      <w:rPr>
+        <w:rFonts w:ascii="Wingdings" w:hAnsi="Wingdings" w:hint="default"/>
+        <w:sz w:val="20"/>
+      </w:rPr>
+    </w:lvl>
+    <w:lvl w:ilvl="3" w:tentative="1">
+      <w:start w:val="1"/>
+      <w:numFmt w:val="bullet"/>
+      <w:lvlText w:val=""/>
+      <w:lvlJc w:val="left"/>
+      <w:pPr>
+        <w:tabs>
+          <w:tab w:val="num" w:pos="2880"/>
+        </w:tabs>
+        <w:ind w:left="2880" w:hanging="360"/>
+      </w:pPr>
+      <w:rPr>
+        <w:rFonts w:ascii="Wingdings" w:hAnsi="Wingdings" w:hint="default"/>
+        <w:sz w:val="20"/>
+      </w:rPr>
+    </w:lvl>
+    <w:lvl w:ilvl="4" w:tentative="1">
+      <w:start w:val="1"/>
+      <w:numFmt w:val="bullet"/>
+      <w:lvlText w:val=""/>
+      <w:lvlJc w:val="left"/>
+      <w:pPr>
+        <w:tabs>
+          <w:tab w:val="num" w:pos="3600"/>
+        </w:tabs>
+        <w:ind w:left="3600" w:hanging="360"/>
+      </w:pPr>
+      <w:rPr>
+        <w:rFonts w:ascii="Wingdings" w:hAnsi="Wingdings" w:hint="default"/>
+        <w:sz w:val="20"/>
+      </w:rPr>
+    </w:lvl>
+    <w:lvl w:ilvl="5" w:tentative="1">
+      <w:start w:val="1"/>
+      <w:numFmt w:val="bullet"/>
+      <w:lvlText w:val=""/>
+      <w:lvlJc w:val="left"/>
+      <w:pPr>
+        <w:tabs>
+          <w:tab w:val="num" w:pos="4320"/>
+        </w:tabs>
+        <w:ind w:left="4320" w:hanging="360"/>
+      </w:pPr>
+      <w:rPr>
+        <w:rFonts w:ascii="Wingdings" w:hAnsi="Wingdings" w:hint="default"/>
+        <w:sz w:val="20"/>
+      </w:rPr>
+    </w:lvl>
+    <w:lvl w:ilvl="6" w:tentative="1">
+      <w:start w:val="1"/>
+      <w:numFmt w:val="bullet"/>
+      <w:lvlText w:val=""/>
+      <w:lvlJc w:val="left"/>
+      <w:pPr>
+        <w:tabs>
+          <w:tab w:val="num" w:pos="5040"/>
+        </w:tabs>
+        <w:ind w:left="5040" w:hanging="360"/>
+      </w:pPr>
+      <w:rPr>
+        <w:rFonts w:ascii="Wingdings" w:hAnsi="Wingdings" w:hint="default"/>
+        <w:sz w:val="20"/>
+      </w:rPr>
+    </w:lvl>
+    <w:lvl w:ilvl="7" w:tentative="1">
+      <w:start w:val="1"/>
+      <w:numFmt w:val="bullet"/>
+      <w:lvlText w:val=""/>
+      <w:lvlJc w:val="left"/>
+      <w:pPr>
+        <w:tabs>
+          <w:tab w:val="num" w:pos="5760"/>
+        </w:tabs>
+        <w:ind w:left="5760" w:hanging="360"/>
+      </w:pPr>
+      <w:rPr>
+        <w:rFonts w:ascii="Wingdings" w:hAnsi="Wingdings" w:hint="default"/>
+        <w:sz w:val="20"/>
+      </w:rPr>
+    </w:lvl>
+    <w:lvl w:ilvl="8" w:tentative="1">
+      <w:start w:val="1"/>
+      <w:numFmt w:val="bullet"/>
+      <w:lvlText w:val=""/>
+      <w:lvlJc w:val="left"/>
+      <w:pPr>
+        <w:tabs>
+          <w:tab w:val="num" w:pos="6480"/>
+        </w:tabs>
+        <w:ind w:left="6480" w:hanging="360"/>
+      </w:pPr>
+      <w:rPr>
+        <w:rFonts w:ascii="Wingdings" w:hAnsi="Wingdings" w:hint="default"/>
+        <w:sz w:val="20"/>
+      </w:rPr>
+    </w:lvl>
+  </w:abstractNum>
+  <w:abstractNum w:abstractNumId="25" w15:restartNumberingAfterBreak="0">
     <w:nsid w:val="6E85450E"/>
     <w:multiLevelType w:val="multilevel"/>
     <w:tmpl w:val="B95EDB26"/>
@@ -6110,7 +9060,7 @@
       </w:rPr>
     </w:lvl>
   </w:abstractNum>
-  <w:abstractNum w:abstractNumId="25" w15:restartNumberingAfterBreak="0">
+  <w:abstractNum w:abstractNumId="26" w15:restartNumberingAfterBreak="0">
     <w:nsid w:val="6EAB55E5"/>
     <w:multiLevelType w:val="hybridMultilevel"/>
     <w:tmpl w:val="EDC8D082"/>
@@ -6223,7 +9173,7 @@
       </w:rPr>
     </w:lvl>
   </w:abstractNum>
-  <w:abstractNum w:abstractNumId="26" w15:restartNumberingAfterBreak="0">
+  <w:abstractNum w:abstractNumId="27" w15:restartNumberingAfterBreak="0">
     <w:nsid w:val="797429F1"/>
     <w:multiLevelType w:val="multilevel"/>
     <w:tmpl w:val="8D7E7F6C"/>
@@ -6376,7 +9326,7 @@
     <w:abstractNumId w:val="13"/>
   </w:num>
   <w:num w:numId="2" w16cid:durableId="908349991">
-    <w:abstractNumId w:val="25"/>
+    <w:abstractNumId w:val="26"/>
   </w:num>
   <w:num w:numId="3" w16cid:durableId="1106538575">
     <w:abstractNumId w:val="18"/>
@@ -6388,7 +9338,7 @@
     <w:abstractNumId w:val="16"/>
   </w:num>
   <w:num w:numId="6" w16cid:durableId="2365411">
-    <w:abstractNumId w:val="24"/>
+    <w:abstractNumId w:val="25"/>
   </w:num>
   <w:num w:numId="7" w16cid:durableId="2141458733">
     <w:abstractNumId w:val="5"/>
@@ -6403,7 +9353,7 @@
     <w:abstractNumId w:val="4"/>
   </w:num>
   <w:num w:numId="11" w16cid:durableId="2049135917">
-    <w:abstractNumId w:val="26"/>
+    <w:abstractNumId w:val="27"/>
   </w:num>
   <w:num w:numId="12" w16cid:durableId="1605384047">
     <w:abstractNumId w:val="21"/>
@@ -6452,6 +9402,9 @@
   </w:num>
   <w:num w:numId="27" w16cid:durableId="950237769">
     <w:abstractNumId w:val="14"/>
+  </w:num>
+  <w:num w:numId="28" w16cid:durableId="2070414823">
+    <w:abstractNumId w:val="24"/>
   </w:num>
 </w:numbering>
 </file>
@@ -7414,6 +10367,25 @@
     <w:uiPriority w:val="99"/>
     <w:rsid w:val="009649C9"/>
   </w:style>
+  <w:style w:type="table" w:styleId="Grilledutableau">
+    <w:name w:val="Table Grid"/>
+    <w:basedOn w:val="TableauNormal"/>
+    <w:uiPriority w:val="39"/>
+    <w:rsid w:val="001E5FFA"/>
+    <w:pPr>
+      <w:spacing w:after="0" w:line="240" w:lineRule="auto"/>
+    </w:pPr>
+    <w:tblPr>
+      <w:tblBorders>
+        <w:top w:val="single" w:sz="4" w:space="0" w:color="auto"/>
+        <w:left w:val="single" w:sz="4" w:space="0" w:color="auto"/>
+        <w:bottom w:val="single" w:sz="4" w:space="0" w:color="auto"/>
+        <w:right w:val="single" w:sz="4" w:space="0" w:color="auto"/>
+        <w:insideH w:val="single" w:sz="4" w:space="0" w:color="auto"/>
+        <w:insideV w:val="single" w:sz="4" w:space="0" w:color="auto"/>
+      </w:tblBorders>
+    </w:tblPr>
+  </w:style>
 </w:styles>
 </file>
 

</xml_diff>

<commit_message>
feat: initialize NestJS API with essential configurations, controllers, and services
</commit_message>
<xml_diff>
--- a/docs/Technical specification/Technical_specifications.docx
+++ b/docs/Technical specification/Technical_specifications.docx
@@ -676,10 +676,7 @@
     </w:p>
     <w:p>
       <w:r>
-        <w:t xml:space="preserve">Le backend expose des opérations de gestion (création, lecture, mise à jour, </w:t>
-      </w:r>
-      <w:r>
-        <w:t>suppression)</w:t>
+        <w:t>Le backend expose des opérations de gestion (création, lecture, mise à jour, suppression)</w:t>
       </w:r>
       <w:r>
         <w:t xml:space="preserve"> sur</w:t>
@@ -1318,51 +1315,2869 @@
         <w:t>tiers(</w:t>
       </w:r>
       <w:proofErr w:type="spellStart"/>
+      <w:r>
+        <w:t>a</w:t>
+      </w:r>
+      <w:proofErr w:type="spellEnd"/>
       <w:proofErr w:type="gramEnd"/>
       <w:r>
-        <w:t>a</w:t>
+        <w:t xml:space="preserve"> décider).</w:t>
+      </w:r>
+    </w:p>
+    <w:p>
+      <w:r>
+        <w:t>Dans le cas de l’envoi directement via le backend, il existe un module dédié nommé « </w:t>
+      </w:r>
+      <w:proofErr w:type="spellStart"/>
+      <w:r>
+        <w:t>MailModules</w:t>
       </w:r>
       <w:proofErr w:type="spellEnd"/>
       <w:r>
-        <w:t xml:space="preserve"> décider).</w:t>
-      </w:r>
-    </w:p>
-    <w:p>
-      <w:r>
-        <w:t>Dans le cas de l’envoi directement via le backend, il existe un module dédié nommé « </w:t>
+        <w:t xml:space="preserve"> » disponible au sein de </w:t>
       </w:r>
       <w:proofErr w:type="spellStart"/>
       <w:r>
-        <w:t>MailModules</w:t>
+        <w:t>NestJs</w:t>
       </w:r>
       <w:proofErr w:type="spellEnd"/>
       <w:r>
-        <w:t xml:space="preserve"> » disponible au sein de </w:t>
+        <w:t>.</w:t>
+      </w:r>
+    </w:p>
+    <w:p>
+      <w:r>
+        <w:t>La seconde solution sera un envoi via un service externe comme « Amazon » SES ou bien « </w:t>
       </w:r>
       <w:proofErr w:type="spellStart"/>
       <w:r>
-        <w:t>NestJs</w:t>
+        <w:t>Sensgrid</w:t>
       </w:r>
       <w:proofErr w:type="spellEnd"/>
       <w:r>
+        <w:t> ».Elle sera appelé par le backend.</w:t>
+      </w:r>
+    </w:p>
+    <w:p/>
+    <w:p>
+      <w:pPr>
+        <w:rPr>
+          <w:color w:val="404040" w:themeColor="text1" w:themeTint="BF"/>
+        </w:rPr>
+      </w:pPr>
+    </w:p>
+    <w:p>
+      <w:pPr>
+        <w:pStyle w:val="Titre1"/>
+        <w:numPr>
+          <w:ilvl w:val="0"/>
+          <w:numId w:val="1"/>
+        </w:numPr>
+      </w:pPr>
+      <w:r>
+        <w:t>Spécification des routes de navigation de l’application</w:t>
+      </w:r>
+    </w:p>
+    <w:p/>
+    <w:p>
+      <w:r>
+        <w:t xml:space="preserve">Cette section décrit les routes </w:t>
+      </w:r>
+      <w:proofErr w:type="spellStart"/>
+      <w:r>
+        <w:t>front-end</w:t>
+      </w:r>
+      <w:proofErr w:type="spellEnd"/>
+      <w:r>
+        <w:t xml:space="preserve"> de l’application, leur rôle fonctionnel ainsi que leurs conditions d’accès.</w:t>
+      </w:r>
+      <w:r>
+        <w:br/>
+        <w:t>Les routes sont réparties en deux catégories :</w:t>
+      </w:r>
+    </w:p>
+    <w:p>
+      <w:pPr>
+        <w:numPr>
+          <w:ilvl w:val="0"/>
+          <w:numId w:val="28"/>
+        </w:numPr>
+      </w:pPr>
+      <w:proofErr w:type="gramStart"/>
+      <w:r>
+        <w:rPr>
+          <w:b/>
+          <w:bCs/>
+        </w:rPr>
+        <w:t>routes</w:t>
+      </w:r>
+      <w:proofErr w:type="gramEnd"/>
+      <w:r>
+        <w:rPr>
+          <w:b/>
+          <w:bCs/>
+        </w:rPr>
+        <w:t xml:space="preserve"> publiques</w:t>
+      </w:r>
+      <w:r>
+        <w:t>, accessibles sans authentification ;</w:t>
+      </w:r>
+    </w:p>
+    <w:p>
+      <w:pPr>
+        <w:numPr>
+          <w:ilvl w:val="0"/>
+          <w:numId w:val="28"/>
+        </w:numPr>
+      </w:pPr>
+      <w:proofErr w:type="gramStart"/>
+      <w:r>
+        <w:rPr>
+          <w:b/>
+          <w:bCs/>
+        </w:rPr>
+        <w:t>routes</w:t>
+      </w:r>
+      <w:proofErr w:type="gramEnd"/>
+      <w:r>
+        <w:rPr>
+          <w:b/>
+          <w:bCs/>
+        </w:rPr>
+        <w:t xml:space="preserve"> authentifiées</w:t>
+      </w:r>
+      <w:r>
+        <w:t>, accessibles uniquement aux utilisateurs connectés.</w:t>
+      </w:r>
+    </w:p>
+    <w:p>
+      <w:r>
+        <w:t>Certaines routes utilisent des paramètres dynamiques, par exemple :id, afin d’identifier une ressource spécifique.</w:t>
+      </w:r>
+      <w:r>
+        <w:br/>
+        <w:t xml:space="preserve">Le système de routage doit également garantir la protection des pages privées via un mécanisme de contrôle d’accès côté </w:t>
+      </w:r>
+      <w:proofErr w:type="spellStart"/>
+      <w:r>
+        <w:t>front-end</w:t>
+      </w:r>
+      <w:proofErr w:type="spellEnd"/>
+      <w:r>
         <w:t>.</w:t>
       </w:r>
     </w:p>
-    <w:p>
-      <w:r>
-        <w:t>La seconde solution sera un envoi via un service externe comme « Amazon » SES ou bien « </w:t>
-      </w:r>
-      <w:proofErr w:type="spellStart"/>
-      <w:r>
-        <w:t>Sensgrid</w:t>
-      </w:r>
-      <w:proofErr w:type="spellEnd"/>
-      <w:r>
-        <w:t> ».Elle sera appelé par le backend.</w:t>
-      </w:r>
-    </w:p>
     <w:p/>
     <w:p>
+      <w:pPr>
+        <w:rPr>
+          <w:color w:val="404040" w:themeColor="text1" w:themeTint="BF"/>
+          <w:lang w:val="en-GB"/>
+        </w:rPr>
+      </w:pPr>
+      <w:r>
+        <w:rPr>
+          <w:color w:val="404040" w:themeColor="text1" w:themeTint="BF"/>
+          <w:lang w:val="en-GB"/>
+        </w:rPr>
+        <w:br/>
+      </w:r>
+    </w:p>
+    <w:tbl>
+      <w:tblPr>
+        <w:tblW w:w="0" w:type="auto"/>
+        <w:tblCellSpacing w:w="15" w:type="dxa"/>
+        <w:tblCellMar>
+          <w:top w:w="15" w:type="dxa"/>
+          <w:left w:w="15" w:type="dxa"/>
+          <w:bottom w:w="15" w:type="dxa"/>
+          <w:right w:w="15" w:type="dxa"/>
+        </w:tblCellMar>
+        <w:tblLook w:val="04A0" w:firstRow="1" w:lastRow="0" w:firstColumn="1" w:lastColumn="0" w:noHBand="0" w:noVBand="1"/>
+      </w:tblPr>
+      <w:tblGrid>
+        <w:gridCol w:w="1321"/>
+        <w:gridCol w:w="2403"/>
+        <w:gridCol w:w="2666"/>
+        <w:gridCol w:w="1435"/>
+        <w:gridCol w:w="1237"/>
+      </w:tblGrid>
+      <w:tr>
+        <w:trPr>
+          <w:tblHeader/>
+          <w:tblCellSpacing w:w="15" w:type="dxa"/>
+        </w:trPr>
+        <w:tc>
+          <w:tcPr>
+            <w:tcW w:w="0" w:type="auto"/>
+            <w:tcBorders>
+              <w:top w:val="single" w:sz="4" w:space="0" w:color="auto"/>
+              <w:left w:val="single" w:sz="4" w:space="0" w:color="auto"/>
+              <w:bottom w:val="single" w:sz="4" w:space="0" w:color="auto"/>
+              <w:right w:val="single" w:sz="4" w:space="0" w:color="auto"/>
+            </w:tcBorders>
+            <w:vAlign w:val="center"/>
+            <w:hideMark/>
+          </w:tcPr>
+          <w:p>
+            <w:pPr>
+              <w:jc w:val="center"/>
+              <w:rPr>
+                <w:b/>
+                <w:bCs/>
+                <w:color w:val="404040" w:themeColor="text1" w:themeTint="BF"/>
+              </w:rPr>
+            </w:pPr>
+            <w:r>
+              <w:rPr>
+                <w:b/>
+                <w:bCs/>
+                <w:color w:val="404040" w:themeColor="text1" w:themeTint="BF"/>
+              </w:rPr>
+              <w:t>Type d’accès</w:t>
+            </w:r>
+          </w:p>
+        </w:tc>
+        <w:tc>
+          <w:tcPr>
+            <w:tcW w:w="0" w:type="auto"/>
+            <w:tcBorders>
+              <w:top w:val="single" w:sz="4" w:space="0" w:color="auto"/>
+              <w:left w:val="single" w:sz="4" w:space="0" w:color="auto"/>
+              <w:bottom w:val="single" w:sz="4" w:space="0" w:color="auto"/>
+              <w:right w:val="single" w:sz="4" w:space="0" w:color="auto"/>
+            </w:tcBorders>
+            <w:vAlign w:val="center"/>
+            <w:hideMark/>
+          </w:tcPr>
+          <w:p>
+            <w:pPr>
+              <w:jc w:val="center"/>
+              <w:rPr>
+                <w:b/>
+                <w:bCs/>
+                <w:color w:val="404040" w:themeColor="text1" w:themeTint="BF"/>
+              </w:rPr>
+            </w:pPr>
+            <w:r>
+              <w:rPr>
+                <w:b/>
+                <w:bCs/>
+                <w:color w:val="404040" w:themeColor="text1" w:themeTint="BF"/>
+              </w:rPr>
+              <w:t>Route</w:t>
+            </w:r>
+          </w:p>
+        </w:tc>
+        <w:tc>
+          <w:tcPr>
+            <w:tcW w:w="0" w:type="auto"/>
+            <w:tcBorders>
+              <w:top w:val="single" w:sz="4" w:space="0" w:color="auto"/>
+              <w:left w:val="single" w:sz="4" w:space="0" w:color="auto"/>
+              <w:bottom w:val="single" w:sz="4" w:space="0" w:color="auto"/>
+              <w:right w:val="single" w:sz="4" w:space="0" w:color="auto"/>
+            </w:tcBorders>
+            <w:vAlign w:val="center"/>
+            <w:hideMark/>
+          </w:tcPr>
+          <w:p>
+            <w:pPr>
+              <w:jc w:val="center"/>
+              <w:rPr>
+                <w:b/>
+                <w:bCs/>
+                <w:color w:val="404040" w:themeColor="text1" w:themeTint="BF"/>
+              </w:rPr>
+            </w:pPr>
+            <w:r>
+              <w:rPr>
+                <w:b/>
+                <w:bCs/>
+                <w:color w:val="404040" w:themeColor="text1" w:themeTint="BF"/>
+              </w:rPr>
+              <w:t>Description</w:t>
+            </w:r>
+          </w:p>
+        </w:tc>
+        <w:tc>
+          <w:tcPr>
+            <w:tcW w:w="0" w:type="auto"/>
+            <w:tcBorders>
+              <w:top w:val="single" w:sz="4" w:space="0" w:color="auto"/>
+              <w:left w:val="single" w:sz="4" w:space="0" w:color="auto"/>
+              <w:bottom w:val="single" w:sz="4" w:space="0" w:color="auto"/>
+              <w:right w:val="single" w:sz="4" w:space="0" w:color="auto"/>
+            </w:tcBorders>
+            <w:vAlign w:val="center"/>
+            <w:hideMark/>
+          </w:tcPr>
+          <w:p>
+            <w:pPr>
+              <w:jc w:val="center"/>
+              <w:rPr>
+                <w:b/>
+                <w:bCs/>
+                <w:color w:val="404040" w:themeColor="text1" w:themeTint="BF"/>
+              </w:rPr>
+            </w:pPr>
+            <w:r>
+              <w:rPr>
+                <w:b/>
+                <w:bCs/>
+                <w:color w:val="404040" w:themeColor="text1" w:themeTint="BF"/>
+              </w:rPr>
+              <w:t>Paramètres</w:t>
+            </w:r>
+          </w:p>
+        </w:tc>
+        <w:tc>
+          <w:tcPr>
+            <w:tcW w:w="0" w:type="auto"/>
+            <w:tcBorders>
+              <w:top w:val="single" w:sz="4" w:space="0" w:color="auto"/>
+              <w:left w:val="single" w:sz="4" w:space="0" w:color="auto"/>
+              <w:bottom w:val="single" w:sz="4" w:space="0" w:color="auto"/>
+              <w:right w:val="single" w:sz="4" w:space="0" w:color="auto"/>
+            </w:tcBorders>
+            <w:vAlign w:val="center"/>
+            <w:hideMark/>
+          </w:tcPr>
+          <w:p>
+            <w:pPr>
+              <w:jc w:val="center"/>
+              <w:rPr>
+                <w:b/>
+                <w:bCs/>
+                <w:color w:val="404040" w:themeColor="text1" w:themeTint="BF"/>
+              </w:rPr>
+            </w:pPr>
+            <w:r>
+              <w:rPr>
+                <w:b/>
+                <w:bCs/>
+                <w:color w:val="404040" w:themeColor="text1" w:themeTint="BF"/>
+              </w:rPr>
+              <w:t>Protection</w:t>
+            </w:r>
+          </w:p>
+        </w:tc>
+      </w:tr>
+      <w:tr>
+        <w:trPr>
+          <w:tblCellSpacing w:w="15" w:type="dxa"/>
+        </w:trPr>
+        <w:tc>
+          <w:tcPr>
+            <w:tcW w:w="0" w:type="auto"/>
+            <w:tcBorders>
+              <w:top w:val="single" w:sz="4" w:space="0" w:color="auto"/>
+              <w:left w:val="single" w:sz="4" w:space="0" w:color="auto"/>
+              <w:bottom w:val="single" w:sz="4" w:space="0" w:color="auto"/>
+              <w:right w:val="single" w:sz="4" w:space="0" w:color="auto"/>
+            </w:tcBorders>
+            <w:vAlign w:val="center"/>
+            <w:hideMark/>
+          </w:tcPr>
+          <w:p>
+            <w:pPr>
+              <w:jc w:val="center"/>
+              <w:rPr>
+                <w:color w:val="404040" w:themeColor="text1" w:themeTint="BF"/>
+              </w:rPr>
+            </w:pPr>
+            <w:r>
+              <w:rPr>
+                <w:color w:val="404040" w:themeColor="text1" w:themeTint="BF"/>
+              </w:rPr>
+              <w:t>Public</w:t>
+            </w:r>
+          </w:p>
+        </w:tc>
+        <w:tc>
+          <w:tcPr>
+            <w:tcW w:w="0" w:type="auto"/>
+            <w:tcBorders>
+              <w:top w:val="single" w:sz="4" w:space="0" w:color="auto"/>
+              <w:left w:val="single" w:sz="4" w:space="0" w:color="auto"/>
+              <w:bottom w:val="single" w:sz="4" w:space="0" w:color="auto"/>
+              <w:right w:val="single" w:sz="4" w:space="0" w:color="auto"/>
+            </w:tcBorders>
+            <w:vAlign w:val="center"/>
+            <w:hideMark/>
+          </w:tcPr>
+          <w:p>
+            <w:pPr>
+              <w:jc w:val="center"/>
+              <w:rPr>
+                <w:color w:val="404040" w:themeColor="text1" w:themeTint="BF"/>
+              </w:rPr>
+            </w:pPr>
+            <w:r>
+              <w:rPr>
+                <w:color w:val="404040" w:themeColor="text1" w:themeTint="BF"/>
+              </w:rPr>
+              <w:t>/</w:t>
+            </w:r>
+          </w:p>
+        </w:tc>
+        <w:tc>
+          <w:tcPr>
+            <w:tcW w:w="0" w:type="auto"/>
+            <w:tcBorders>
+              <w:top w:val="single" w:sz="4" w:space="0" w:color="auto"/>
+              <w:left w:val="single" w:sz="4" w:space="0" w:color="auto"/>
+              <w:bottom w:val="single" w:sz="4" w:space="0" w:color="auto"/>
+              <w:right w:val="single" w:sz="4" w:space="0" w:color="auto"/>
+            </w:tcBorders>
+            <w:vAlign w:val="center"/>
+            <w:hideMark/>
+          </w:tcPr>
+          <w:p>
+            <w:pPr>
+              <w:jc w:val="center"/>
+              <w:rPr>
+                <w:color w:val="404040" w:themeColor="text1" w:themeTint="BF"/>
+              </w:rPr>
+            </w:pPr>
+            <w:r>
+              <w:rPr>
+                <w:color w:val="404040" w:themeColor="text1" w:themeTint="BF"/>
+              </w:rPr>
+              <w:t>Landing page / page d’accueil</w:t>
+            </w:r>
+          </w:p>
+        </w:tc>
+        <w:tc>
+          <w:tcPr>
+            <w:tcW w:w="0" w:type="auto"/>
+            <w:tcBorders>
+              <w:top w:val="single" w:sz="4" w:space="0" w:color="auto"/>
+              <w:left w:val="single" w:sz="4" w:space="0" w:color="auto"/>
+              <w:bottom w:val="single" w:sz="4" w:space="0" w:color="auto"/>
+              <w:right w:val="single" w:sz="4" w:space="0" w:color="auto"/>
+            </w:tcBorders>
+            <w:vAlign w:val="center"/>
+            <w:hideMark/>
+          </w:tcPr>
+          <w:p>
+            <w:pPr>
+              <w:jc w:val="center"/>
+              <w:rPr>
+                <w:color w:val="404040" w:themeColor="text1" w:themeTint="BF"/>
+              </w:rPr>
+            </w:pPr>
+            <w:r>
+              <w:rPr>
+                <w:color w:val="404040" w:themeColor="text1" w:themeTint="BF"/>
+              </w:rPr>
+              <w:t>Aucun</w:t>
+            </w:r>
+          </w:p>
+        </w:tc>
+        <w:tc>
+          <w:tcPr>
+            <w:tcW w:w="0" w:type="auto"/>
+            <w:tcBorders>
+              <w:top w:val="single" w:sz="4" w:space="0" w:color="auto"/>
+              <w:left w:val="single" w:sz="4" w:space="0" w:color="auto"/>
+              <w:bottom w:val="single" w:sz="4" w:space="0" w:color="auto"/>
+              <w:right w:val="single" w:sz="4" w:space="0" w:color="auto"/>
+            </w:tcBorders>
+            <w:vAlign w:val="center"/>
+            <w:hideMark/>
+          </w:tcPr>
+          <w:p>
+            <w:pPr>
+              <w:jc w:val="center"/>
+              <w:rPr>
+                <w:color w:val="404040" w:themeColor="text1" w:themeTint="BF"/>
+              </w:rPr>
+            </w:pPr>
+            <w:r>
+              <w:rPr>
+                <w:color w:val="404040" w:themeColor="text1" w:themeTint="BF"/>
+              </w:rPr>
+              <w:t>Non</w:t>
+            </w:r>
+          </w:p>
+        </w:tc>
+      </w:tr>
+      <w:tr>
+        <w:trPr>
+          <w:tblCellSpacing w:w="15" w:type="dxa"/>
+        </w:trPr>
+        <w:tc>
+          <w:tcPr>
+            <w:tcW w:w="0" w:type="auto"/>
+            <w:tcBorders>
+              <w:top w:val="single" w:sz="4" w:space="0" w:color="auto"/>
+              <w:left w:val="single" w:sz="4" w:space="0" w:color="auto"/>
+              <w:bottom w:val="single" w:sz="4" w:space="0" w:color="auto"/>
+              <w:right w:val="single" w:sz="4" w:space="0" w:color="auto"/>
+            </w:tcBorders>
+            <w:vAlign w:val="center"/>
+            <w:hideMark/>
+          </w:tcPr>
+          <w:p>
+            <w:pPr>
+              <w:jc w:val="center"/>
+              <w:rPr>
+                <w:color w:val="404040" w:themeColor="text1" w:themeTint="BF"/>
+              </w:rPr>
+            </w:pPr>
+            <w:r>
+              <w:rPr>
+                <w:color w:val="404040" w:themeColor="text1" w:themeTint="BF"/>
+              </w:rPr>
+              <w:t>Public</w:t>
+            </w:r>
+          </w:p>
+        </w:tc>
+        <w:tc>
+          <w:tcPr>
+            <w:tcW w:w="0" w:type="auto"/>
+            <w:tcBorders>
+              <w:top w:val="single" w:sz="4" w:space="0" w:color="auto"/>
+              <w:left w:val="single" w:sz="4" w:space="0" w:color="auto"/>
+              <w:bottom w:val="single" w:sz="4" w:space="0" w:color="auto"/>
+              <w:right w:val="single" w:sz="4" w:space="0" w:color="auto"/>
+            </w:tcBorders>
+            <w:vAlign w:val="center"/>
+            <w:hideMark/>
+          </w:tcPr>
+          <w:p>
+            <w:pPr>
+              <w:jc w:val="center"/>
+              <w:rPr>
+                <w:color w:val="404040" w:themeColor="text1" w:themeTint="BF"/>
+              </w:rPr>
+            </w:pPr>
+            <w:r>
+              <w:rPr>
+                <w:color w:val="404040" w:themeColor="text1" w:themeTint="BF"/>
+              </w:rPr>
+              <w:t>/login</w:t>
+            </w:r>
+          </w:p>
+        </w:tc>
+        <w:tc>
+          <w:tcPr>
+            <w:tcW w:w="0" w:type="auto"/>
+            <w:tcBorders>
+              <w:top w:val="single" w:sz="4" w:space="0" w:color="auto"/>
+              <w:left w:val="single" w:sz="4" w:space="0" w:color="auto"/>
+              <w:bottom w:val="single" w:sz="4" w:space="0" w:color="auto"/>
+              <w:right w:val="single" w:sz="4" w:space="0" w:color="auto"/>
+            </w:tcBorders>
+            <w:vAlign w:val="center"/>
+            <w:hideMark/>
+          </w:tcPr>
+          <w:p>
+            <w:pPr>
+              <w:jc w:val="center"/>
+              <w:rPr>
+                <w:color w:val="404040" w:themeColor="text1" w:themeTint="BF"/>
+              </w:rPr>
+            </w:pPr>
+            <w:r>
+              <w:rPr>
+                <w:color w:val="404040" w:themeColor="text1" w:themeTint="BF"/>
+              </w:rPr>
+              <w:t>Connexion utilisateur</w:t>
+            </w:r>
+          </w:p>
+        </w:tc>
+        <w:tc>
+          <w:tcPr>
+            <w:tcW w:w="0" w:type="auto"/>
+            <w:tcBorders>
+              <w:top w:val="single" w:sz="4" w:space="0" w:color="auto"/>
+              <w:left w:val="single" w:sz="4" w:space="0" w:color="auto"/>
+              <w:bottom w:val="single" w:sz="4" w:space="0" w:color="auto"/>
+              <w:right w:val="single" w:sz="4" w:space="0" w:color="auto"/>
+            </w:tcBorders>
+            <w:vAlign w:val="center"/>
+            <w:hideMark/>
+          </w:tcPr>
+          <w:p>
+            <w:pPr>
+              <w:jc w:val="center"/>
+              <w:rPr>
+                <w:color w:val="404040" w:themeColor="text1" w:themeTint="BF"/>
+              </w:rPr>
+            </w:pPr>
+            <w:r>
+              <w:rPr>
+                <w:color w:val="404040" w:themeColor="text1" w:themeTint="BF"/>
+              </w:rPr>
+              <w:t>Aucun</w:t>
+            </w:r>
+          </w:p>
+        </w:tc>
+        <w:tc>
+          <w:tcPr>
+            <w:tcW w:w="0" w:type="auto"/>
+            <w:tcBorders>
+              <w:top w:val="single" w:sz="4" w:space="0" w:color="auto"/>
+              <w:left w:val="single" w:sz="4" w:space="0" w:color="auto"/>
+              <w:bottom w:val="single" w:sz="4" w:space="0" w:color="auto"/>
+              <w:right w:val="single" w:sz="4" w:space="0" w:color="auto"/>
+            </w:tcBorders>
+            <w:vAlign w:val="center"/>
+            <w:hideMark/>
+          </w:tcPr>
+          <w:p>
+            <w:pPr>
+              <w:jc w:val="center"/>
+              <w:rPr>
+                <w:color w:val="404040" w:themeColor="text1" w:themeTint="BF"/>
+              </w:rPr>
+            </w:pPr>
+            <w:r>
+              <w:rPr>
+                <w:color w:val="404040" w:themeColor="text1" w:themeTint="BF"/>
+              </w:rPr>
+              <w:t>Non</w:t>
+            </w:r>
+          </w:p>
+        </w:tc>
+      </w:tr>
+      <w:tr>
+        <w:trPr>
+          <w:tblCellSpacing w:w="15" w:type="dxa"/>
+        </w:trPr>
+        <w:tc>
+          <w:tcPr>
+            <w:tcW w:w="0" w:type="auto"/>
+            <w:tcBorders>
+              <w:top w:val="single" w:sz="4" w:space="0" w:color="auto"/>
+              <w:left w:val="single" w:sz="4" w:space="0" w:color="auto"/>
+              <w:bottom w:val="single" w:sz="4" w:space="0" w:color="auto"/>
+              <w:right w:val="single" w:sz="4" w:space="0" w:color="auto"/>
+            </w:tcBorders>
+            <w:vAlign w:val="center"/>
+            <w:hideMark/>
+          </w:tcPr>
+          <w:p>
+            <w:pPr>
+              <w:jc w:val="center"/>
+              <w:rPr>
+                <w:color w:val="404040" w:themeColor="text1" w:themeTint="BF"/>
+              </w:rPr>
+            </w:pPr>
+            <w:r>
+              <w:rPr>
+                <w:color w:val="404040" w:themeColor="text1" w:themeTint="BF"/>
+              </w:rPr>
+              <w:t>Public</w:t>
+            </w:r>
+          </w:p>
+        </w:tc>
+        <w:tc>
+          <w:tcPr>
+            <w:tcW w:w="0" w:type="auto"/>
+            <w:tcBorders>
+              <w:top w:val="single" w:sz="4" w:space="0" w:color="auto"/>
+              <w:left w:val="single" w:sz="4" w:space="0" w:color="auto"/>
+              <w:bottom w:val="single" w:sz="4" w:space="0" w:color="auto"/>
+              <w:right w:val="single" w:sz="4" w:space="0" w:color="auto"/>
+            </w:tcBorders>
+            <w:vAlign w:val="center"/>
+            <w:hideMark/>
+          </w:tcPr>
+          <w:p>
+            <w:pPr>
+              <w:jc w:val="center"/>
+              <w:rPr>
+                <w:color w:val="404040" w:themeColor="text1" w:themeTint="BF"/>
+              </w:rPr>
+            </w:pPr>
+            <w:r>
+              <w:rPr>
+                <w:color w:val="404040" w:themeColor="text1" w:themeTint="BF"/>
+              </w:rPr>
+              <w:t>/</w:t>
+            </w:r>
+            <w:proofErr w:type="spellStart"/>
+            <w:r>
+              <w:rPr>
+                <w:color w:val="404040" w:themeColor="text1" w:themeTint="BF"/>
+              </w:rPr>
+              <w:t>register</w:t>
+            </w:r>
+            <w:proofErr w:type="spellEnd"/>
+          </w:p>
+        </w:tc>
+        <w:tc>
+          <w:tcPr>
+            <w:tcW w:w="0" w:type="auto"/>
+            <w:tcBorders>
+              <w:top w:val="single" w:sz="4" w:space="0" w:color="auto"/>
+              <w:left w:val="single" w:sz="4" w:space="0" w:color="auto"/>
+              <w:bottom w:val="single" w:sz="4" w:space="0" w:color="auto"/>
+              <w:right w:val="single" w:sz="4" w:space="0" w:color="auto"/>
+            </w:tcBorders>
+            <w:vAlign w:val="center"/>
+            <w:hideMark/>
+          </w:tcPr>
+          <w:p>
+            <w:pPr>
+              <w:jc w:val="center"/>
+              <w:rPr>
+                <w:color w:val="404040" w:themeColor="text1" w:themeTint="BF"/>
+              </w:rPr>
+            </w:pPr>
+            <w:r>
+              <w:rPr>
+                <w:color w:val="404040" w:themeColor="text1" w:themeTint="BF"/>
+              </w:rPr>
+              <w:t>Inscription utilisateur</w:t>
+            </w:r>
+          </w:p>
+        </w:tc>
+        <w:tc>
+          <w:tcPr>
+            <w:tcW w:w="0" w:type="auto"/>
+            <w:tcBorders>
+              <w:top w:val="single" w:sz="4" w:space="0" w:color="auto"/>
+              <w:left w:val="single" w:sz="4" w:space="0" w:color="auto"/>
+              <w:bottom w:val="single" w:sz="4" w:space="0" w:color="auto"/>
+              <w:right w:val="single" w:sz="4" w:space="0" w:color="auto"/>
+            </w:tcBorders>
+            <w:vAlign w:val="center"/>
+            <w:hideMark/>
+          </w:tcPr>
+          <w:p>
+            <w:pPr>
+              <w:jc w:val="center"/>
+              <w:rPr>
+                <w:color w:val="404040" w:themeColor="text1" w:themeTint="BF"/>
+              </w:rPr>
+            </w:pPr>
+            <w:r>
+              <w:rPr>
+                <w:color w:val="404040" w:themeColor="text1" w:themeTint="BF"/>
+              </w:rPr>
+              <w:t>Aucun</w:t>
+            </w:r>
+          </w:p>
+        </w:tc>
+        <w:tc>
+          <w:tcPr>
+            <w:tcW w:w="0" w:type="auto"/>
+            <w:tcBorders>
+              <w:top w:val="single" w:sz="4" w:space="0" w:color="auto"/>
+              <w:left w:val="single" w:sz="4" w:space="0" w:color="auto"/>
+              <w:bottom w:val="single" w:sz="4" w:space="0" w:color="auto"/>
+              <w:right w:val="single" w:sz="4" w:space="0" w:color="auto"/>
+            </w:tcBorders>
+            <w:vAlign w:val="center"/>
+            <w:hideMark/>
+          </w:tcPr>
+          <w:p>
+            <w:pPr>
+              <w:jc w:val="center"/>
+              <w:rPr>
+                <w:color w:val="404040" w:themeColor="text1" w:themeTint="BF"/>
+              </w:rPr>
+            </w:pPr>
+            <w:r>
+              <w:rPr>
+                <w:color w:val="404040" w:themeColor="text1" w:themeTint="BF"/>
+              </w:rPr>
+              <w:t>Non</w:t>
+            </w:r>
+          </w:p>
+        </w:tc>
+      </w:tr>
+      <w:tr>
+        <w:trPr>
+          <w:tblCellSpacing w:w="15" w:type="dxa"/>
+        </w:trPr>
+        <w:tc>
+          <w:tcPr>
+            <w:tcW w:w="0" w:type="auto"/>
+            <w:tcBorders>
+              <w:top w:val="single" w:sz="4" w:space="0" w:color="auto"/>
+              <w:left w:val="single" w:sz="4" w:space="0" w:color="auto"/>
+              <w:bottom w:val="single" w:sz="4" w:space="0" w:color="auto"/>
+              <w:right w:val="single" w:sz="4" w:space="0" w:color="auto"/>
+            </w:tcBorders>
+            <w:vAlign w:val="center"/>
+            <w:hideMark/>
+          </w:tcPr>
+          <w:p>
+            <w:pPr>
+              <w:jc w:val="center"/>
+              <w:rPr>
+                <w:color w:val="404040" w:themeColor="text1" w:themeTint="BF"/>
+              </w:rPr>
+            </w:pPr>
+            <w:r>
+              <w:rPr>
+                <w:color w:val="404040" w:themeColor="text1" w:themeTint="BF"/>
+              </w:rPr>
+              <w:t>Public</w:t>
+            </w:r>
+          </w:p>
+        </w:tc>
+        <w:tc>
+          <w:tcPr>
+            <w:tcW w:w="0" w:type="auto"/>
+            <w:tcBorders>
+              <w:top w:val="single" w:sz="4" w:space="0" w:color="auto"/>
+              <w:left w:val="single" w:sz="4" w:space="0" w:color="auto"/>
+              <w:bottom w:val="single" w:sz="4" w:space="0" w:color="auto"/>
+              <w:right w:val="single" w:sz="4" w:space="0" w:color="auto"/>
+            </w:tcBorders>
+            <w:vAlign w:val="center"/>
+            <w:hideMark/>
+          </w:tcPr>
+          <w:p>
+            <w:pPr>
+              <w:jc w:val="center"/>
+              <w:rPr>
+                <w:color w:val="404040" w:themeColor="text1" w:themeTint="BF"/>
+              </w:rPr>
+            </w:pPr>
+            <w:r>
+              <w:rPr>
+                <w:color w:val="404040" w:themeColor="text1" w:themeTint="BF"/>
+              </w:rPr>
+              <w:t>/</w:t>
+            </w:r>
+            <w:proofErr w:type="spellStart"/>
+            <w:r>
+              <w:rPr>
+                <w:color w:val="404040" w:themeColor="text1" w:themeTint="BF"/>
+              </w:rPr>
+              <w:t>forgot-password</w:t>
+            </w:r>
+            <w:proofErr w:type="spellEnd"/>
+          </w:p>
+        </w:tc>
+        <w:tc>
+          <w:tcPr>
+            <w:tcW w:w="0" w:type="auto"/>
+            <w:tcBorders>
+              <w:top w:val="single" w:sz="4" w:space="0" w:color="auto"/>
+              <w:left w:val="single" w:sz="4" w:space="0" w:color="auto"/>
+              <w:bottom w:val="single" w:sz="4" w:space="0" w:color="auto"/>
+              <w:right w:val="single" w:sz="4" w:space="0" w:color="auto"/>
+            </w:tcBorders>
+            <w:vAlign w:val="center"/>
+            <w:hideMark/>
+          </w:tcPr>
+          <w:p>
+            <w:pPr>
+              <w:jc w:val="center"/>
+              <w:rPr>
+                <w:color w:val="404040" w:themeColor="text1" w:themeTint="BF"/>
+              </w:rPr>
+            </w:pPr>
+            <w:r>
+              <w:rPr>
+                <w:color w:val="404040" w:themeColor="text1" w:themeTint="BF"/>
+              </w:rPr>
+              <w:t>Demande de réinitialisation du mot de passe</w:t>
+            </w:r>
+          </w:p>
+        </w:tc>
+        <w:tc>
+          <w:tcPr>
+            <w:tcW w:w="0" w:type="auto"/>
+            <w:tcBorders>
+              <w:top w:val="single" w:sz="4" w:space="0" w:color="auto"/>
+              <w:left w:val="single" w:sz="4" w:space="0" w:color="auto"/>
+              <w:bottom w:val="single" w:sz="4" w:space="0" w:color="auto"/>
+              <w:right w:val="single" w:sz="4" w:space="0" w:color="auto"/>
+            </w:tcBorders>
+            <w:vAlign w:val="center"/>
+            <w:hideMark/>
+          </w:tcPr>
+          <w:p>
+            <w:pPr>
+              <w:jc w:val="center"/>
+              <w:rPr>
+                <w:color w:val="404040" w:themeColor="text1" w:themeTint="BF"/>
+              </w:rPr>
+            </w:pPr>
+            <w:r>
+              <w:rPr>
+                <w:color w:val="404040" w:themeColor="text1" w:themeTint="BF"/>
+              </w:rPr>
+              <w:t>Aucun</w:t>
+            </w:r>
+          </w:p>
+        </w:tc>
+        <w:tc>
+          <w:tcPr>
+            <w:tcW w:w="0" w:type="auto"/>
+            <w:tcBorders>
+              <w:top w:val="single" w:sz="4" w:space="0" w:color="auto"/>
+              <w:left w:val="single" w:sz="4" w:space="0" w:color="auto"/>
+              <w:bottom w:val="single" w:sz="4" w:space="0" w:color="auto"/>
+              <w:right w:val="single" w:sz="4" w:space="0" w:color="auto"/>
+            </w:tcBorders>
+            <w:vAlign w:val="center"/>
+            <w:hideMark/>
+          </w:tcPr>
+          <w:p>
+            <w:pPr>
+              <w:jc w:val="center"/>
+              <w:rPr>
+                <w:color w:val="404040" w:themeColor="text1" w:themeTint="BF"/>
+              </w:rPr>
+            </w:pPr>
+            <w:r>
+              <w:rPr>
+                <w:color w:val="404040" w:themeColor="text1" w:themeTint="BF"/>
+              </w:rPr>
+              <w:t>Non</w:t>
+            </w:r>
+          </w:p>
+        </w:tc>
+      </w:tr>
+      <w:tr>
+        <w:trPr>
+          <w:tblCellSpacing w:w="15" w:type="dxa"/>
+        </w:trPr>
+        <w:tc>
+          <w:tcPr>
+            <w:tcW w:w="0" w:type="auto"/>
+            <w:tcBorders>
+              <w:top w:val="single" w:sz="4" w:space="0" w:color="auto"/>
+              <w:left w:val="single" w:sz="4" w:space="0" w:color="auto"/>
+              <w:bottom w:val="single" w:sz="4" w:space="0" w:color="auto"/>
+              <w:right w:val="single" w:sz="4" w:space="0" w:color="auto"/>
+            </w:tcBorders>
+            <w:vAlign w:val="center"/>
+            <w:hideMark/>
+          </w:tcPr>
+          <w:p>
+            <w:pPr>
+              <w:jc w:val="center"/>
+              <w:rPr>
+                <w:color w:val="404040" w:themeColor="text1" w:themeTint="BF"/>
+              </w:rPr>
+            </w:pPr>
+            <w:r>
+              <w:rPr>
+                <w:color w:val="404040" w:themeColor="text1" w:themeTint="BF"/>
+              </w:rPr>
+              <w:t>Public</w:t>
+            </w:r>
+          </w:p>
+        </w:tc>
+        <w:tc>
+          <w:tcPr>
+            <w:tcW w:w="0" w:type="auto"/>
+            <w:tcBorders>
+              <w:top w:val="single" w:sz="4" w:space="0" w:color="auto"/>
+              <w:left w:val="single" w:sz="4" w:space="0" w:color="auto"/>
+              <w:bottom w:val="single" w:sz="4" w:space="0" w:color="auto"/>
+              <w:right w:val="single" w:sz="4" w:space="0" w:color="auto"/>
+            </w:tcBorders>
+            <w:vAlign w:val="center"/>
+            <w:hideMark/>
+          </w:tcPr>
+          <w:p>
+            <w:pPr>
+              <w:jc w:val="center"/>
+              <w:rPr>
+                <w:color w:val="404040" w:themeColor="text1" w:themeTint="BF"/>
+              </w:rPr>
+            </w:pPr>
+            <w:r>
+              <w:rPr>
+                <w:color w:val="404040" w:themeColor="text1" w:themeTint="BF"/>
+              </w:rPr>
+              <w:t>/reset-</w:t>
+            </w:r>
+            <w:proofErr w:type="spellStart"/>
+            <w:r>
+              <w:rPr>
+                <w:color w:val="404040" w:themeColor="text1" w:themeTint="BF"/>
+              </w:rPr>
+              <w:t>password</w:t>
+            </w:r>
+            <w:proofErr w:type="spellEnd"/>
+          </w:p>
+        </w:tc>
+        <w:tc>
+          <w:tcPr>
+            <w:tcW w:w="0" w:type="auto"/>
+            <w:tcBorders>
+              <w:top w:val="single" w:sz="4" w:space="0" w:color="auto"/>
+              <w:left w:val="single" w:sz="4" w:space="0" w:color="auto"/>
+              <w:bottom w:val="single" w:sz="4" w:space="0" w:color="auto"/>
+              <w:right w:val="single" w:sz="4" w:space="0" w:color="auto"/>
+            </w:tcBorders>
+            <w:vAlign w:val="center"/>
+            <w:hideMark/>
+          </w:tcPr>
+          <w:p>
+            <w:pPr>
+              <w:jc w:val="center"/>
+              <w:rPr>
+                <w:color w:val="404040" w:themeColor="text1" w:themeTint="BF"/>
+              </w:rPr>
+            </w:pPr>
+            <w:r>
+              <w:rPr>
+                <w:color w:val="404040" w:themeColor="text1" w:themeTint="BF"/>
+              </w:rPr>
+              <w:t>Réinitialisation du mot de passe</w:t>
+            </w:r>
+          </w:p>
+        </w:tc>
+        <w:tc>
+          <w:tcPr>
+            <w:tcW w:w="0" w:type="auto"/>
+            <w:tcBorders>
+              <w:top w:val="single" w:sz="4" w:space="0" w:color="auto"/>
+              <w:left w:val="single" w:sz="4" w:space="0" w:color="auto"/>
+              <w:bottom w:val="single" w:sz="4" w:space="0" w:color="auto"/>
+              <w:right w:val="single" w:sz="4" w:space="0" w:color="auto"/>
+            </w:tcBorders>
+            <w:vAlign w:val="center"/>
+            <w:hideMark/>
+          </w:tcPr>
+          <w:p>
+            <w:pPr>
+              <w:jc w:val="center"/>
+              <w:rPr>
+                <w:color w:val="404040" w:themeColor="text1" w:themeTint="BF"/>
+              </w:rPr>
+            </w:pPr>
+            <w:proofErr w:type="spellStart"/>
+            <w:r>
+              <w:rPr>
+                <w:color w:val="404040" w:themeColor="text1" w:themeTint="BF"/>
+              </w:rPr>
+              <w:t>Token</w:t>
+            </w:r>
+            <w:proofErr w:type="spellEnd"/>
+            <w:r>
+              <w:rPr>
+                <w:color w:val="404040" w:themeColor="text1" w:themeTint="BF"/>
+              </w:rPr>
+              <w:t xml:space="preserve"> éventuel</w:t>
+            </w:r>
+          </w:p>
+        </w:tc>
+        <w:tc>
+          <w:tcPr>
+            <w:tcW w:w="0" w:type="auto"/>
+            <w:tcBorders>
+              <w:top w:val="single" w:sz="4" w:space="0" w:color="auto"/>
+              <w:left w:val="single" w:sz="4" w:space="0" w:color="auto"/>
+              <w:bottom w:val="single" w:sz="4" w:space="0" w:color="auto"/>
+              <w:right w:val="single" w:sz="4" w:space="0" w:color="auto"/>
+            </w:tcBorders>
+            <w:vAlign w:val="center"/>
+            <w:hideMark/>
+          </w:tcPr>
+          <w:p>
+            <w:pPr>
+              <w:jc w:val="center"/>
+              <w:rPr>
+                <w:color w:val="404040" w:themeColor="text1" w:themeTint="BF"/>
+              </w:rPr>
+            </w:pPr>
+            <w:r>
+              <w:rPr>
+                <w:color w:val="404040" w:themeColor="text1" w:themeTint="BF"/>
+              </w:rPr>
+              <w:t>Non</w:t>
+            </w:r>
+          </w:p>
+        </w:tc>
+      </w:tr>
+      <w:tr>
+        <w:trPr>
+          <w:tblCellSpacing w:w="15" w:type="dxa"/>
+        </w:trPr>
+        <w:tc>
+          <w:tcPr>
+            <w:tcW w:w="0" w:type="auto"/>
+            <w:tcBorders>
+              <w:top w:val="single" w:sz="4" w:space="0" w:color="auto"/>
+              <w:left w:val="single" w:sz="4" w:space="0" w:color="auto"/>
+              <w:bottom w:val="single" w:sz="4" w:space="0" w:color="auto"/>
+              <w:right w:val="single" w:sz="4" w:space="0" w:color="auto"/>
+            </w:tcBorders>
+            <w:vAlign w:val="center"/>
+            <w:hideMark/>
+          </w:tcPr>
+          <w:p>
+            <w:pPr>
+              <w:jc w:val="center"/>
+              <w:rPr>
+                <w:color w:val="404040" w:themeColor="text1" w:themeTint="BF"/>
+              </w:rPr>
+            </w:pPr>
+            <w:r>
+              <w:rPr>
+                <w:color w:val="404040" w:themeColor="text1" w:themeTint="BF"/>
+              </w:rPr>
+              <w:lastRenderedPageBreak/>
+              <w:t>Authentifié</w:t>
+            </w:r>
+          </w:p>
+        </w:tc>
+        <w:tc>
+          <w:tcPr>
+            <w:tcW w:w="0" w:type="auto"/>
+            <w:tcBorders>
+              <w:top w:val="single" w:sz="4" w:space="0" w:color="auto"/>
+              <w:left w:val="single" w:sz="4" w:space="0" w:color="auto"/>
+              <w:bottom w:val="single" w:sz="4" w:space="0" w:color="auto"/>
+              <w:right w:val="single" w:sz="4" w:space="0" w:color="auto"/>
+            </w:tcBorders>
+            <w:vAlign w:val="center"/>
+            <w:hideMark/>
+          </w:tcPr>
+          <w:p>
+            <w:pPr>
+              <w:jc w:val="center"/>
+              <w:rPr>
+                <w:color w:val="404040" w:themeColor="text1" w:themeTint="BF"/>
+              </w:rPr>
+            </w:pPr>
+            <w:r>
+              <w:rPr>
+                <w:color w:val="404040" w:themeColor="text1" w:themeTint="BF"/>
+              </w:rPr>
+              <w:t>/</w:t>
+            </w:r>
+            <w:proofErr w:type="spellStart"/>
+            <w:r>
+              <w:rPr>
+                <w:color w:val="404040" w:themeColor="text1" w:themeTint="BF"/>
+              </w:rPr>
+              <w:t>dashboard</w:t>
+            </w:r>
+            <w:proofErr w:type="spellEnd"/>
+          </w:p>
+        </w:tc>
+        <w:tc>
+          <w:tcPr>
+            <w:tcW w:w="0" w:type="auto"/>
+            <w:tcBorders>
+              <w:top w:val="single" w:sz="4" w:space="0" w:color="auto"/>
+              <w:left w:val="single" w:sz="4" w:space="0" w:color="auto"/>
+              <w:bottom w:val="single" w:sz="4" w:space="0" w:color="auto"/>
+              <w:right w:val="single" w:sz="4" w:space="0" w:color="auto"/>
+            </w:tcBorders>
+            <w:vAlign w:val="center"/>
+            <w:hideMark/>
+          </w:tcPr>
+          <w:p>
+            <w:pPr>
+              <w:jc w:val="center"/>
+              <w:rPr>
+                <w:color w:val="404040" w:themeColor="text1" w:themeTint="BF"/>
+              </w:rPr>
+            </w:pPr>
+            <w:r>
+              <w:rPr>
+                <w:color w:val="404040" w:themeColor="text1" w:themeTint="BF"/>
+              </w:rPr>
+              <w:t>Tableau de bord utilisateur</w:t>
+            </w:r>
+          </w:p>
+        </w:tc>
+        <w:tc>
+          <w:tcPr>
+            <w:tcW w:w="0" w:type="auto"/>
+            <w:tcBorders>
+              <w:top w:val="single" w:sz="4" w:space="0" w:color="auto"/>
+              <w:left w:val="single" w:sz="4" w:space="0" w:color="auto"/>
+              <w:bottom w:val="single" w:sz="4" w:space="0" w:color="auto"/>
+              <w:right w:val="single" w:sz="4" w:space="0" w:color="auto"/>
+            </w:tcBorders>
+            <w:vAlign w:val="center"/>
+            <w:hideMark/>
+          </w:tcPr>
+          <w:p>
+            <w:pPr>
+              <w:jc w:val="center"/>
+              <w:rPr>
+                <w:color w:val="404040" w:themeColor="text1" w:themeTint="BF"/>
+              </w:rPr>
+            </w:pPr>
+            <w:r>
+              <w:rPr>
+                <w:color w:val="404040" w:themeColor="text1" w:themeTint="BF"/>
+              </w:rPr>
+              <w:t>Aucun</w:t>
+            </w:r>
+          </w:p>
+        </w:tc>
+        <w:tc>
+          <w:tcPr>
+            <w:tcW w:w="0" w:type="auto"/>
+            <w:tcBorders>
+              <w:top w:val="single" w:sz="4" w:space="0" w:color="auto"/>
+              <w:left w:val="single" w:sz="4" w:space="0" w:color="auto"/>
+              <w:bottom w:val="single" w:sz="4" w:space="0" w:color="auto"/>
+              <w:right w:val="single" w:sz="4" w:space="0" w:color="auto"/>
+            </w:tcBorders>
+            <w:vAlign w:val="center"/>
+            <w:hideMark/>
+          </w:tcPr>
+          <w:p>
+            <w:pPr>
+              <w:jc w:val="center"/>
+              <w:rPr>
+                <w:color w:val="404040" w:themeColor="text1" w:themeTint="BF"/>
+              </w:rPr>
+            </w:pPr>
+            <w:r>
+              <w:rPr>
+                <w:color w:val="404040" w:themeColor="text1" w:themeTint="BF"/>
+              </w:rPr>
+              <w:t>Oui</w:t>
+            </w:r>
+          </w:p>
+        </w:tc>
+      </w:tr>
+      <w:tr>
+        <w:trPr>
+          <w:tblCellSpacing w:w="15" w:type="dxa"/>
+        </w:trPr>
+        <w:tc>
+          <w:tcPr>
+            <w:tcW w:w="0" w:type="auto"/>
+            <w:tcBorders>
+              <w:top w:val="single" w:sz="4" w:space="0" w:color="auto"/>
+              <w:left w:val="single" w:sz="4" w:space="0" w:color="auto"/>
+              <w:bottom w:val="single" w:sz="4" w:space="0" w:color="auto"/>
+              <w:right w:val="single" w:sz="4" w:space="0" w:color="auto"/>
+            </w:tcBorders>
+            <w:vAlign w:val="center"/>
+            <w:hideMark/>
+          </w:tcPr>
+          <w:p>
+            <w:pPr>
+              <w:jc w:val="center"/>
+              <w:rPr>
+                <w:color w:val="404040" w:themeColor="text1" w:themeTint="BF"/>
+              </w:rPr>
+            </w:pPr>
+            <w:r>
+              <w:rPr>
+                <w:color w:val="404040" w:themeColor="text1" w:themeTint="BF"/>
+              </w:rPr>
+              <w:t>Authentifié</w:t>
+            </w:r>
+          </w:p>
+        </w:tc>
+        <w:tc>
+          <w:tcPr>
+            <w:tcW w:w="0" w:type="auto"/>
+            <w:tcBorders>
+              <w:top w:val="single" w:sz="4" w:space="0" w:color="auto"/>
+              <w:left w:val="single" w:sz="4" w:space="0" w:color="auto"/>
+              <w:bottom w:val="single" w:sz="4" w:space="0" w:color="auto"/>
+              <w:right w:val="single" w:sz="4" w:space="0" w:color="auto"/>
+            </w:tcBorders>
+            <w:vAlign w:val="center"/>
+            <w:hideMark/>
+          </w:tcPr>
+          <w:p>
+            <w:pPr>
+              <w:jc w:val="center"/>
+              <w:rPr>
+                <w:color w:val="404040" w:themeColor="text1" w:themeTint="BF"/>
+              </w:rPr>
+            </w:pPr>
+            <w:r>
+              <w:rPr>
+                <w:color w:val="404040" w:themeColor="text1" w:themeTint="BF"/>
+              </w:rPr>
+              <w:t>/</w:t>
+            </w:r>
+            <w:proofErr w:type="spellStart"/>
+            <w:r>
+              <w:rPr>
+                <w:color w:val="404040" w:themeColor="text1" w:themeTint="BF"/>
+              </w:rPr>
+              <w:t>appointments</w:t>
+            </w:r>
+            <w:proofErr w:type="spellEnd"/>
+            <w:proofErr w:type="gramStart"/>
+            <w:r>
+              <w:rPr>
+                <w:color w:val="404040" w:themeColor="text1" w:themeTint="BF"/>
+              </w:rPr>
+              <w:t>/:</w:t>
+            </w:r>
+            <w:proofErr w:type="gramEnd"/>
+            <w:r>
+              <w:rPr>
+                <w:color w:val="404040" w:themeColor="text1" w:themeTint="BF"/>
+              </w:rPr>
+              <w:t>id</w:t>
+            </w:r>
+          </w:p>
+        </w:tc>
+        <w:tc>
+          <w:tcPr>
+            <w:tcW w:w="0" w:type="auto"/>
+            <w:tcBorders>
+              <w:top w:val="single" w:sz="4" w:space="0" w:color="auto"/>
+              <w:left w:val="single" w:sz="4" w:space="0" w:color="auto"/>
+              <w:bottom w:val="single" w:sz="4" w:space="0" w:color="auto"/>
+              <w:right w:val="single" w:sz="4" w:space="0" w:color="auto"/>
+            </w:tcBorders>
+            <w:vAlign w:val="center"/>
+            <w:hideMark/>
+          </w:tcPr>
+          <w:p>
+            <w:pPr>
+              <w:jc w:val="center"/>
+              <w:rPr>
+                <w:color w:val="404040" w:themeColor="text1" w:themeTint="BF"/>
+              </w:rPr>
+            </w:pPr>
+            <w:r>
+              <w:rPr>
+                <w:color w:val="404040" w:themeColor="text1" w:themeTint="BF"/>
+              </w:rPr>
+              <w:t>Consultation d’un rendez-vous</w:t>
+            </w:r>
+          </w:p>
+        </w:tc>
+        <w:tc>
+          <w:tcPr>
+            <w:tcW w:w="0" w:type="auto"/>
+            <w:tcBorders>
+              <w:top w:val="single" w:sz="4" w:space="0" w:color="auto"/>
+              <w:left w:val="single" w:sz="4" w:space="0" w:color="auto"/>
+              <w:bottom w:val="single" w:sz="4" w:space="0" w:color="auto"/>
+              <w:right w:val="single" w:sz="4" w:space="0" w:color="auto"/>
+            </w:tcBorders>
+            <w:vAlign w:val="center"/>
+            <w:hideMark/>
+          </w:tcPr>
+          <w:p>
+            <w:pPr>
+              <w:jc w:val="center"/>
+              <w:rPr>
+                <w:color w:val="404040" w:themeColor="text1" w:themeTint="BF"/>
+              </w:rPr>
+            </w:pPr>
+            <w:proofErr w:type="gramStart"/>
+            <w:r>
+              <w:rPr>
+                <w:color w:val="404040" w:themeColor="text1" w:themeTint="BF"/>
+              </w:rPr>
+              <w:t>id</w:t>
+            </w:r>
+            <w:proofErr w:type="gramEnd"/>
+          </w:p>
+        </w:tc>
+        <w:tc>
+          <w:tcPr>
+            <w:tcW w:w="0" w:type="auto"/>
+            <w:tcBorders>
+              <w:top w:val="single" w:sz="4" w:space="0" w:color="auto"/>
+              <w:left w:val="single" w:sz="4" w:space="0" w:color="auto"/>
+              <w:bottom w:val="single" w:sz="4" w:space="0" w:color="auto"/>
+              <w:right w:val="single" w:sz="4" w:space="0" w:color="auto"/>
+            </w:tcBorders>
+            <w:vAlign w:val="center"/>
+            <w:hideMark/>
+          </w:tcPr>
+          <w:p>
+            <w:pPr>
+              <w:jc w:val="center"/>
+              <w:rPr>
+                <w:color w:val="404040" w:themeColor="text1" w:themeTint="BF"/>
+              </w:rPr>
+            </w:pPr>
+            <w:r>
+              <w:rPr>
+                <w:color w:val="404040" w:themeColor="text1" w:themeTint="BF"/>
+              </w:rPr>
+              <w:t>Oui</w:t>
+            </w:r>
+          </w:p>
+        </w:tc>
+      </w:tr>
+      <w:tr>
+        <w:trPr>
+          <w:tblCellSpacing w:w="15" w:type="dxa"/>
+        </w:trPr>
+        <w:tc>
+          <w:tcPr>
+            <w:tcW w:w="0" w:type="auto"/>
+            <w:tcBorders>
+              <w:top w:val="single" w:sz="4" w:space="0" w:color="auto"/>
+              <w:left w:val="single" w:sz="4" w:space="0" w:color="auto"/>
+              <w:bottom w:val="single" w:sz="4" w:space="0" w:color="auto"/>
+              <w:right w:val="single" w:sz="4" w:space="0" w:color="auto"/>
+            </w:tcBorders>
+            <w:vAlign w:val="center"/>
+            <w:hideMark/>
+          </w:tcPr>
+          <w:p>
+            <w:pPr>
+              <w:jc w:val="center"/>
+              <w:rPr>
+                <w:color w:val="404040" w:themeColor="text1" w:themeTint="BF"/>
+              </w:rPr>
+            </w:pPr>
+            <w:r>
+              <w:rPr>
+                <w:color w:val="404040" w:themeColor="text1" w:themeTint="BF"/>
+              </w:rPr>
+              <w:t>Authentifié</w:t>
+            </w:r>
+          </w:p>
+        </w:tc>
+        <w:tc>
+          <w:tcPr>
+            <w:tcW w:w="0" w:type="auto"/>
+            <w:tcBorders>
+              <w:top w:val="single" w:sz="4" w:space="0" w:color="auto"/>
+              <w:left w:val="single" w:sz="4" w:space="0" w:color="auto"/>
+              <w:bottom w:val="single" w:sz="4" w:space="0" w:color="auto"/>
+              <w:right w:val="single" w:sz="4" w:space="0" w:color="auto"/>
+            </w:tcBorders>
+            <w:vAlign w:val="center"/>
+            <w:hideMark/>
+          </w:tcPr>
+          <w:p>
+            <w:pPr>
+              <w:jc w:val="center"/>
+              <w:rPr>
+                <w:color w:val="404040" w:themeColor="text1" w:themeTint="BF"/>
+              </w:rPr>
+            </w:pPr>
+            <w:r>
+              <w:rPr>
+                <w:color w:val="404040" w:themeColor="text1" w:themeTint="BF"/>
+              </w:rPr>
+              <w:t>/</w:t>
+            </w:r>
+            <w:proofErr w:type="spellStart"/>
+            <w:r>
+              <w:rPr>
+                <w:color w:val="404040" w:themeColor="text1" w:themeTint="BF"/>
+              </w:rPr>
+              <w:t>appointments</w:t>
+            </w:r>
+            <w:proofErr w:type="spellEnd"/>
+            <w:proofErr w:type="gramStart"/>
+            <w:r>
+              <w:rPr>
+                <w:color w:val="404040" w:themeColor="text1" w:themeTint="BF"/>
+              </w:rPr>
+              <w:t>/:</w:t>
+            </w:r>
+            <w:proofErr w:type="gramEnd"/>
+            <w:r>
+              <w:rPr>
+                <w:color w:val="404040" w:themeColor="text1" w:themeTint="BF"/>
+              </w:rPr>
+              <w:t>id/</w:t>
+            </w:r>
+            <w:proofErr w:type="spellStart"/>
+            <w:r>
+              <w:rPr>
+                <w:color w:val="404040" w:themeColor="text1" w:themeTint="BF"/>
+              </w:rPr>
+              <w:t>edit</w:t>
+            </w:r>
+            <w:proofErr w:type="spellEnd"/>
+          </w:p>
+        </w:tc>
+        <w:tc>
+          <w:tcPr>
+            <w:tcW w:w="0" w:type="auto"/>
+            <w:tcBorders>
+              <w:top w:val="single" w:sz="4" w:space="0" w:color="auto"/>
+              <w:left w:val="single" w:sz="4" w:space="0" w:color="auto"/>
+              <w:bottom w:val="single" w:sz="4" w:space="0" w:color="auto"/>
+              <w:right w:val="single" w:sz="4" w:space="0" w:color="auto"/>
+            </w:tcBorders>
+            <w:vAlign w:val="center"/>
+            <w:hideMark/>
+          </w:tcPr>
+          <w:p>
+            <w:pPr>
+              <w:jc w:val="center"/>
+              <w:rPr>
+                <w:color w:val="404040" w:themeColor="text1" w:themeTint="BF"/>
+              </w:rPr>
+            </w:pPr>
+            <w:r>
+              <w:rPr>
+                <w:color w:val="404040" w:themeColor="text1" w:themeTint="BF"/>
+              </w:rPr>
+              <w:t>Modification d’un rendez-vous</w:t>
+            </w:r>
+          </w:p>
+        </w:tc>
+        <w:tc>
+          <w:tcPr>
+            <w:tcW w:w="0" w:type="auto"/>
+            <w:tcBorders>
+              <w:top w:val="single" w:sz="4" w:space="0" w:color="auto"/>
+              <w:left w:val="single" w:sz="4" w:space="0" w:color="auto"/>
+              <w:bottom w:val="single" w:sz="4" w:space="0" w:color="auto"/>
+              <w:right w:val="single" w:sz="4" w:space="0" w:color="auto"/>
+            </w:tcBorders>
+            <w:vAlign w:val="center"/>
+            <w:hideMark/>
+          </w:tcPr>
+          <w:p>
+            <w:pPr>
+              <w:jc w:val="center"/>
+              <w:rPr>
+                <w:color w:val="404040" w:themeColor="text1" w:themeTint="BF"/>
+              </w:rPr>
+            </w:pPr>
+            <w:proofErr w:type="gramStart"/>
+            <w:r>
+              <w:rPr>
+                <w:color w:val="404040" w:themeColor="text1" w:themeTint="BF"/>
+              </w:rPr>
+              <w:t>id</w:t>
+            </w:r>
+            <w:proofErr w:type="gramEnd"/>
+          </w:p>
+        </w:tc>
+        <w:tc>
+          <w:tcPr>
+            <w:tcW w:w="0" w:type="auto"/>
+            <w:tcBorders>
+              <w:top w:val="single" w:sz="4" w:space="0" w:color="auto"/>
+              <w:left w:val="single" w:sz="4" w:space="0" w:color="auto"/>
+              <w:bottom w:val="single" w:sz="4" w:space="0" w:color="auto"/>
+              <w:right w:val="single" w:sz="4" w:space="0" w:color="auto"/>
+            </w:tcBorders>
+            <w:vAlign w:val="center"/>
+            <w:hideMark/>
+          </w:tcPr>
+          <w:p>
+            <w:pPr>
+              <w:jc w:val="center"/>
+              <w:rPr>
+                <w:color w:val="404040" w:themeColor="text1" w:themeTint="BF"/>
+              </w:rPr>
+            </w:pPr>
+            <w:r>
+              <w:rPr>
+                <w:color w:val="404040" w:themeColor="text1" w:themeTint="BF"/>
+              </w:rPr>
+              <w:t>Oui</w:t>
+            </w:r>
+          </w:p>
+        </w:tc>
+      </w:tr>
+      <w:tr>
+        <w:trPr>
+          <w:tblCellSpacing w:w="15" w:type="dxa"/>
+        </w:trPr>
+        <w:tc>
+          <w:tcPr>
+            <w:tcW w:w="0" w:type="auto"/>
+            <w:tcBorders>
+              <w:top w:val="single" w:sz="4" w:space="0" w:color="auto"/>
+              <w:left w:val="single" w:sz="4" w:space="0" w:color="auto"/>
+              <w:bottom w:val="single" w:sz="4" w:space="0" w:color="auto"/>
+              <w:right w:val="single" w:sz="4" w:space="0" w:color="auto"/>
+            </w:tcBorders>
+            <w:vAlign w:val="center"/>
+            <w:hideMark/>
+          </w:tcPr>
+          <w:p>
+            <w:pPr>
+              <w:jc w:val="center"/>
+              <w:rPr>
+                <w:color w:val="404040" w:themeColor="text1" w:themeTint="BF"/>
+              </w:rPr>
+            </w:pPr>
+            <w:r>
+              <w:rPr>
+                <w:color w:val="404040" w:themeColor="text1" w:themeTint="BF"/>
+              </w:rPr>
+              <w:t>Authentifié</w:t>
+            </w:r>
+          </w:p>
+        </w:tc>
+        <w:tc>
+          <w:tcPr>
+            <w:tcW w:w="0" w:type="auto"/>
+            <w:tcBorders>
+              <w:top w:val="single" w:sz="4" w:space="0" w:color="auto"/>
+              <w:left w:val="single" w:sz="4" w:space="0" w:color="auto"/>
+              <w:bottom w:val="single" w:sz="4" w:space="0" w:color="auto"/>
+              <w:right w:val="single" w:sz="4" w:space="0" w:color="auto"/>
+            </w:tcBorders>
+            <w:vAlign w:val="center"/>
+            <w:hideMark/>
+          </w:tcPr>
+          <w:p>
+            <w:pPr>
+              <w:jc w:val="center"/>
+              <w:rPr>
+                <w:color w:val="404040" w:themeColor="text1" w:themeTint="BF"/>
+              </w:rPr>
+            </w:pPr>
+            <w:r>
+              <w:rPr>
+                <w:color w:val="404040" w:themeColor="text1" w:themeTint="BF"/>
+              </w:rPr>
+              <w:t>/</w:t>
+            </w:r>
+            <w:proofErr w:type="spellStart"/>
+            <w:r>
+              <w:rPr>
+                <w:color w:val="404040" w:themeColor="text1" w:themeTint="BF"/>
+              </w:rPr>
+              <w:t>booking</w:t>
+            </w:r>
+            <w:proofErr w:type="spellEnd"/>
+            <w:r>
+              <w:rPr>
+                <w:color w:val="404040" w:themeColor="text1" w:themeTint="BF"/>
+              </w:rPr>
+              <w:t>/formula</w:t>
+            </w:r>
+          </w:p>
+        </w:tc>
+        <w:tc>
+          <w:tcPr>
+            <w:tcW w:w="0" w:type="auto"/>
+            <w:tcBorders>
+              <w:top w:val="single" w:sz="4" w:space="0" w:color="auto"/>
+              <w:left w:val="single" w:sz="4" w:space="0" w:color="auto"/>
+              <w:bottom w:val="single" w:sz="4" w:space="0" w:color="auto"/>
+              <w:right w:val="single" w:sz="4" w:space="0" w:color="auto"/>
+            </w:tcBorders>
+            <w:vAlign w:val="center"/>
+            <w:hideMark/>
+          </w:tcPr>
+          <w:p>
+            <w:pPr>
+              <w:jc w:val="center"/>
+              <w:rPr>
+                <w:color w:val="404040" w:themeColor="text1" w:themeTint="BF"/>
+              </w:rPr>
+            </w:pPr>
+            <w:r>
+              <w:rPr>
+                <w:color w:val="404040" w:themeColor="text1" w:themeTint="BF"/>
+              </w:rPr>
+              <w:t>Choix de la formule</w:t>
+            </w:r>
+          </w:p>
+        </w:tc>
+        <w:tc>
+          <w:tcPr>
+            <w:tcW w:w="0" w:type="auto"/>
+            <w:tcBorders>
+              <w:top w:val="single" w:sz="4" w:space="0" w:color="auto"/>
+              <w:left w:val="single" w:sz="4" w:space="0" w:color="auto"/>
+              <w:bottom w:val="single" w:sz="4" w:space="0" w:color="auto"/>
+              <w:right w:val="single" w:sz="4" w:space="0" w:color="auto"/>
+            </w:tcBorders>
+            <w:vAlign w:val="center"/>
+            <w:hideMark/>
+          </w:tcPr>
+          <w:p>
+            <w:pPr>
+              <w:jc w:val="center"/>
+              <w:rPr>
+                <w:color w:val="404040" w:themeColor="text1" w:themeTint="BF"/>
+              </w:rPr>
+            </w:pPr>
+            <w:r>
+              <w:rPr>
+                <w:color w:val="404040" w:themeColor="text1" w:themeTint="BF"/>
+              </w:rPr>
+              <w:t>Aucun</w:t>
+            </w:r>
+          </w:p>
+        </w:tc>
+        <w:tc>
+          <w:tcPr>
+            <w:tcW w:w="0" w:type="auto"/>
+            <w:tcBorders>
+              <w:top w:val="single" w:sz="4" w:space="0" w:color="auto"/>
+              <w:left w:val="single" w:sz="4" w:space="0" w:color="auto"/>
+              <w:bottom w:val="single" w:sz="4" w:space="0" w:color="auto"/>
+              <w:right w:val="single" w:sz="4" w:space="0" w:color="auto"/>
+            </w:tcBorders>
+            <w:vAlign w:val="center"/>
+            <w:hideMark/>
+          </w:tcPr>
+          <w:p>
+            <w:pPr>
+              <w:jc w:val="center"/>
+              <w:rPr>
+                <w:color w:val="404040" w:themeColor="text1" w:themeTint="BF"/>
+              </w:rPr>
+            </w:pPr>
+            <w:r>
+              <w:rPr>
+                <w:color w:val="404040" w:themeColor="text1" w:themeTint="BF"/>
+              </w:rPr>
+              <w:t>Oui</w:t>
+            </w:r>
+          </w:p>
+        </w:tc>
+      </w:tr>
+      <w:tr>
+        <w:trPr>
+          <w:tblCellSpacing w:w="15" w:type="dxa"/>
+        </w:trPr>
+        <w:tc>
+          <w:tcPr>
+            <w:tcW w:w="0" w:type="auto"/>
+            <w:tcBorders>
+              <w:top w:val="single" w:sz="4" w:space="0" w:color="auto"/>
+              <w:left w:val="single" w:sz="4" w:space="0" w:color="auto"/>
+              <w:bottom w:val="single" w:sz="4" w:space="0" w:color="auto"/>
+              <w:right w:val="single" w:sz="4" w:space="0" w:color="auto"/>
+            </w:tcBorders>
+            <w:vAlign w:val="center"/>
+            <w:hideMark/>
+          </w:tcPr>
+          <w:p>
+            <w:pPr>
+              <w:jc w:val="center"/>
+              <w:rPr>
+                <w:color w:val="404040" w:themeColor="text1" w:themeTint="BF"/>
+              </w:rPr>
+            </w:pPr>
+            <w:r>
+              <w:rPr>
+                <w:color w:val="404040" w:themeColor="text1" w:themeTint="BF"/>
+              </w:rPr>
+              <w:t>Authentifié</w:t>
+            </w:r>
+          </w:p>
+        </w:tc>
+        <w:tc>
+          <w:tcPr>
+            <w:tcW w:w="0" w:type="auto"/>
+            <w:tcBorders>
+              <w:top w:val="single" w:sz="4" w:space="0" w:color="auto"/>
+              <w:left w:val="single" w:sz="4" w:space="0" w:color="auto"/>
+              <w:bottom w:val="single" w:sz="4" w:space="0" w:color="auto"/>
+              <w:right w:val="single" w:sz="4" w:space="0" w:color="auto"/>
+            </w:tcBorders>
+            <w:vAlign w:val="center"/>
+            <w:hideMark/>
+          </w:tcPr>
+          <w:p>
+            <w:pPr>
+              <w:jc w:val="center"/>
+              <w:rPr>
+                <w:color w:val="404040" w:themeColor="text1" w:themeTint="BF"/>
+              </w:rPr>
+            </w:pPr>
+            <w:r>
+              <w:rPr>
+                <w:color w:val="404040" w:themeColor="text1" w:themeTint="BF"/>
+              </w:rPr>
+              <w:t>/</w:t>
+            </w:r>
+            <w:proofErr w:type="spellStart"/>
+            <w:r>
+              <w:rPr>
+                <w:color w:val="404040" w:themeColor="text1" w:themeTint="BF"/>
+              </w:rPr>
+              <w:t>booking</w:t>
+            </w:r>
+            <w:proofErr w:type="spellEnd"/>
+            <w:r>
+              <w:rPr>
+                <w:color w:val="404040" w:themeColor="text1" w:themeTint="BF"/>
+              </w:rPr>
+              <w:t>/</w:t>
+            </w:r>
+            <w:proofErr w:type="spellStart"/>
+            <w:r>
+              <w:rPr>
+                <w:color w:val="404040" w:themeColor="text1" w:themeTint="BF"/>
+              </w:rPr>
+              <w:t>vehicle</w:t>
+            </w:r>
+            <w:proofErr w:type="spellEnd"/>
+          </w:p>
+        </w:tc>
+        <w:tc>
+          <w:tcPr>
+            <w:tcW w:w="0" w:type="auto"/>
+            <w:tcBorders>
+              <w:top w:val="single" w:sz="4" w:space="0" w:color="auto"/>
+              <w:left w:val="single" w:sz="4" w:space="0" w:color="auto"/>
+              <w:bottom w:val="single" w:sz="4" w:space="0" w:color="auto"/>
+              <w:right w:val="single" w:sz="4" w:space="0" w:color="auto"/>
+            </w:tcBorders>
+            <w:vAlign w:val="center"/>
+            <w:hideMark/>
+          </w:tcPr>
+          <w:p>
+            <w:pPr>
+              <w:jc w:val="center"/>
+              <w:rPr>
+                <w:color w:val="404040" w:themeColor="text1" w:themeTint="BF"/>
+              </w:rPr>
+            </w:pPr>
+            <w:r>
+              <w:rPr>
+                <w:color w:val="404040" w:themeColor="text1" w:themeTint="BF"/>
+              </w:rPr>
+              <w:t>Saisie ou choix du véhicule</w:t>
+            </w:r>
+          </w:p>
+        </w:tc>
+        <w:tc>
+          <w:tcPr>
+            <w:tcW w:w="0" w:type="auto"/>
+            <w:tcBorders>
+              <w:top w:val="single" w:sz="4" w:space="0" w:color="auto"/>
+              <w:left w:val="single" w:sz="4" w:space="0" w:color="auto"/>
+              <w:bottom w:val="single" w:sz="4" w:space="0" w:color="auto"/>
+              <w:right w:val="single" w:sz="4" w:space="0" w:color="auto"/>
+            </w:tcBorders>
+            <w:vAlign w:val="center"/>
+            <w:hideMark/>
+          </w:tcPr>
+          <w:p>
+            <w:pPr>
+              <w:jc w:val="center"/>
+              <w:rPr>
+                <w:color w:val="404040" w:themeColor="text1" w:themeTint="BF"/>
+              </w:rPr>
+            </w:pPr>
+            <w:r>
+              <w:rPr>
+                <w:color w:val="404040" w:themeColor="text1" w:themeTint="BF"/>
+              </w:rPr>
+              <w:t>Aucun</w:t>
+            </w:r>
+          </w:p>
+        </w:tc>
+        <w:tc>
+          <w:tcPr>
+            <w:tcW w:w="0" w:type="auto"/>
+            <w:tcBorders>
+              <w:top w:val="single" w:sz="4" w:space="0" w:color="auto"/>
+              <w:left w:val="single" w:sz="4" w:space="0" w:color="auto"/>
+              <w:bottom w:val="single" w:sz="4" w:space="0" w:color="auto"/>
+              <w:right w:val="single" w:sz="4" w:space="0" w:color="auto"/>
+            </w:tcBorders>
+            <w:vAlign w:val="center"/>
+            <w:hideMark/>
+          </w:tcPr>
+          <w:p>
+            <w:pPr>
+              <w:jc w:val="center"/>
+              <w:rPr>
+                <w:color w:val="404040" w:themeColor="text1" w:themeTint="BF"/>
+              </w:rPr>
+            </w:pPr>
+            <w:r>
+              <w:rPr>
+                <w:color w:val="404040" w:themeColor="text1" w:themeTint="BF"/>
+              </w:rPr>
+              <w:t>Oui</w:t>
+            </w:r>
+          </w:p>
+        </w:tc>
+      </w:tr>
+      <w:tr>
+        <w:trPr>
+          <w:tblCellSpacing w:w="15" w:type="dxa"/>
+        </w:trPr>
+        <w:tc>
+          <w:tcPr>
+            <w:tcW w:w="0" w:type="auto"/>
+            <w:tcBorders>
+              <w:top w:val="single" w:sz="4" w:space="0" w:color="auto"/>
+              <w:left w:val="single" w:sz="4" w:space="0" w:color="auto"/>
+              <w:bottom w:val="single" w:sz="4" w:space="0" w:color="auto"/>
+              <w:right w:val="single" w:sz="4" w:space="0" w:color="auto"/>
+            </w:tcBorders>
+            <w:vAlign w:val="center"/>
+            <w:hideMark/>
+          </w:tcPr>
+          <w:p>
+            <w:pPr>
+              <w:jc w:val="center"/>
+              <w:rPr>
+                <w:color w:val="404040" w:themeColor="text1" w:themeTint="BF"/>
+              </w:rPr>
+            </w:pPr>
+            <w:r>
+              <w:rPr>
+                <w:color w:val="404040" w:themeColor="text1" w:themeTint="BF"/>
+              </w:rPr>
+              <w:t>Authentifié</w:t>
+            </w:r>
+          </w:p>
+        </w:tc>
+        <w:tc>
+          <w:tcPr>
+            <w:tcW w:w="0" w:type="auto"/>
+            <w:tcBorders>
+              <w:top w:val="single" w:sz="4" w:space="0" w:color="auto"/>
+              <w:left w:val="single" w:sz="4" w:space="0" w:color="auto"/>
+              <w:bottom w:val="single" w:sz="4" w:space="0" w:color="auto"/>
+              <w:right w:val="single" w:sz="4" w:space="0" w:color="auto"/>
+            </w:tcBorders>
+            <w:vAlign w:val="center"/>
+            <w:hideMark/>
+          </w:tcPr>
+          <w:p>
+            <w:pPr>
+              <w:jc w:val="center"/>
+              <w:rPr>
+                <w:color w:val="404040" w:themeColor="text1" w:themeTint="BF"/>
+              </w:rPr>
+            </w:pPr>
+            <w:r>
+              <w:rPr>
+                <w:color w:val="404040" w:themeColor="text1" w:themeTint="BF"/>
+              </w:rPr>
+              <w:t>/</w:t>
+            </w:r>
+            <w:proofErr w:type="spellStart"/>
+            <w:r>
+              <w:rPr>
+                <w:color w:val="404040" w:themeColor="text1" w:themeTint="BF"/>
+              </w:rPr>
+              <w:t>booking</w:t>
+            </w:r>
+            <w:proofErr w:type="spellEnd"/>
+            <w:r>
+              <w:rPr>
+                <w:color w:val="404040" w:themeColor="text1" w:themeTint="BF"/>
+              </w:rPr>
+              <w:t>/slot</w:t>
+            </w:r>
+          </w:p>
+        </w:tc>
+        <w:tc>
+          <w:tcPr>
+            <w:tcW w:w="0" w:type="auto"/>
+            <w:tcBorders>
+              <w:top w:val="single" w:sz="4" w:space="0" w:color="auto"/>
+              <w:left w:val="single" w:sz="4" w:space="0" w:color="auto"/>
+              <w:bottom w:val="single" w:sz="4" w:space="0" w:color="auto"/>
+              <w:right w:val="single" w:sz="4" w:space="0" w:color="auto"/>
+            </w:tcBorders>
+            <w:vAlign w:val="center"/>
+            <w:hideMark/>
+          </w:tcPr>
+          <w:p>
+            <w:pPr>
+              <w:jc w:val="center"/>
+              <w:rPr>
+                <w:color w:val="404040" w:themeColor="text1" w:themeTint="BF"/>
+              </w:rPr>
+            </w:pPr>
+            <w:r>
+              <w:rPr>
+                <w:color w:val="404040" w:themeColor="text1" w:themeTint="BF"/>
+              </w:rPr>
+              <w:t>Sélection du créneau</w:t>
+            </w:r>
+          </w:p>
+        </w:tc>
+        <w:tc>
+          <w:tcPr>
+            <w:tcW w:w="0" w:type="auto"/>
+            <w:tcBorders>
+              <w:top w:val="single" w:sz="4" w:space="0" w:color="auto"/>
+              <w:left w:val="single" w:sz="4" w:space="0" w:color="auto"/>
+              <w:bottom w:val="single" w:sz="4" w:space="0" w:color="auto"/>
+              <w:right w:val="single" w:sz="4" w:space="0" w:color="auto"/>
+            </w:tcBorders>
+            <w:vAlign w:val="center"/>
+            <w:hideMark/>
+          </w:tcPr>
+          <w:p>
+            <w:pPr>
+              <w:jc w:val="center"/>
+              <w:rPr>
+                <w:color w:val="404040" w:themeColor="text1" w:themeTint="BF"/>
+              </w:rPr>
+            </w:pPr>
+            <w:r>
+              <w:rPr>
+                <w:color w:val="404040" w:themeColor="text1" w:themeTint="BF"/>
+              </w:rPr>
+              <w:t>Aucun</w:t>
+            </w:r>
+          </w:p>
+        </w:tc>
+        <w:tc>
+          <w:tcPr>
+            <w:tcW w:w="0" w:type="auto"/>
+            <w:tcBorders>
+              <w:top w:val="single" w:sz="4" w:space="0" w:color="auto"/>
+              <w:left w:val="single" w:sz="4" w:space="0" w:color="auto"/>
+              <w:bottom w:val="single" w:sz="4" w:space="0" w:color="auto"/>
+              <w:right w:val="single" w:sz="4" w:space="0" w:color="auto"/>
+            </w:tcBorders>
+            <w:vAlign w:val="center"/>
+            <w:hideMark/>
+          </w:tcPr>
+          <w:p>
+            <w:pPr>
+              <w:jc w:val="center"/>
+              <w:rPr>
+                <w:color w:val="404040" w:themeColor="text1" w:themeTint="BF"/>
+              </w:rPr>
+            </w:pPr>
+            <w:r>
+              <w:rPr>
+                <w:color w:val="404040" w:themeColor="text1" w:themeTint="BF"/>
+              </w:rPr>
+              <w:t>Oui</w:t>
+            </w:r>
+          </w:p>
+        </w:tc>
+      </w:tr>
+      <w:tr>
+        <w:trPr>
+          <w:tblCellSpacing w:w="15" w:type="dxa"/>
+        </w:trPr>
+        <w:tc>
+          <w:tcPr>
+            <w:tcW w:w="0" w:type="auto"/>
+            <w:tcBorders>
+              <w:top w:val="single" w:sz="4" w:space="0" w:color="auto"/>
+              <w:left w:val="single" w:sz="4" w:space="0" w:color="auto"/>
+              <w:bottom w:val="single" w:sz="4" w:space="0" w:color="auto"/>
+              <w:right w:val="single" w:sz="4" w:space="0" w:color="auto"/>
+            </w:tcBorders>
+            <w:vAlign w:val="center"/>
+            <w:hideMark/>
+          </w:tcPr>
+          <w:p>
+            <w:pPr>
+              <w:jc w:val="center"/>
+              <w:rPr>
+                <w:color w:val="404040" w:themeColor="text1" w:themeTint="BF"/>
+              </w:rPr>
+            </w:pPr>
+            <w:r>
+              <w:rPr>
+                <w:color w:val="404040" w:themeColor="text1" w:themeTint="BF"/>
+              </w:rPr>
+              <w:t>Authentifié</w:t>
+            </w:r>
+          </w:p>
+        </w:tc>
+        <w:tc>
+          <w:tcPr>
+            <w:tcW w:w="0" w:type="auto"/>
+            <w:tcBorders>
+              <w:top w:val="single" w:sz="4" w:space="0" w:color="auto"/>
+              <w:left w:val="single" w:sz="4" w:space="0" w:color="auto"/>
+              <w:bottom w:val="single" w:sz="4" w:space="0" w:color="auto"/>
+              <w:right w:val="single" w:sz="4" w:space="0" w:color="auto"/>
+            </w:tcBorders>
+            <w:vAlign w:val="center"/>
+            <w:hideMark/>
+          </w:tcPr>
+          <w:p>
+            <w:pPr>
+              <w:jc w:val="center"/>
+              <w:rPr>
+                <w:color w:val="404040" w:themeColor="text1" w:themeTint="BF"/>
+              </w:rPr>
+            </w:pPr>
+            <w:r>
+              <w:rPr>
+                <w:color w:val="404040" w:themeColor="text1" w:themeTint="BF"/>
+              </w:rPr>
+              <w:t>/</w:t>
+            </w:r>
+            <w:proofErr w:type="spellStart"/>
+            <w:r>
+              <w:rPr>
+                <w:color w:val="404040" w:themeColor="text1" w:themeTint="BF"/>
+              </w:rPr>
+              <w:t>booking</w:t>
+            </w:r>
+            <w:proofErr w:type="spellEnd"/>
+            <w:r>
+              <w:rPr>
+                <w:color w:val="404040" w:themeColor="text1" w:themeTint="BF"/>
+              </w:rPr>
+              <w:t>/</w:t>
+            </w:r>
+            <w:proofErr w:type="spellStart"/>
+            <w:r>
+              <w:rPr>
+                <w:color w:val="404040" w:themeColor="text1" w:themeTint="BF"/>
+              </w:rPr>
+              <w:t>recap</w:t>
+            </w:r>
+            <w:proofErr w:type="spellEnd"/>
+          </w:p>
+        </w:tc>
+        <w:tc>
+          <w:tcPr>
+            <w:tcW w:w="0" w:type="auto"/>
+            <w:tcBorders>
+              <w:top w:val="single" w:sz="4" w:space="0" w:color="auto"/>
+              <w:left w:val="single" w:sz="4" w:space="0" w:color="auto"/>
+              <w:bottom w:val="single" w:sz="4" w:space="0" w:color="auto"/>
+              <w:right w:val="single" w:sz="4" w:space="0" w:color="auto"/>
+            </w:tcBorders>
+            <w:vAlign w:val="center"/>
+            <w:hideMark/>
+          </w:tcPr>
+          <w:p>
+            <w:pPr>
+              <w:jc w:val="center"/>
+              <w:rPr>
+                <w:color w:val="404040" w:themeColor="text1" w:themeTint="BF"/>
+              </w:rPr>
+            </w:pPr>
+            <w:r>
+              <w:rPr>
+                <w:color w:val="404040" w:themeColor="text1" w:themeTint="BF"/>
+              </w:rPr>
+              <w:t>Récapitulatif de réservation</w:t>
+            </w:r>
+          </w:p>
+        </w:tc>
+        <w:tc>
+          <w:tcPr>
+            <w:tcW w:w="0" w:type="auto"/>
+            <w:tcBorders>
+              <w:top w:val="single" w:sz="4" w:space="0" w:color="auto"/>
+              <w:left w:val="single" w:sz="4" w:space="0" w:color="auto"/>
+              <w:bottom w:val="single" w:sz="4" w:space="0" w:color="auto"/>
+              <w:right w:val="single" w:sz="4" w:space="0" w:color="auto"/>
+            </w:tcBorders>
+            <w:vAlign w:val="center"/>
+            <w:hideMark/>
+          </w:tcPr>
+          <w:p>
+            <w:pPr>
+              <w:jc w:val="center"/>
+              <w:rPr>
+                <w:color w:val="404040" w:themeColor="text1" w:themeTint="BF"/>
+              </w:rPr>
+            </w:pPr>
+            <w:r>
+              <w:rPr>
+                <w:color w:val="404040" w:themeColor="text1" w:themeTint="BF"/>
+              </w:rPr>
+              <w:t>Aucun</w:t>
+            </w:r>
+          </w:p>
+        </w:tc>
+        <w:tc>
+          <w:tcPr>
+            <w:tcW w:w="0" w:type="auto"/>
+            <w:tcBorders>
+              <w:top w:val="single" w:sz="4" w:space="0" w:color="auto"/>
+              <w:left w:val="single" w:sz="4" w:space="0" w:color="auto"/>
+              <w:bottom w:val="single" w:sz="4" w:space="0" w:color="auto"/>
+              <w:right w:val="single" w:sz="4" w:space="0" w:color="auto"/>
+            </w:tcBorders>
+            <w:vAlign w:val="center"/>
+            <w:hideMark/>
+          </w:tcPr>
+          <w:p>
+            <w:pPr>
+              <w:jc w:val="center"/>
+              <w:rPr>
+                <w:color w:val="404040" w:themeColor="text1" w:themeTint="BF"/>
+              </w:rPr>
+            </w:pPr>
+            <w:r>
+              <w:rPr>
+                <w:color w:val="404040" w:themeColor="text1" w:themeTint="BF"/>
+              </w:rPr>
+              <w:t>Oui</w:t>
+            </w:r>
+          </w:p>
+        </w:tc>
+      </w:tr>
+      <w:tr>
+        <w:trPr>
+          <w:tblCellSpacing w:w="15" w:type="dxa"/>
+        </w:trPr>
+        <w:tc>
+          <w:tcPr>
+            <w:tcW w:w="0" w:type="auto"/>
+            <w:tcBorders>
+              <w:top w:val="single" w:sz="4" w:space="0" w:color="auto"/>
+              <w:left w:val="single" w:sz="4" w:space="0" w:color="auto"/>
+              <w:bottom w:val="single" w:sz="4" w:space="0" w:color="auto"/>
+              <w:right w:val="single" w:sz="4" w:space="0" w:color="auto"/>
+            </w:tcBorders>
+            <w:vAlign w:val="center"/>
+            <w:hideMark/>
+          </w:tcPr>
+          <w:p>
+            <w:pPr>
+              <w:jc w:val="center"/>
+              <w:rPr>
+                <w:color w:val="404040" w:themeColor="text1" w:themeTint="BF"/>
+              </w:rPr>
+            </w:pPr>
+            <w:r>
+              <w:rPr>
+                <w:color w:val="404040" w:themeColor="text1" w:themeTint="BF"/>
+              </w:rPr>
+              <w:t>Authentifié</w:t>
+            </w:r>
+          </w:p>
+        </w:tc>
+        <w:tc>
+          <w:tcPr>
+            <w:tcW w:w="0" w:type="auto"/>
+            <w:tcBorders>
+              <w:top w:val="single" w:sz="4" w:space="0" w:color="auto"/>
+              <w:left w:val="single" w:sz="4" w:space="0" w:color="auto"/>
+              <w:bottom w:val="single" w:sz="4" w:space="0" w:color="auto"/>
+              <w:right w:val="single" w:sz="4" w:space="0" w:color="auto"/>
+            </w:tcBorders>
+            <w:vAlign w:val="center"/>
+            <w:hideMark/>
+          </w:tcPr>
+          <w:p>
+            <w:pPr>
+              <w:jc w:val="center"/>
+              <w:rPr>
+                <w:color w:val="404040" w:themeColor="text1" w:themeTint="BF"/>
+              </w:rPr>
+            </w:pPr>
+            <w:r>
+              <w:rPr>
+                <w:color w:val="404040" w:themeColor="text1" w:themeTint="BF"/>
+              </w:rPr>
+              <w:t>/</w:t>
+            </w:r>
+            <w:proofErr w:type="spellStart"/>
+            <w:r>
+              <w:rPr>
+                <w:color w:val="404040" w:themeColor="text1" w:themeTint="BF"/>
+              </w:rPr>
+              <w:t>payment</w:t>
+            </w:r>
+            <w:proofErr w:type="spellEnd"/>
+          </w:p>
+        </w:tc>
+        <w:tc>
+          <w:tcPr>
+            <w:tcW w:w="0" w:type="auto"/>
+            <w:tcBorders>
+              <w:top w:val="single" w:sz="4" w:space="0" w:color="auto"/>
+              <w:left w:val="single" w:sz="4" w:space="0" w:color="auto"/>
+              <w:bottom w:val="single" w:sz="4" w:space="0" w:color="auto"/>
+              <w:right w:val="single" w:sz="4" w:space="0" w:color="auto"/>
+            </w:tcBorders>
+            <w:vAlign w:val="center"/>
+            <w:hideMark/>
+          </w:tcPr>
+          <w:p>
+            <w:pPr>
+              <w:jc w:val="center"/>
+              <w:rPr>
+                <w:color w:val="404040" w:themeColor="text1" w:themeTint="BF"/>
+              </w:rPr>
+            </w:pPr>
+            <w:r>
+              <w:rPr>
+                <w:color w:val="404040" w:themeColor="text1" w:themeTint="BF"/>
+              </w:rPr>
+              <w:t>Paiement de la réservation</w:t>
+            </w:r>
+          </w:p>
+        </w:tc>
+        <w:tc>
+          <w:tcPr>
+            <w:tcW w:w="0" w:type="auto"/>
+            <w:tcBorders>
+              <w:top w:val="single" w:sz="4" w:space="0" w:color="auto"/>
+              <w:left w:val="single" w:sz="4" w:space="0" w:color="auto"/>
+              <w:bottom w:val="single" w:sz="4" w:space="0" w:color="auto"/>
+              <w:right w:val="single" w:sz="4" w:space="0" w:color="auto"/>
+            </w:tcBorders>
+            <w:vAlign w:val="center"/>
+            <w:hideMark/>
+          </w:tcPr>
+          <w:p>
+            <w:pPr>
+              <w:jc w:val="center"/>
+              <w:rPr>
+                <w:color w:val="404040" w:themeColor="text1" w:themeTint="BF"/>
+              </w:rPr>
+            </w:pPr>
+            <w:r>
+              <w:rPr>
+                <w:color w:val="404040" w:themeColor="text1" w:themeTint="BF"/>
+              </w:rPr>
+              <w:t>Aucun</w:t>
+            </w:r>
+          </w:p>
+        </w:tc>
+        <w:tc>
+          <w:tcPr>
+            <w:tcW w:w="0" w:type="auto"/>
+            <w:tcBorders>
+              <w:top w:val="single" w:sz="4" w:space="0" w:color="auto"/>
+              <w:left w:val="single" w:sz="4" w:space="0" w:color="auto"/>
+              <w:bottom w:val="single" w:sz="4" w:space="0" w:color="auto"/>
+              <w:right w:val="single" w:sz="4" w:space="0" w:color="auto"/>
+            </w:tcBorders>
+            <w:vAlign w:val="center"/>
+            <w:hideMark/>
+          </w:tcPr>
+          <w:p>
+            <w:pPr>
+              <w:jc w:val="center"/>
+              <w:rPr>
+                <w:color w:val="404040" w:themeColor="text1" w:themeTint="BF"/>
+              </w:rPr>
+            </w:pPr>
+            <w:r>
+              <w:rPr>
+                <w:color w:val="404040" w:themeColor="text1" w:themeTint="BF"/>
+              </w:rPr>
+              <w:t>Oui</w:t>
+            </w:r>
+          </w:p>
+        </w:tc>
+      </w:tr>
+      <w:tr>
+        <w:trPr>
+          <w:tblCellSpacing w:w="15" w:type="dxa"/>
+        </w:trPr>
+        <w:tc>
+          <w:tcPr>
+            <w:tcW w:w="0" w:type="auto"/>
+            <w:tcBorders>
+              <w:top w:val="single" w:sz="4" w:space="0" w:color="auto"/>
+              <w:left w:val="single" w:sz="4" w:space="0" w:color="auto"/>
+              <w:bottom w:val="single" w:sz="4" w:space="0" w:color="auto"/>
+              <w:right w:val="single" w:sz="4" w:space="0" w:color="auto"/>
+            </w:tcBorders>
+            <w:vAlign w:val="center"/>
+            <w:hideMark/>
+          </w:tcPr>
+          <w:p>
+            <w:pPr>
+              <w:jc w:val="center"/>
+              <w:rPr>
+                <w:color w:val="404040" w:themeColor="text1" w:themeTint="BF"/>
+              </w:rPr>
+            </w:pPr>
+            <w:r>
+              <w:rPr>
+                <w:color w:val="404040" w:themeColor="text1" w:themeTint="BF"/>
+              </w:rPr>
+              <w:t>Authentifié</w:t>
+            </w:r>
+          </w:p>
+        </w:tc>
+        <w:tc>
+          <w:tcPr>
+            <w:tcW w:w="0" w:type="auto"/>
+            <w:tcBorders>
+              <w:top w:val="single" w:sz="4" w:space="0" w:color="auto"/>
+              <w:left w:val="single" w:sz="4" w:space="0" w:color="auto"/>
+              <w:bottom w:val="single" w:sz="4" w:space="0" w:color="auto"/>
+              <w:right w:val="single" w:sz="4" w:space="0" w:color="auto"/>
+            </w:tcBorders>
+            <w:vAlign w:val="center"/>
+            <w:hideMark/>
+          </w:tcPr>
+          <w:p>
+            <w:pPr>
+              <w:jc w:val="center"/>
+              <w:rPr>
+                <w:color w:val="404040" w:themeColor="text1" w:themeTint="BF"/>
+              </w:rPr>
+            </w:pPr>
+            <w:r>
+              <w:rPr>
+                <w:color w:val="404040" w:themeColor="text1" w:themeTint="BF"/>
+              </w:rPr>
+              <w:t>/</w:t>
+            </w:r>
+            <w:proofErr w:type="spellStart"/>
+            <w:r>
+              <w:rPr>
+                <w:color w:val="404040" w:themeColor="text1" w:themeTint="BF"/>
+              </w:rPr>
+              <w:t>payment</w:t>
+            </w:r>
+            <w:proofErr w:type="spellEnd"/>
+            <w:r>
+              <w:rPr>
+                <w:color w:val="404040" w:themeColor="text1" w:themeTint="BF"/>
+              </w:rPr>
+              <w:t>/</w:t>
+            </w:r>
+            <w:proofErr w:type="spellStart"/>
+            <w:r>
+              <w:rPr>
+                <w:color w:val="404040" w:themeColor="text1" w:themeTint="BF"/>
+              </w:rPr>
+              <w:t>success</w:t>
+            </w:r>
+            <w:proofErr w:type="spellEnd"/>
+          </w:p>
+        </w:tc>
+        <w:tc>
+          <w:tcPr>
+            <w:tcW w:w="0" w:type="auto"/>
+            <w:tcBorders>
+              <w:top w:val="single" w:sz="4" w:space="0" w:color="auto"/>
+              <w:left w:val="single" w:sz="4" w:space="0" w:color="auto"/>
+              <w:bottom w:val="single" w:sz="4" w:space="0" w:color="auto"/>
+              <w:right w:val="single" w:sz="4" w:space="0" w:color="auto"/>
+            </w:tcBorders>
+            <w:vAlign w:val="center"/>
+            <w:hideMark/>
+          </w:tcPr>
+          <w:p>
+            <w:pPr>
+              <w:jc w:val="center"/>
+              <w:rPr>
+                <w:color w:val="404040" w:themeColor="text1" w:themeTint="BF"/>
+              </w:rPr>
+            </w:pPr>
+            <w:r>
+              <w:rPr>
+                <w:color w:val="404040" w:themeColor="text1" w:themeTint="BF"/>
+              </w:rPr>
+              <w:t>Confirmation du paiement</w:t>
+            </w:r>
+          </w:p>
+        </w:tc>
+        <w:tc>
+          <w:tcPr>
+            <w:tcW w:w="0" w:type="auto"/>
+            <w:tcBorders>
+              <w:top w:val="single" w:sz="4" w:space="0" w:color="auto"/>
+              <w:left w:val="single" w:sz="4" w:space="0" w:color="auto"/>
+              <w:bottom w:val="single" w:sz="4" w:space="0" w:color="auto"/>
+              <w:right w:val="single" w:sz="4" w:space="0" w:color="auto"/>
+            </w:tcBorders>
+            <w:vAlign w:val="center"/>
+            <w:hideMark/>
+          </w:tcPr>
+          <w:p>
+            <w:pPr>
+              <w:jc w:val="center"/>
+              <w:rPr>
+                <w:color w:val="404040" w:themeColor="text1" w:themeTint="BF"/>
+              </w:rPr>
+            </w:pPr>
+            <w:r>
+              <w:rPr>
+                <w:color w:val="404040" w:themeColor="text1" w:themeTint="BF"/>
+              </w:rPr>
+              <w:t>Aucun</w:t>
+            </w:r>
+          </w:p>
+        </w:tc>
+        <w:tc>
+          <w:tcPr>
+            <w:tcW w:w="0" w:type="auto"/>
+            <w:tcBorders>
+              <w:top w:val="single" w:sz="4" w:space="0" w:color="auto"/>
+              <w:left w:val="single" w:sz="4" w:space="0" w:color="auto"/>
+              <w:bottom w:val="single" w:sz="4" w:space="0" w:color="auto"/>
+              <w:right w:val="single" w:sz="4" w:space="0" w:color="auto"/>
+            </w:tcBorders>
+            <w:vAlign w:val="center"/>
+            <w:hideMark/>
+          </w:tcPr>
+          <w:p>
+            <w:pPr>
+              <w:jc w:val="center"/>
+              <w:rPr>
+                <w:color w:val="404040" w:themeColor="text1" w:themeTint="BF"/>
+              </w:rPr>
+            </w:pPr>
+            <w:r>
+              <w:rPr>
+                <w:color w:val="404040" w:themeColor="text1" w:themeTint="BF"/>
+              </w:rPr>
+              <w:t>Oui</w:t>
+            </w:r>
+          </w:p>
+        </w:tc>
+      </w:tr>
+      <w:tr>
+        <w:trPr>
+          <w:tblCellSpacing w:w="15" w:type="dxa"/>
+        </w:trPr>
+        <w:tc>
+          <w:tcPr>
+            <w:tcW w:w="0" w:type="auto"/>
+            <w:tcBorders>
+              <w:top w:val="single" w:sz="4" w:space="0" w:color="auto"/>
+              <w:left w:val="single" w:sz="4" w:space="0" w:color="auto"/>
+              <w:bottom w:val="single" w:sz="4" w:space="0" w:color="auto"/>
+              <w:right w:val="single" w:sz="4" w:space="0" w:color="auto"/>
+            </w:tcBorders>
+            <w:vAlign w:val="center"/>
+            <w:hideMark/>
+          </w:tcPr>
+          <w:p>
+            <w:pPr>
+              <w:jc w:val="center"/>
+              <w:rPr>
+                <w:color w:val="404040" w:themeColor="text1" w:themeTint="BF"/>
+              </w:rPr>
+            </w:pPr>
+            <w:r>
+              <w:rPr>
+                <w:color w:val="404040" w:themeColor="text1" w:themeTint="BF"/>
+              </w:rPr>
+              <w:t>Authentifié</w:t>
+            </w:r>
+          </w:p>
+        </w:tc>
+        <w:tc>
+          <w:tcPr>
+            <w:tcW w:w="0" w:type="auto"/>
+            <w:tcBorders>
+              <w:top w:val="single" w:sz="4" w:space="0" w:color="auto"/>
+              <w:left w:val="single" w:sz="4" w:space="0" w:color="auto"/>
+              <w:bottom w:val="single" w:sz="4" w:space="0" w:color="auto"/>
+              <w:right w:val="single" w:sz="4" w:space="0" w:color="auto"/>
+            </w:tcBorders>
+            <w:vAlign w:val="center"/>
+            <w:hideMark/>
+          </w:tcPr>
+          <w:p>
+            <w:pPr>
+              <w:jc w:val="center"/>
+              <w:rPr>
+                <w:color w:val="404040" w:themeColor="text1" w:themeTint="BF"/>
+              </w:rPr>
+            </w:pPr>
+            <w:r>
+              <w:rPr>
+                <w:color w:val="404040" w:themeColor="text1" w:themeTint="BF"/>
+              </w:rPr>
+              <w:t>/</w:t>
+            </w:r>
+            <w:proofErr w:type="spellStart"/>
+            <w:r>
+              <w:rPr>
+                <w:color w:val="404040" w:themeColor="text1" w:themeTint="BF"/>
+              </w:rPr>
+              <w:t>payment</w:t>
+            </w:r>
+            <w:proofErr w:type="spellEnd"/>
+            <w:r>
+              <w:rPr>
+                <w:color w:val="404040" w:themeColor="text1" w:themeTint="BF"/>
+              </w:rPr>
+              <w:t>/</w:t>
+            </w:r>
+            <w:proofErr w:type="spellStart"/>
+            <w:r>
+              <w:rPr>
+                <w:color w:val="404040" w:themeColor="text1" w:themeTint="BF"/>
+              </w:rPr>
+              <w:t>failed</w:t>
+            </w:r>
+            <w:proofErr w:type="spellEnd"/>
+          </w:p>
+        </w:tc>
+        <w:tc>
+          <w:tcPr>
+            <w:tcW w:w="0" w:type="auto"/>
+            <w:tcBorders>
+              <w:top w:val="single" w:sz="4" w:space="0" w:color="auto"/>
+              <w:left w:val="single" w:sz="4" w:space="0" w:color="auto"/>
+              <w:bottom w:val="single" w:sz="4" w:space="0" w:color="auto"/>
+              <w:right w:val="single" w:sz="4" w:space="0" w:color="auto"/>
+            </w:tcBorders>
+            <w:vAlign w:val="center"/>
+            <w:hideMark/>
+          </w:tcPr>
+          <w:p>
+            <w:pPr>
+              <w:jc w:val="center"/>
+              <w:rPr>
+                <w:color w:val="404040" w:themeColor="text1" w:themeTint="BF"/>
+              </w:rPr>
+            </w:pPr>
+            <w:r>
+              <w:rPr>
+                <w:color w:val="404040" w:themeColor="text1" w:themeTint="BF"/>
+              </w:rPr>
+              <w:t>Échec du paiement</w:t>
+            </w:r>
+          </w:p>
+        </w:tc>
+        <w:tc>
+          <w:tcPr>
+            <w:tcW w:w="0" w:type="auto"/>
+            <w:tcBorders>
+              <w:top w:val="single" w:sz="4" w:space="0" w:color="auto"/>
+              <w:left w:val="single" w:sz="4" w:space="0" w:color="auto"/>
+              <w:bottom w:val="single" w:sz="4" w:space="0" w:color="auto"/>
+              <w:right w:val="single" w:sz="4" w:space="0" w:color="auto"/>
+            </w:tcBorders>
+            <w:vAlign w:val="center"/>
+            <w:hideMark/>
+          </w:tcPr>
+          <w:p>
+            <w:pPr>
+              <w:jc w:val="center"/>
+              <w:rPr>
+                <w:color w:val="404040" w:themeColor="text1" w:themeTint="BF"/>
+              </w:rPr>
+            </w:pPr>
+            <w:r>
+              <w:rPr>
+                <w:color w:val="404040" w:themeColor="text1" w:themeTint="BF"/>
+              </w:rPr>
+              <w:t>Aucun</w:t>
+            </w:r>
+          </w:p>
+        </w:tc>
+        <w:tc>
+          <w:tcPr>
+            <w:tcW w:w="0" w:type="auto"/>
+            <w:tcBorders>
+              <w:top w:val="single" w:sz="4" w:space="0" w:color="auto"/>
+              <w:left w:val="single" w:sz="4" w:space="0" w:color="auto"/>
+              <w:bottom w:val="single" w:sz="4" w:space="0" w:color="auto"/>
+              <w:right w:val="single" w:sz="4" w:space="0" w:color="auto"/>
+            </w:tcBorders>
+            <w:vAlign w:val="center"/>
+            <w:hideMark/>
+          </w:tcPr>
+          <w:p>
+            <w:pPr>
+              <w:jc w:val="center"/>
+              <w:rPr>
+                <w:color w:val="404040" w:themeColor="text1" w:themeTint="BF"/>
+              </w:rPr>
+            </w:pPr>
+            <w:r>
+              <w:rPr>
+                <w:color w:val="404040" w:themeColor="text1" w:themeTint="BF"/>
+              </w:rPr>
+              <w:t>Oui</w:t>
+            </w:r>
+          </w:p>
+        </w:tc>
+      </w:tr>
+    </w:tbl>
+    <w:p>
+      <w:pPr>
+        <w:rPr>
+          <w:color w:val="404040" w:themeColor="text1" w:themeTint="BF"/>
+          <w:lang w:val="en-GB"/>
+        </w:rPr>
+      </w:pPr>
+    </w:p>
+    <w:p>
+      <w:pPr>
+        <w:rPr>
+          <w:color w:val="404040" w:themeColor="text1" w:themeTint="BF"/>
+          <w:lang w:val="en-GB"/>
+        </w:rPr>
+      </w:pPr>
+    </w:p>
+    <w:p>
+      <w:pPr>
+        <w:rPr>
+          <w:color w:val="404040" w:themeColor="text1" w:themeTint="BF"/>
+          <w:lang w:val="en-GB"/>
+        </w:rPr>
+      </w:pPr>
+    </w:p>
+    <w:p>
+      <w:pPr>
+        <w:rPr>
+          <w:color w:val="404040" w:themeColor="text1" w:themeTint="BF"/>
+          <w:lang w:val="en-GB"/>
+        </w:rPr>
+      </w:pPr>
+    </w:p>
+    <w:p>
+      <w:pPr>
+        <w:rPr>
+          <w:color w:val="404040" w:themeColor="text1" w:themeTint="BF"/>
+          <w:lang w:val="en-GB"/>
+        </w:rPr>
+      </w:pPr>
+    </w:p>
+    <w:p>
+      <w:pPr>
+        <w:rPr>
+          <w:color w:val="404040" w:themeColor="text1" w:themeTint="BF"/>
+          <w:lang w:val="en-GB"/>
+        </w:rPr>
+      </w:pPr>
+    </w:p>
+    <w:p>
+      <w:pPr>
+        <w:rPr>
+          <w:color w:val="404040" w:themeColor="text1" w:themeTint="BF"/>
+          <w:lang w:val="en-GB"/>
+        </w:rPr>
+      </w:pPr>
+    </w:p>
+    <w:p>
+      <w:pPr>
+        <w:rPr>
+          <w:color w:val="404040" w:themeColor="text1" w:themeTint="BF"/>
+          <w:lang w:val="en-GB"/>
+        </w:rPr>
+      </w:pPr>
+    </w:p>
+    <w:p>
+      <w:pPr>
+        <w:rPr>
+          <w:color w:val="404040" w:themeColor="text1" w:themeTint="BF"/>
+          <w:lang w:val="en-GB"/>
+        </w:rPr>
+      </w:pPr>
+    </w:p>
+    <w:p>
+      <w:pPr>
+        <w:rPr>
+          <w:color w:val="404040" w:themeColor="text1" w:themeTint="BF"/>
+          <w:lang w:val="en-GB"/>
+        </w:rPr>
+      </w:pPr>
+    </w:p>
+    <w:p>
+      <w:pPr>
+        <w:rPr>
+          <w:color w:val="404040" w:themeColor="text1" w:themeTint="BF"/>
+          <w:lang w:val="en-GB"/>
+        </w:rPr>
+      </w:pPr>
+    </w:p>
+    <w:p>
+      <w:pPr>
+        <w:rPr>
+          <w:color w:val="404040" w:themeColor="text1" w:themeTint="BF"/>
+          <w:lang w:val="en-GB"/>
+        </w:rPr>
+      </w:pPr>
+    </w:p>
+    <w:p>
+      <w:pPr>
+        <w:rPr>
+          <w:color w:val="404040" w:themeColor="text1" w:themeTint="BF"/>
+          <w:lang w:val="en-GB"/>
+        </w:rPr>
+      </w:pPr>
+    </w:p>
+    <w:p>
+      <w:pPr>
+        <w:rPr>
+          <w:color w:val="404040" w:themeColor="text1" w:themeTint="BF"/>
+          <w:lang w:val="en-GB"/>
+        </w:rPr>
+      </w:pPr>
+    </w:p>
+    <w:p>
+      <w:pPr>
+        <w:rPr>
+          <w:color w:val="404040" w:themeColor="text1" w:themeTint="BF"/>
+          <w:lang w:val="en-GB"/>
+        </w:rPr>
+      </w:pPr>
+    </w:p>
+    <w:p>
+      <w:pPr>
+        <w:rPr>
+          <w:color w:val="404040" w:themeColor="text1" w:themeTint="BF"/>
+          <w:lang w:val="en-GB"/>
+        </w:rPr>
+      </w:pPr>
+    </w:p>
+    <w:p>
+      <w:pPr>
+        <w:rPr>
+          <w:color w:val="404040" w:themeColor="text1" w:themeTint="BF"/>
+          <w:lang w:val="en-GB"/>
+        </w:rPr>
+      </w:pPr>
+    </w:p>
+    <w:p>
+      <w:pPr>
+        <w:rPr>
+          <w:color w:val="404040" w:themeColor="text1" w:themeTint="BF"/>
+          <w:lang w:val="en-GB"/>
+        </w:rPr>
+      </w:pPr>
+    </w:p>
+    <w:p>
+      <w:pPr>
+        <w:rPr>
+          <w:color w:val="404040" w:themeColor="text1" w:themeTint="BF"/>
+          <w:lang w:val="en-GB"/>
+        </w:rPr>
+      </w:pPr>
+    </w:p>
+    <w:p>
+      <w:pPr>
+        <w:rPr>
+          <w:color w:val="404040" w:themeColor="text1" w:themeTint="BF"/>
+          <w:lang w:val="en-GB"/>
+        </w:rPr>
+      </w:pPr>
+    </w:p>
+    <w:p>
+      <w:pPr>
+        <w:rPr>
+          <w:color w:val="404040" w:themeColor="text1" w:themeTint="BF"/>
+          <w:lang w:val="en-GB"/>
+        </w:rPr>
+      </w:pPr>
+    </w:p>
+    <w:p>
+      <w:pPr>
+        <w:rPr>
+          <w:color w:val="404040" w:themeColor="text1" w:themeTint="BF"/>
+          <w:lang w:val="en-GB"/>
+        </w:rPr>
+      </w:pPr>
+    </w:p>
+    <w:p>
+      <w:pPr>
+        <w:rPr>
+          <w:color w:val="404040" w:themeColor="text1" w:themeTint="BF"/>
+          <w:lang w:val="en-GB"/>
+        </w:rPr>
+      </w:pPr>
+    </w:p>
+    <w:p>
+      <w:pPr>
+        <w:rPr>
+          <w:color w:val="404040" w:themeColor="text1" w:themeTint="BF"/>
+          <w:lang w:val="en-GB"/>
+        </w:rPr>
+      </w:pPr>
+    </w:p>
+    <w:p>
       <w:r>
         <w:t>//Todo</w:t>
       </w:r>
@@ -1378,8 +4193,8 @@
         <w:rPr>
           <w:color w:val="404040" w:themeColor="text1" w:themeTint="BF"/>
         </w:rPr>
-        <w:pict w14:anchorId="2953881D">
-          <v:rect id="_x0000_i1110" style="width:0;height:1.5pt" o:hralign="center" o:hrstd="t" o:hr="t" fillcolor="#a0a0a0" stroked="f"/>
+        <w:pict w14:anchorId="1402D3CD">
+          <v:rect id="_x0000_i1037" style="width:0;height:1.5pt" o:hralign="center" o:hrstd="t" o:hr="t" fillcolor="#a0a0a0" stroked="f"/>
         </w:pict>
       </w:r>
     </w:p>
@@ -1572,6 +4387,7 @@
           <w:bCs/>
           <w:color w:val="404040" w:themeColor="text1" w:themeTint="BF"/>
         </w:rPr>
+        <w:lastRenderedPageBreak/>
         <w:t>7.3 Principes</w:t>
       </w:r>
     </w:p>
@@ -1636,8 +4452,8 @@
         <w:rPr>
           <w:color w:val="404040" w:themeColor="text1" w:themeTint="BF"/>
         </w:rPr>
-        <w:pict w14:anchorId="049985FF">
-          <v:rect id="_x0000_i1111" style="width:0;height:1.5pt" o:hralign="center" o:hrstd="t" o:hr="t" fillcolor="#a0a0a0" stroked="f"/>
+        <w:pict w14:anchorId="4B842C59">
+          <v:rect id="_x0000_i1038" style="width:0;height:1.5pt" o:hralign="center" o:hrstd="t" o:hr="t" fillcolor="#a0a0a0" stroked="f"/>
         </w:pict>
       </w:r>
     </w:p>
@@ -1808,7 +4624,6 @@
         <w:rPr>
           <w:color w:val="404040" w:themeColor="text1" w:themeTint="BF"/>
         </w:rPr>
-        <w:lastRenderedPageBreak/>
         <w:t>Points utilisés</w:t>
       </w:r>
     </w:p>
@@ -1839,8 +4654,8 @@
         <w:rPr>
           <w:color w:val="404040" w:themeColor="text1" w:themeTint="BF"/>
         </w:rPr>
-        <w:pict w14:anchorId="10B649BA">
-          <v:rect id="_x0000_i1112" style="width:0;height:1.5pt" o:hralign="center" o:hrstd="t" o:hr="t" fillcolor="#a0a0a0" stroked="f"/>
+        <w:pict w14:anchorId="28A63A1C">
+          <v:rect id="_x0000_i1039" style="width:0;height:1.5pt" o:hralign="center" o:hrstd="t" o:hr="t" fillcolor="#a0a0a0" stroked="f"/>
         </w:pict>
       </w:r>
     </w:p>
@@ -2015,8 +4830,8 @@
         <w:rPr>
           <w:color w:val="404040" w:themeColor="text1" w:themeTint="BF"/>
         </w:rPr>
-        <w:pict w14:anchorId="3C371FFD">
-          <v:rect id="_x0000_i1113" style="width:0;height:1.5pt" o:hralign="center" o:hrstd="t" o:hr="t" fillcolor="#a0a0a0" stroked="f"/>
+        <w:pict w14:anchorId="0C100D9B">
+          <v:rect id="_x0000_i1040" style="width:0;height:1.5pt" o:hralign="center" o:hrstd="t" o:hr="t" fillcolor="#a0a0a0" stroked="f"/>
         </w:pict>
       </w:r>
     </w:p>
@@ -2034,6 +4849,7 @@
           <w:bCs/>
           <w:color w:val="404040" w:themeColor="text1" w:themeTint="BF"/>
         </w:rPr>
+        <w:lastRenderedPageBreak/>
         <w:t>10. Hors périmètre de cette documentation</w:t>
       </w:r>
     </w:p>
@@ -2173,8 +4989,8 @@
         <w:rPr>
           <w:color w:val="404040" w:themeColor="text1" w:themeTint="BF"/>
         </w:rPr>
-        <w:pict w14:anchorId="29D30853">
-          <v:rect id="_x0000_i1114" style="width:0;height:1.5pt" o:hralign="center" o:hrstd="t" o:hr="t" fillcolor="#a0a0a0" stroked="f"/>
+        <w:pict w14:anchorId="5EE6A715">
+          <v:rect id="_x0000_i1041" style="width:0;height:1.5pt" o:hralign="center" o:hrstd="t" o:hr="t" fillcolor="#a0a0a0" stroked="f"/>
         </w:pict>
       </w:r>
     </w:p>
@@ -2256,8 +5072,8 @@
         <w:rPr>
           <w:color w:val="404040" w:themeColor="text1" w:themeTint="BF"/>
         </w:rPr>
-        <w:pict w14:anchorId="1FF322B5">
-          <v:rect id="_x0000_i1115" style="width:0;height:1.5pt" o:hralign="center" o:hrstd="t" o:hr="t" fillcolor="#a0a0a0" stroked="f"/>
+        <w:pict w14:anchorId="51A4BE2C">
+          <v:rect id="_x0000_i1042" style="width:0;height:1.5pt" o:hralign="center" o:hrstd="t" o:hr="t" fillcolor="#a0a0a0" stroked="f"/>
         </w:pict>
       </w:r>
     </w:p>
@@ -2292,7 +5108,6 @@
         <w:rPr>
           <w:color w:val="404040" w:themeColor="text1" w:themeTint="BF"/>
         </w:rPr>
-        <w:lastRenderedPageBreak/>
         <w:t>Version : V0.1</w:t>
       </w:r>
     </w:p>
@@ -2337,20 +5152,6 @@
         </w:rPr>
         <w:t>Évolutif</w:t>
       </w:r>
-    </w:p>
-    <w:p>
-      <w:pPr>
-        <w:rPr>
-          <w:color w:val="404040" w:themeColor="text1" w:themeTint="BF"/>
-        </w:rPr>
-      </w:pPr>
-    </w:p>
-    <w:p>
-      <w:pPr>
-        <w:rPr>
-          <w:color w:val="404040" w:themeColor="text1" w:themeTint="BF"/>
-        </w:rPr>
-      </w:pPr>
     </w:p>
     <w:p>
       <w:pPr>
@@ -4460,7 +7261,7 @@
   <w:abstractNum w:abstractNumId="13" w15:restartNumberingAfterBreak="0">
     <w:nsid w:val="370F6E8D"/>
     <w:multiLevelType w:val="hybridMultilevel"/>
-    <w:tmpl w:val="67106F8E"/>
+    <w:tmpl w:val="B62A03B4"/>
     <w:lvl w:ilvl="0" w:tplc="040C000F">
       <w:start w:val="1"/>
       <w:numFmt w:val="decimal"/>
@@ -5962,6 +8763,155 @@
     </w:lvl>
   </w:abstractNum>
   <w:abstractNum w:abstractNumId="24" w15:restartNumberingAfterBreak="0">
+    <w:nsid w:val="6E840E8E"/>
+    <w:multiLevelType w:val="multilevel"/>
+    <w:tmpl w:val="25AC9EA0"/>
+    <w:lvl w:ilvl="0">
+      <w:start w:val="1"/>
+      <w:numFmt w:val="bullet"/>
+      <w:lvlText w:val=""/>
+      <w:lvlJc w:val="left"/>
+      <w:pPr>
+        <w:tabs>
+          <w:tab w:val="num" w:pos="720"/>
+        </w:tabs>
+        <w:ind w:left="720" w:hanging="360"/>
+      </w:pPr>
+      <w:rPr>
+        <w:rFonts w:ascii="Symbol" w:hAnsi="Symbol" w:hint="default"/>
+        <w:sz w:val="20"/>
+      </w:rPr>
+    </w:lvl>
+    <w:lvl w:ilvl="1" w:tentative="1">
+      <w:start w:val="1"/>
+      <w:numFmt w:val="bullet"/>
+      <w:lvlText w:val="o"/>
+      <w:lvlJc w:val="left"/>
+      <w:pPr>
+        <w:tabs>
+          <w:tab w:val="num" w:pos="1440"/>
+        </w:tabs>
+        <w:ind w:left="1440" w:hanging="360"/>
+      </w:pPr>
+      <w:rPr>
+        <w:rFonts w:ascii="Courier New" w:hAnsi="Courier New" w:hint="default"/>
+        <w:sz w:val="20"/>
+      </w:rPr>
+    </w:lvl>
+    <w:lvl w:ilvl="2" w:tentative="1">
+      <w:start w:val="1"/>
+      <w:numFmt w:val="bullet"/>
+      <w:lvlText w:val=""/>
+      <w:lvlJc w:val="left"/>
+      <w:pPr>
+        <w:tabs>
+          <w:tab w:val="num" w:pos="2160"/>
+        </w:tabs>
+        <w:ind w:left="2160" w:hanging="360"/>
+      </w:pPr>
+      <w:rPr>
+        <w:rFonts w:ascii="Wingdings" w:hAnsi="Wingdings" w:hint="default"/>
+        <w:sz w:val="20"/>
+      </w:rPr>
+    </w:lvl>
+    <w:lvl w:ilvl="3" w:tentative="1">
+      <w:start w:val="1"/>
+      <w:numFmt w:val="bullet"/>
+      <w:lvlText w:val=""/>
+      <w:lvlJc w:val="left"/>
+      <w:pPr>
+        <w:tabs>
+          <w:tab w:val="num" w:pos="2880"/>
+        </w:tabs>
+        <w:ind w:left="2880" w:hanging="360"/>
+      </w:pPr>
+      <w:rPr>
+        <w:rFonts w:ascii="Wingdings" w:hAnsi="Wingdings" w:hint="default"/>
+        <w:sz w:val="20"/>
+      </w:rPr>
+    </w:lvl>
+    <w:lvl w:ilvl="4" w:tentative="1">
+      <w:start w:val="1"/>
+      <w:numFmt w:val="bullet"/>
+      <w:lvlText w:val=""/>
+      <w:lvlJc w:val="left"/>
+      <w:pPr>
+        <w:tabs>
+          <w:tab w:val="num" w:pos="3600"/>
+        </w:tabs>
+        <w:ind w:left="3600" w:hanging="360"/>
+      </w:pPr>
+      <w:rPr>
+        <w:rFonts w:ascii="Wingdings" w:hAnsi="Wingdings" w:hint="default"/>
+        <w:sz w:val="20"/>
+      </w:rPr>
+    </w:lvl>
+    <w:lvl w:ilvl="5" w:tentative="1">
+      <w:start w:val="1"/>
+      <w:numFmt w:val="bullet"/>
+      <w:lvlText w:val=""/>
+      <w:lvlJc w:val="left"/>
+      <w:pPr>
+        <w:tabs>
+          <w:tab w:val="num" w:pos="4320"/>
+        </w:tabs>
+        <w:ind w:left="4320" w:hanging="360"/>
+      </w:pPr>
+      <w:rPr>
+        <w:rFonts w:ascii="Wingdings" w:hAnsi="Wingdings" w:hint="default"/>
+        <w:sz w:val="20"/>
+      </w:rPr>
+    </w:lvl>
+    <w:lvl w:ilvl="6" w:tentative="1">
+      <w:start w:val="1"/>
+      <w:numFmt w:val="bullet"/>
+      <w:lvlText w:val=""/>
+      <w:lvlJc w:val="left"/>
+      <w:pPr>
+        <w:tabs>
+          <w:tab w:val="num" w:pos="5040"/>
+        </w:tabs>
+        <w:ind w:left="5040" w:hanging="360"/>
+      </w:pPr>
+      <w:rPr>
+        <w:rFonts w:ascii="Wingdings" w:hAnsi="Wingdings" w:hint="default"/>
+        <w:sz w:val="20"/>
+      </w:rPr>
+    </w:lvl>
+    <w:lvl w:ilvl="7" w:tentative="1">
+      <w:start w:val="1"/>
+      <w:numFmt w:val="bullet"/>
+      <w:lvlText w:val=""/>
+      <w:lvlJc w:val="left"/>
+      <w:pPr>
+        <w:tabs>
+          <w:tab w:val="num" w:pos="5760"/>
+        </w:tabs>
+        <w:ind w:left="5760" w:hanging="360"/>
+      </w:pPr>
+      <w:rPr>
+        <w:rFonts w:ascii="Wingdings" w:hAnsi="Wingdings" w:hint="default"/>
+        <w:sz w:val="20"/>
+      </w:rPr>
+    </w:lvl>
+    <w:lvl w:ilvl="8" w:tentative="1">
+      <w:start w:val="1"/>
+      <w:numFmt w:val="bullet"/>
+      <w:lvlText w:val=""/>
+      <w:lvlJc w:val="left"/>
+      <w:pPr>
+        <w:tabs>
+          <w:tab w:val="num" w:pos="6480"/>
+        </w:tabs>
+        <w:ind w:left="6480" w:hanging="360"/>
+      </w:pPr>
+      <w:rPr>
+        <w:rFonts w:ascii="Wingdings" w:hAnsi="Wingdings" w:hint="default"/>
+        <w:sz w:val="20"/>
+      </w:rPr>
+    </w:lvl>
+  </w:abstractNum>
+  <w:abstractNum w:abstractNumId="25" w15:restartNumberingAfterBreak="0">
     <w:nsid w:val="6E85450E"/>
     <w:multiLevelType w:val="multilevel"/>
     <w:tmpl w:val="B95EDB26"/>
@@ -6110,7 +9060,7 @@
       </w:rPr>
     </w:lvl>
   </w:abstractNum>
-  <w:abstractNum w:abstractNumId="25" w15:restartNumberingAfterBreak="0">
+  <w:abstractNum w:abstractNumId="26" w15:restartNumberingAfterBreak="0">
     <w:nsid w:val="6EAB55E5"/>
     <w:multiLevelType w:val="hybridMultilevel"/>
     <w:tmpl w:val="EDC8D082"/>
@@ -6223,7 +9173,7 @@
       </w:rPr>
     </w:lvl>
   </w:abstractNum>
-  <w:abstractNum w:abstractNumId="26" w15:restartNumberingAfterBreak="0">
+  <w:abstractNum w:abstractNumId="27" w15:restartNumberingAfterBreak="0">
     <w:nsid w:val="797429F1"/>
     <w:multiLevelType w:val="multilevel"/>
     <w:tmpl w:val="8D7E7F6C"/>
@@ -6376,7 +9326,7 @@
     <w:abstractNumId w:val="13"/>
   </w:num>
   <w:num w:numId="2" w16cid:durableId="908349991">
-    <w:abstractNumId w:val="25"/>
+    <w:abstractNumId w:val="26"/>
   </w:num>
   <w:num w:numId="3" w16cid:durableId="1106538575">
     <w:abstractNumId w:val="18"/>
@@ -6388,7 +9338,7 @@
     <w:abstractNumId w:val="16"/>
   </w:num>
   <w:num w:numId="6" w16cid:durableId="2365411">
-    <w:abstractNumId w:val="24"/>
+    <w:abstractNumId w:val="25"/>
   </w:num>
   <w:num w:numId="7" w16cid:durableId="2141458733">
     <w:abstractNumId w:val="5"/>
@@ -6403,7 +9353,7 @@
     <w:abstractNumId w:val="4"/>
   </w:num>
   <w:num w:numId="11" w16cid:durableId="2049135917">
-    <w:abstractNumId w:val="26"/>
+    <w:abstractNumId w:val="27"/>
   </w:num>
   <w:num w:numId="12" w16cid:durableId="1605384047">
     <w:abstractNumId w:val="21"/>
@@ -6452,6 +9402,9 @@
   </w:num>
   <w:num w:numId="27" w16cid:durableId="950237769">
     <w:abstractNumId w:val="14"/>
+  </w:num>
+  <w:num w:numId="28" w16cid:durableId="2070414823">
+    <w:abstractNumId w:val="24"/>
   </w:num>
 </w:numbering>
 </file>
@@ -7414,6 +10367,25 @@
     <w:uiPriority w:val="99"/>
     <w:rsid w:val="009649C9"/>
   </w:style>
+  <w:style w:type="table" w:styleId="Grilledutableau">
+    <w:name w:val="Table Grid"/>
+    <w:basedOn w:val="TableauNormal"/>
+    <w:uiPriority w:val="39"/>
+    <w:rsid w:val="001E5FFA"/>
+    <w:pPr>
+      <w:spacing w:after="0" w:line="240" w:lineRule="auto"/>
+    </w:pPr>
+    <w:tblPr>
+      <w:tblBorders>
+        <w:top w:val="single" w:sz="4" w:space="0" w:color="auto"/>
+        <w:left w:val="single" w:sz="4" w:space="0" w:color="auto"/>
+        <w:bottom w:val="single" w:sz="4" w:space="0" w:color="auto"/>
+        <w:right w:val="single" w:sz="4" w:space="0" w:color="auto"/>
+        <w:insideH w:val="single" w:sz="4" w:space="0" w:color="auto"/>
+        <w:insideV w:val="single" w:sz="4" w:space="0" w:color="auto"/>
+      </w:tblBorders>
+    </w:tblPr>
+  </w:style>
 </w:styles>
 </file>
 

</xml_diff>